<commit_message>
SSU part eight - IPAK JE OVAJ POSLEDNJI
Change-Id: I385d0206d373c6d0e86988f3f4a2b7a3627744b2
</commit_message>
<xml_diff>
--- a/SSU/Uklanjanje_Slika.docx
+++ b/SSU/Uklanjanje_Slika.docx
@@ -8,12 +8,53 @@
         <w:ind w:left="426" w:hanging="10"/>
         <w:jc w:val="center"/>
       </w:pPr>
+      <w:proofErr w:type="spellStart"/>
       <w:r>
         <w:rPr>
           <w:rFonts w:ascii="Arial" w:eastAsia="Arial" w:hAnsi="Arial" w:cs="Arial"/>
           <w:sz w:val="24"/>
         </w:rPr>
-        <w:t xml:space="preserve">Elektrotehnički fakultet u Beogradu </w:t>
+        <w:t>Elektrotehnički</w:t>
+      </w:r>
+      <w:proofErr w:type="spellEnd"/>
+      <w:r>
+        <w:rPr>
+          <w:rFonts w:ascii="Arial" w:eastAsia="Arial" w:hAnsi="Arial" w:cs="Arial"/>
+          <w:sz w:val="24"/>
+        </w:rPr>
+        <w:t xml:space="preserve"> </w:t>
+      </w:r>
+      <w:proofErr w:type="spellStart"/>
+      <w:r>
+        <w:rPr>
+          <w:rFonts w:ascii="Arial" w:eastAsia="Arial" w:hAnsi="Arial" w:cs="Arial"/>
+          <w:sz w:val="24"/>
+        </w:rPr>
+        <w:t>fakultet</w:t>
+      </w:r>
+      <w:proofErr w:type="spellEnd"/>
+      <w:r>
+        <w:rPr>
+          <w:rFonts w:ascii="Arial" w:eastAsia="Arial" w:hAnsi="Arial" w:cs="Arial"/>
+          <w:sz w:val="24"/>
+        </w:rPr>
+        <w:t xml:space="preserve"> u </w:t>
+      </w:r>
+      <w:proofErr w:type="spellStart"/>
+      <w:r>
+        <w:rPr>
+          <w:rFonts w:ascii="Arial" w:eastAsia="Arial" w:hAnsi="Arial" w:cs="Arial"/>
+          <w:sz w:val="24"/>
+        </w:rPr>
+        <w:t>Beogradu</w:t>
+      </w:r>
+      <w:proofErr w:type="spellEnd"/>
+      <w:r>
+        <w:rPr>
+          <w:rFonts w:ascii="Arial" w:eastAsia="Arial" w:hAnsi="Arial" w:cs="Arial"/>
+          <w:sz w:val="24"/>
+        </w:rPr>
+        <w:t xml:space="preserve"> </w:t>
       </w:r>
     </w:p>
     <w:p>
@@ -41,7 +82,39 @@
           <w:rFonts w:ascii="Arial" w:eastAsia="Arial" w:hAnsi="Arial" w:cs="Arial"/>
           <w:sz w:val="24"/>
         </w:rPr>
-        <w:t xml:space="preserve">SI3PSI Principi Softverskog Inženjerstva </w:t>
+        <w:t xml:space="preserve">SI3PSI Principi </w:t>
+      </w:r>
+      <w:proofErr w:type="spellStart"/>
+      <w:r>
+        <w:rPr>
+          <w:rFonts w:ascii="Arial" w:eastAsia="Arial" w:hAnsi="Arial" w:cs="Arial"/>
+          <w:sz w:val="24"/>
+        </w:rPr>
+        <w:t>Softverskog</w:t>
+      </w:r>
+      <w:proofErr w:type="spellEnd"/>
+      <w:r>
+        <w:rPr>
+          <w:rFonts w:ascii="Arial" w:eastAsia="Arial" w:hAnsi="Arial" w:cs="Arial"/>
+          <w:sz w:val="24"/>
+        </w:rPr>
+        <w:t xml:space="preserve"> </w:t>
+      </w:r>
+      <w:proofErr w:type="spellStart"/>
+      <w:r>
+        <w:rPr>
+          <w:rFonts w:ascii="Arial" w:eastAsia="Arial" w:hAnsi="Arial" w:cs="Arial"/>
+          <w:sz w:val="24"/>
+        </w:rPr>
+        <w:t>Inženjerstva</w:t>
+      </w:r>
+      <w:proofErr w:type="spellEnd"/>
+      <w:r>
+        <w:rPr>
+          <w:rFonts w:ascii="Arial" w:eastAsia="Arial" w:hAnsi="Arial" w:cs="Arial"/>
+          <w:sz w:val="24"/>
+        </w:rPr>
+        <w:t xml:space="preserve"> </w:t>
       </w:r>
     </w:p>
     <w:p>
@@ -148,20 +221,31 @@
         <w:ind w:left="414"/>
         <w:jc w:val="center"/>
       </w:pPr>
+      <w:proofErr w:type="spellStart"/>
       <w:r>
         <w:rPr>
           <w:rFonts w:ascii="Arial" w:eastAsia="Arial" w:hAnsi="Arial" w:cs="Arial"/>
           <w:sz w:val="36"/>
         </w:rPr>
-        <w:t xml:space="preserve">Projekat </w:t>
-      </w:r>
+        <w:t>Projekat</w:t>
+      </w:r>
+      <w:proofErr w:type="spellEnd"/>
       <w:r>
         <w:rPr>
           <w:rFonts w:ascii="Arial" w:eastAsia="Arial" w:hAnsi="Arial" w:cs="Arial"/>
           <w:sz w:val="36"/>
         </w:rPr>
+        <w:t xml:space="preserve"> </w:t>
+      </w:r>
+      <w:proofErr w:type="spellStart"/>
+      <w:r>
+        <w:rPr>
+          <w:rFonts w:ascii="Arial" w:eastAsia="Arial" w:hAnsi="Arial" w:cs="Arial"/>
+          <w:sz w:val="36"/>
+        </w:rPr>
         <w:t>RealArt</w:t>
       </w:r>
+      <w:proofErr w:type="spellEnd"/>
       <w:r>
         <w:rPr>
           <w:rFonts w:ascii="Arial" w:eastAsia="Arial" w:hAnsi="Arial" w:cs="Arial"/>
@@ -291,18 +375,70 @@
         <w:pStyle w:val="Title"/>
         <w:jc w:val="center"/>
       </w:pPr>
-      <w:r>
-        <w:t>Specifikacija scenarija upotrebe</w:t>
-      </w:r>
+      <w:proofErr w:type="spellStart"/>
+      <w:r>
+        <w:t>Specifikacija</w:t>
+      </w:r>
+      <w:proofErr w:type="spellEnd"/>
+      <w:r>
+        <w:t xml:space="preserve"> </w:t>
+      </w:r>
+      <w:proofErr w:type="spellStart"/>
+      <w:r>
+        <w:t>scenarija</w:t>
+      </w:r>
+      <w:proofErr w:type="spellEnd"/>
+      <w:r>
+        <w:t xml:space="preserve"> </w:t>
+      </w:r>
+      <w:proofErr w:type="spellStart"/>
+      <w:r>
+        <w:t>upotrebe</w:t>
+      </w:r>
+      <w:proofErr w:type="spellEnd"/>
     </w:p>
     <w:p>
       <w:pPr>
         <w:pStyle w:val="Title"/>
         <w:jc w:val="center"/>
       </w:pPr>
-      <w:r>
-        <w:t>Uklanjanje slika od strane administratora</w:t>
-      </w:r>
+      <w:proofErr w:type="spellStart"/>
+      <w:r>
+        <w:t>Uklanjanje</w:t>
+      </w:r>
+      <w:proofErr w:type="spellEnd"/>
+      <w:r>
+        <w:t xml:space="preserve"> </w:t>
+      </w:r>
+      <w:proofErr w:type="spellStart"/>
+      <w:r>
+        <w:t>slika</w:t>
+      </w:r>
+      <w:proofErr w:type="spellEnd"/>
+      <w:r>
+        <w:t xml:space="preserve"> </w:t>
+      </w:r>
+      <w:proofErr w:type="spellStart"/>
+      <w:r>
+        <w:t>od</w:t>
+      </w:r>
+      <w:proofErr w:type="spellEnd"/>
+      <w:r>
+        <w:t xml:space="preserve"> </w:t>
+      </w:r>
+      <w:proofErr w:type="spellStart"/>
+      <w:r>
+        <w:t>strane</w:t>
+      </w:r>
+      <w:proofErr w:type="spellEnd"/>
+      <w:r>
+        <w:t xml:space="preserve"> </w:t>
+      </w:r>
+      <w:proofErr w:type="spellStart"/>
+      <w:r>
+        <w:t>administratora</w:t>
+      </w:r>
+      <w:proofErr w:type="spellEnd"/>
     </w:p>
     <w:p/>
     <w:p/>
@@ -312,13 +448,23 @@
         <w:ind w:left="417"/>
         <w:jc w:val="center"/>
       </w:pPr>
+      <w:proofErr w:type="spellStart"/>
       <w:r>
         <w:rPr>
           <w:rFonts w:ascii="Arial" w:eastAsia="Arial" w:hAnsi="Arial" w:cs="Arial"/>
           <w:b/>
           <w:sz w:val="28"/>
         </w:rPr>
-        <w:t xml:space="preserve">Verzija 1.0 </w:t>
+        <w:t>Verzija</w:t>
+      </w:r>
+      <w:proofErr w:type="spellEnd"/>
+      <w:r>
+        <w:rPr>
+          <w:rFonts w:ascii="Arial" w:eastAsia="Arial" w:hAnsi="Arial" w:cs="Arial"/>
+          <w:b/>
+          <w:sz w:val="28"/>
+        </w:rPr>
+        <w:t xml:space="preserve"> 1.0 </w:t>
       </w:r>
     </w:p>
     <w:p>
@@ -337,6 +483,7 @@
         <w:ind w:right="3702"/>
         <w:jc w:val="right"/>
       </w:pPr>
+      <w:proofErr w:type="spellStart"/>
       <w:r>
         <w:rPr>
           <w:rFonts w:ascii="Arial" w:eastAsia="Arial" w:hAnsi="Arial" w:cs="Arial"/>
@@ -344,7 +491,34 @@
           <w:sz w:val="36"/>
         </w:rPr>
         <w:lastRenderedPageBreak/>
-        <w:t xml:space="preserve">Istorija izmena </w:t>
+        <w:t>Istorija</w:t>
+      </w:r>
+      <w:proofErr w:type="spellEnd"/>
+      <w:r>
+        <w:rPr>
+          <w:rFonts w:ascii="Arial" w:eastAsia="Arial" w:hAnsi="Arial" w:cs="Arial"/>
+          <w:b/>
+          <w:sz w:val="36"/>
+        </w:rPr>
+        <w:t xml:space="preserve"> </w:t>
+      </w:r>
+      <w:proofErr w:type="spellStart"/>
+      <w:r>
+        <w:rPr>
+          <w:rFonts w:ascii="Arial" w:eastAsia="Arial" w:hAnsi="Arial" w:cs="Arial"/>
+          <w:b/>
+          <w:sz w:val="36"/>
+        </w:rPr>
+        <w:t>izmena</w:t>
+      </w:r>
+      <w:proofErr w:type="spellEnd"/>
+      <w:r>
+        <w:rPr>
+          <w:rFonts w:ascii="Arial" w:eastAsia="Arial" w:hAnsi="Arial" w:cs="Arial"/>
+          <w:b/>
+          <w:sz w:val="36"/>
+        </w:rPr>
+        <w:t xml:space="preserve"> </w:t>
       </w:r>
     </w:p>
     <w:tbl>
@@ -409,13 +583,23 @@
               <w:ind w:left="5"/>
               <w:jc w:val="center"/>
             </w:pPr>
+            <w:proofErr w:type="spellStart"/>
             <w:r>
               <w:rPr>
                 <w:rFonts w:ascii="Times New Roman" w:eastAsia="Times New Roman" w:hAnsi="Times New Roman" w:cs="Times New Roman"/>
                 <w:b/>
                 <w:sz w:val="20"/>
               </w:rPr>
-              <w:t xml:space="preserve">Verzija </w:t>
+              <w:t>Verzija</w:t>
+            </w:r>
+            <w:proofErr w:type="spellEnd"/>
+            <w:r>
+              <w:rPr>
+                <w:rFonts w:ascii="Times New Roman" w:eastAsia="Times New Roman" w:hAnsi="Times New Roman" w:cs="Times New Roman"/>
+                <w:b/>
+                <w:sz w:val="20"/>
+              </w:rPr>
+              <w:t xml:space="preserve"> </w:t>
             </w:r>
           </w:p>
         </w:tc>
@@ -434,13 +618,41 @@
               <w:ind w:left="5"/>
               <w:jc w:val="center"/>
             </w:pPr>
+            <w:proofErr w:type="spellStart"/>
             <w:r>
               <w:rPr>
                 <w:rFonts w:ascii="Times New Roman" w:eastAsia="Times New Roman" w:hAnsi="Times New Roman" w:cs="Times New Roman"/>
                 <w:b/>
                 <w:sz w:val="20"/>
               </w:rPr>
-              <w:t xml:space="preserve">Kratak opis </w:t>
+              <w:t>Kratak</w:t>
+            </w:r>
+            <w:proofErr w:type="spellEnd"/>
+            <w:r>
+              <w:rPr>
+                <w:rFonts w:ascii="Times New Roman" w:eastAsia="Times New Roman" w:hAnsi="Times New Roman" w:cs="Times New Roman"/>
+                <w:b/>
+                <w:sz w:val="20"/>
+              </w:rPr>
+              <w:t xml:space="preserve"> </w:t>
+            </w:r>
+            <w:proofErr w:type="spellStart"/>
+            <w:r>
+              <w:rPr>
+                <w:rFonts w:ascii="Times New Roman" w:eastAsia="Times New Roman" w:hAnsi="Times New Roman" w:cs="Times New Roman"/>
+                <w:b/>
+                <w:sz w:val="20"/>
+              </w:rPr>
+              <w:t>opis</w:t>
+            </w:r>
+            <w:proofErr w:type="spellEnd"/>
+            <w:r>
+              <w:rPr>
+                <w:rFonts w:ascii="Times New Roman" w:eastAsia="Times New Roman" w:hAnsi="Times New Roman" w:cs="Times New Roman"/>
+                <w:b/>
+                <w:sz w:val="20"/>
+              </w:rPr>
+              <w:t xml:space="preserve"> </w:t>
             </w:r>
           </w:p>
         </w:tc>
@@ -557,12 +769,37 @@
                 <w:szCs w:val="22"/>
               </w:rPr>
             </w:pPr>
+            <w:proofErr w:type="spellStart"/>
             <w:r>
               <w:rPr>
                 <w:rFonts w:ascii="Times New Roman" w:eastAsia="Times New Roman" w:hAnsi="Times New Roman" w:cs="Times New Roman"/>
                 <w:szCs w:val="22"/>
               </w:rPr>
-              <w:t xml:space="preserve">inicijalna verzija </w:t>
+              <w:t>inicijalna</w:t>
+            </w:r>
+            <w:proofErr w:type="spellEnd"/>
+            <w:r>
+              <w:rPr>
+                <w:rFonts w:ascii="Times New Roman" w:eastAsia="Times New Roman" w:hAnsi="Times New Roman" w:cs="Times New Roman"/>
+                <w:szCs w:val="22"/>
+              </w:rPr>
+              <w:t xml:space="preserve"> </w:t>
+            </w:r>
+            <w:proofErr w:type="spellStart"/>
+            <w:r>
+              <w:rPr>
+                <w:rFonts w:ascii="Times New Roman" w:eastAsia="Times New Roman" w:hAnsi="Times New Roman" w:cs="Times New Roman"/>
+                <w:szCs w:val="22"/>
+              </w:rPr>
+              <w:t>verzija</w:t>
+            </w:r>
+            <w:proofErr w:type="spellEnd"/>
+            <w:r>
+              <w:rPr>
+                <w:rFonts w:ascii="Times New Roman" w:eastAsia="Times New Roman" w:hAnsi="Times New Roman" w:cs="Times New Roman"/>
+                <w:szCs w:val="22"/>
+              </w:rPr>
+              <w:t xml:space="preserve"> </w:t>
             </w:r>
           </w:p>
         </w:tc>
@@ -886,13 +1123,23 @@
         <w:ind w:right="2"/>
         <w:jc w:val="center"/>
       </w:pPr>
+      <w:proofErr w:type="spellStart"/>
       <w:r>
         <w:rPr>
           <w:rFonts w:ascii="Arial" w:eastAsia="Arial" w:hAnsi="Arial" w:cs="Arial"/>
           <w:b/>
           <w:sz w:val="36"/>
         </w:rPr>
-        <w:t xml:space="preserve">Sadržaj  </w:t>
+        <w:t>Sadržaj</w:t>
+      </w:r>
+      <w:proofErr w:type="spellEnd"/>
+      <w:r>
+        <w:rPr>
+          <w:rFonts w:ascii="Arial" w:eastAsia="Arial" w:hAnsi="Arial" w:cs="Arial"/>
+          <w:b/>
+          <w:sz w:val="36"/>
+        </w:rPr>
+        <w:t xml:space="preserve">  </w:t>
       </w:r>
     </w:p>
     <w:sdt>
@@ -1193,77 +1440,6 @@
           <w:pPr>
             <w:pStyle w:val="TOC2"/>
             <w:tabs>
-              <w:tab w:val="right" w:pos="9894"/>
-            </w:tabs>
-            <w:rPr>
-              <w:rFonts w:asciiTheme="minorHAnsi" w:eastAsiaTheme="minorEastAsia" w:hAnsiTheme="minorHAnsi" w:cstheme="minorBidi"/>
-              <w:noProof/>
-              <w:color w:val="auto"/>
-              <w:sz w:val="24"/>
-            </w:rPr>
-          </w:pPr>
-          <w:hyperlink w:anchor="_Toc205762426" w:history="1">
-            <w:r>
-              <w:rPr>
-                <w:rStyle w:val="Hyperlink"/>
-                <w:noProof/>
-              </w:rPr>
-              <w:t>Dokument će koristiti svi članovi projektnog tima u razvoju i testiranju funkcionalnosti prijave, a može se koristiti i pri pisanju uputstva za korisnike.</w:t>
-            </w:r>
-            <w:r>
-              <w:rPr>
-                <w:noProof/>
-                <w:webHidden/>
-              </w:rPr>
-              <w:tab/>
-            </w:r>
-            <w:r>
-              <w:rPr>
-                <w:noProof/>
-                <w:webHidden/>
-              </w:rPr>
-              <w:fldChar w:fldCharType="begin"/>
-            </w:r>
-            <w:r>
-              <w:rPr>
-                <w:noProof/>
-                <w:webHidden/>
-              </w:rPr>
-              <w:instrText xml:space="preserve"> PAGEREF _Toc205762426 \h </w:instrText>
-            </w:r>
-            <w:r>
-              <w:rPr>
-                <w:noProof/>
-                <w:webHidden/>
-              </w:rPr>
-            </w:r>
-            <w:r>
-              <w:rPr>
-                <w:noProof/>
-                <w:webHidden/>
-              </w:rPr>
-              <w:fldChar w:fldCharType="separate"/>
-            </w:r>
-            <w:r>
-              <w:rPr>
-                <w:noProof/>
-                <w:webHidden/>
-              </w:rPr>
-              <w:t>4</w:t>
-            </w:r>
-            <w:r>
-              <w:rPr>
-                <w:noProof/>
-                <w:webHidden/>
-              </w:rPr>
-              <w:fldChar w:fldCharType="end"/>
-            </w:r>
-          </w:hyperlink>
-        </w:p>
-        <w:p>
-          <w:pPr>
-            <w:pStyle w:val="TOC2"/>
-            <w:tabs>
               <w:tab w:val="left" w:pos="960"/>
               <w:tab w:val="right" w:pos="9894"/>
             </w:tabs>
@@ -2220,10 +2396,12 @@
         <w:ind w:left="705" w:hanging="720"/>
       </w:pPr>
       <w:bookmarkStart w:id="0" w:name="_Toc205762423"/>
+      <w:proofErr w:type="spellStart"/>
       <w:r>
         <w:t>Uvod</w:t>
       </w:r>
       <w:bookmarkEnd w:id="0"/>
+      <w:proofErr w:type="spellEnd"/>
       <w:r>
         <w:t xml:space="preserve"> </w:t>
       </w:r>
@@ -2234,10 +2412,12 @@
         <w:ind w:left="705" w:hanging="720"/>
       </w:pPr>
       <w:bookmarkStart w:id="1" w:name="_Toc205762424"/>
+      <w:proofErr w:type="spellStart"/>
       <w:r>
         <w:t>Rezime</w:t>
       </w:r>
       <w:bookmarkEnd w:id="1"/>
+      <w:proofErr w:type="spellEnd"/>
       <w:r>
         <w:t xml:space="preserve"> </w:t>
       </w:r>
@@ -2251,12 +2431,277 @@
           <w:sz w:val="20"/>
         </w:rPr>
       </w:pPr>
-      <w:r>
-        <w:rPr>
-          <w:rFonts w:ascii="Times New Roman" w:eastAsia="Times New Roman" w:hAnsi="Times New Roman" w:cs="Times New Roman"/>
-          <w:sz w:val="20"/>
-        </w:rPr>
-        <w:t>Definisanje scenarija upotrebe za funkcionalnost uklanjanja slika od strane administratora, radi održavanja kvaliteta i prikladnosti sadržaja na platformi.</w:t>
+      <w:proofErr w:type="spellStart"/>
+      <w:r>
+        <w:rPr>
+          <w:rFonts w:ascii="Times New Roman" w:eastAsia="Times New Roman" w:hAnsi="Times New Roman" w:cs="Times New Roman"/>
+          <w:sz w:val="20"/>
+        </w:rPr>
+        <w:t>Definisanje</w:t>
+      </w:r>
+      <w:proofErr w:type="spellEnd"/>
+      <w:r>
+        <w:rPr>
+          <w:rFonts w:ascii="Times New Roman" w:eastAsia="Times New Roman" w:hAnsi="Times New Roman" w:cs="Times New Roman"/>
+          <w:sz w:val="20"/>
+        </w:rPr>
+        <w:t xml:space="preserve"> </w:t>
+      </w:r>
+      <w:proofErr w:type="spellStart"/>
+      <w:r>
+        <w:rPr>
+          <w:rFonts w:ascii="Times New Roman" w:eastAsia="Times New Roman" w:hAnsi="Times New Roman" w:cs="Times New Roman"/>
+          <w:sz w:val="20"/>
+        </w:rPr>
+        <w:t>scenarija</w:t>
+      </w:r>
+      <w:proofErr w:type="spellEnd"/>
+      <w:r>
+        <w:rPr>
+          <w:rFonts w:ascii="Times New Roman" w:eastAsia="Times New Roman" w:hAnsi="Times New Roman" w:cs="Times New Roman"/>
+          <w:sz w:val="20"/>
+        </w:rPr>
+        <w:t xml:space="preserve"> </w:t>
+      </w:r>
+      <w:proofErr w:type="spellStart"/>
+      <w:r>
+        <w:rPr>
+          <w:rFonts w:ascii="Times New Roman" w:eastAsia="Times New Roman" w:hAnsi="Times New Roman" w:cs="Times New Roman"/>
+          <w:sz w:val="20"/>
+        </w:rPr>
+        <w:t>upotrebe</w:t>
+      </w:r>
+      <w:proofErr w:type="spellEnd"/>
+      <w:r>
+        <w:rPr>
+          <w:rFonts w:ascii="Times New Roman" w:eastAsia="Times New Roman" w:hAnsi="Times New Roman" w:cs="Times New Roman"/>
+          <w:sz w:val="20"/>
+        </w:rPr>
+        <w:t xml:space="preserve"> za </w:t>
+      </w:r>
+      <w:proofErr w:type="spellStart"/>
+      <w:r>
+        <w:rPr>
+          <w:rFonts w:ascii="Times New Roman" w:eastAsia="Times New Roman" w:hAnsi="Times New Roman" w:cs="Times New Roman"/>
+          <w:sz w:val="20"/>
+        </w:rPr>
+        <w:t>funkcionalnost</w:t>
+      </w:r>
+      <w:proofErr w:type="spellEnd"/>
+      <w:r>
+        <w:rPr>
+          <w:rFonts w:ascii="Times New Roman" w:eastAsia="Times New Roman" w:hAnsi="Times New Roman" w:cs="Times New Roman"/>
+          <w:sz w:val="20"/>
+        </w:rPr>
+        <w:t xml:space="preserve"> </w:t>
+      </w:r>
+      <w:proofErr w:type="spellStart"/>
+      <w:r>
+        <w:rPr>
+          <w:rFonts w:ascii="Times New Roman" w:eastAsia="Times New Roman" w:hAnsi="Times New Roman" w:cs="Times New Roman"/>
+          <w:sz w:val="20"/>
+        </w:rPr>
+        <w:t>uklanjanja</w:t>
+      </w:r>
+      <w:proofErr w:type="spellEnd"/>
+      <w:r>
+        <w:rPr>
+          <w:rFonts w:ascii="Times New Roman" w:eastAsia="Times New Roman" w:hAnsi="Times New Roman" w:cs="Times New Roman"/>
+          <w:sz w:val="20"/>
+        </w:rPr>
+        <w:t xml:space="preserve"> </w:t>
+      </w:r>
+      <w:proofErr w:type="spellStart"/>
+      <w:r>
+        <w:rPr>
+          <w:rFonts w:ascii="Times New Roman" w:eastAsia="Times New Roman" w:hAnsi="Times New Roman" w:cs="Times New Roman"/>
+          <w:sz w:val="20"/>
+        </w:rPr>
+        <w:t>slika</w:t>
+      </w:r>
+      <w:proofErr w:type="spellEnd"/>
+      <w:r>
+        <w:rPr>
+          <w:rFonts w:ascii="Times New Roman" w:eastAsia="Times New Roman" w:hAnsi="Times New Roman" w:cs="Times New Roman"/>
+          <w:sz w:val="20"/>
+        </w:rPr>
+        <w:t xml:space="preserve"> </w:t>
+      </w:r>
+      <w:proofErr w:type="spellStart"/>
+      <w:r>
+        <w:rPr>
+          <w:rFonts w:ascii="Times New Roman" w:eastAsia="Times New Roman" w:hAnsi="Times New Roman" w:cs="Times New Roman"/>
+          <w:sz w:val="20"/>
+        </w:rPr>
+        <w:t>od</w:t>
+      </w:r>
+      <w:proofErr w:type="spellEnd"/>
+      <w:r>
+        <w:rPr>
+          <w:rFonts w:ascii="Times New Roman" w:eastAsia="Times New Roman" w:hAnsi="Times New Roman" w:cs="Times New Roman"/>
+          <w:sz w:val="20"/>
+        </w:rPr>
+        <w:t xml:space="preserve"> </w:t>
+      </w:r>
+      <w:proofErr w:type="spellStart"/>
+      <w:r>
+        <w:rPr>
+          <w:rFonts w:ascii="Times New Roman" w:eastAsia="Times New Roman" w:hAnsi="Times New Roman" w:cs="Times New Roman"/>
+          <w:sz w:val="20"/>
+        </w:rPr>
+        <w:t>strane</w:t>
+      </w:r>
+      <w:proofErr w:type="spellEnd"/>
+      <w:r>
+        <w:rPr>
+          <w:rFonts w:ascii="Times New Roman" w:eastAsia="Times New Roman" w:hAnsi="Times New Roman" w:cs="Times New Roman"/>
+          <w:sz w:val="20"/>
+        </w:rPr>
+        <w:t xml:space="preserve"> </w:t>
+      </w:r>
+      <w:proofErr w:type="spellStart"/>
+      <w:r>
+        <w:rPr>
+          <w:rFonts w:ascii="Times New Roman" w:eastAsia="Times New Roman" w:hAnsi="Times New Roman" w:cs="Times New Roman"/>
+          <w:sz w:val="20"/>
+        </w:rPr>
+        <w:t>administratora</w:t>
+      </w:r>
+      <w:proofErr w:type="spellEnd"/>
+      <w:r>
+        <w:rPr>
+          <w:rFonts w:ascii="Times New Roman" w:eastAsia="Times New Roman" w:hAnsi="Times New Roman" w:cs="Times New Roman"/>
+          <w:sz w:val="20"/>
+        </w:rPr>
+        <w:t xml:space="preserve">, </w:t>
+      </w:r>
+      <w:proofErr w:type="spellStart"/>
+      <w:r>
+        <w:rPr>
+          <w:rFonts w:ascii="Times New Roman" w:eastAsia="Times New Roman" w:hAnsi="Times New Roman" w:cs="Times New Roman"/>
+          <w:sz w:val="20"/>
+        </w:rPr>
+        <w:t>radi</w:t>
+      </w:r>
+      <w:proofErr w:type="spellEnd"/>
+      <w:r>
+        <w:rPr>
+          <w:rFonts w:ascii="Times New Roman" w:eastAsia="Times New Roman" w:hAnsi="Times New Roman" w:cs="Times New Roman"/>
+          <w:sz w:val="20"/>
+        </w:rPr>
+        <w:t xml:space="preserve"> </w:t>
+      </w:r>
+      <w:proofErr w:type="spellStart"/>
+      <w:r>
+        <w:rPr>
+          <w:rFonts w:ascii="Times New Roman" w:eastAsia="Times New Roman" w:hAnsi="Times New Roman" w:cs="Times New Roman"/>
+          <w:sz w:val="20"/>
+        </w:rPr>
+        <w:t>održavanja</w:t>
+      </w:r>
+      <w:proofErr w:type="spellEnd"/>
+      <w:r>
+        <w:rPr>
+          <w:rFonts w:ascii="Times New Roman" w:eastAsia="Times New Roman" w:hAnsi="Times New Roman" w:cs="Times New Roman"/>
+          <w:sz w:val="20"/>
+        </w:rPr>
+        <w:t xml:space="preserve"> </w:t>
+      </w:r>
+      <w:proofErr w:type="spellStart"/>
+      <w:r>
+        <w:rPr>
+          <w:rFonts w:ascii="Times New Roman" w:eastAsia="Times New Roman" w:hAnsi="Times New Roman" w:cs="Times New Roman"/>
+          <w:sz w:val="20"/>
+        </w:rPr>
+        <w:t>kvaliteta</w:t>
+      </w:r>
+      <w:proofErr w:type="spellEnd"/>
+      <w:r>
+        <w:rPr>
+          <w:rFonts w:ascii="Times New Roman" w:eastAsia="Times New Roman" w:hAnsi="Times New Roman" w:cs="Times New Roman"/>
+          <w:sz w:val="20"/>
+        </w:rPr>
+        <w:t xml:space="preserve"> </w:t>
+      </w:r>
+      <w:proofErr w:type="spellStart"/>
+      <w:r>
+        <w:rPr>
+          <w:rFonts w:ascii="Times New Roman" w:eastAsia="Times New Roman" w:hAnsi="Times New Roman" w:cs="Times New Roman"/>
+          <w:sz w:val="20"/>
+        </w:rPr>
+        <w:t>i</w:t>
+      </w:r>
+      <w:proofErr w:type="spellEnd"/>
+      <w:r>
+        <w:rPr>
+          <w:rFonts w:ascii="Times New Roman" w:eastAsia="Times New Roman" w:hAnsi="Times New Roman" w:cs="Times New Roman"/>
+          <w:sz w:val="20"/>
+        </w:rPr>
+        <w:t xml:space="preserve"> </w:t>
+      </w:r>
+      <w:proofErr w:type="spellStart"/>
+      <w:r>
+        <w:rPr>
+          <w:rFonts w:ascii="Times New Roman" w:eastAsia="Times New Roman" w:hAnsi="Times New Roman" w:cs="Times New Roman"/>
+          <w:sz w:val="20"/>
+        </w:rPr>
+        <w:t>prikladnosti</w:t>
+      </w:r>
+      <w:proofErr w:type="spellEnd"/>
+      <w:r>
+        <w:rPr>
+          <w:rFonts w:ascii="Times New Roman" w:eastAsia="Times New Roman" w:hAnsi="Times New Roman" w:cs="Times New Roman"/>
+          <w:sz w:val="20"/>
+        </w:rPr>
+        <w:t xml:space="preserve"> </w:t>
+      </w:r>
+      <w:proofErr w:type="spellStart"/>
+      <w:r>
+        <w:rPr>
+          <w:rFonts w:ascii="Times New Roman" w:eastAsia="Times New Roman" w:hAnsi="Times New Roman" w:cs="Times New Roman"/>
+          <w:sz w:val="20"/>
+        </w:rPr>
+        <w:t>sadržaja</w:t>
+      </w:r>
+      <w:proofErr w:type="spellEnd"/>
+      <w:r>
+        <w:rPr>
+          <w:rFonts w:ascii="Times New Roman" w:eastAsia="Times New Roman" w:hAnsi="Times New Roman" w:cs="Times New Roman"/>
+          <w:sz w:val="20"/>
+        </w:rPr>
+        <w:t xml:space="preserve"> </w:t>
+      </w:r>
+      <w:proofErr w:type="spellStart"/>
+      <w:r>
+        <w:rPr>
+          <w:rFonts w:ascii="Times New Roman" w:eastAsia="Times New Roman" w:hAnsi="Times New Roman" w:cs="Times New Roman"/>
+          <w:sz w:val="20"/>
+        </w:rPr>
+        <w:t>na</w:t>
+      </w:r>
+      <w:proofErr w:type="spellEnd"/>
+      <w:r>
+        <w:rPr>
+          <w:rFonts w:ascii="Times New Roman" w:eastAsia="Times New Roman" w:hAnsi="Times New Roman" w:cs="Times New Roman"/>
+          <w:sz w:val="20"/>
+        </w:rPr>
+        <w:t xml:space="preserve"> </w:t>
+      </w:r>
+      <w:proofErr w:type="spellStart"/>
+      <w:r>
+        <w:rPr>
+          <w:rFonts w:ascii="Times New Roman" w:eastAsia="Times New Roman" w:hAnsi="Times New Roman" w:cs="Times New Roman"/>
+          <w:sz w:val="20"/>
+        </w:rPr>
+        <w:t>platformi</w:t>
+      </w:r>
+      <w:proofErr w:type="spellEnd"/>
+      <w:r>
+        <w:rPr>
+          <w:rFonts w:ascii="Times New Roman" w:eastAsia="Times New Roman" w:hAnsi="Times New Roman" w:cs="Times New Roman"/>
+          <w:sz w:val="20"/>
+        </w:rPr>
+        <w:t>.</w:t>
       </w:r>
     </w:p>
     <w:p>
@@ -2276,10 +2721,44 @@
         <w:ind w:left="705" w:hanging="720"/>
       </w:pPr>
       <w:bookmarkStart w:id="2" w:name="_Toc205762425"/>
-      <w:r>
-        <w:t>Namena dokumenta i ciljne grupe</w:t>
+      <w:proofErr w:type="spellStart"/>
+      <w:r>
+        <w:t>Namena</w:t>
+      </w:r>
+      <w:proofErr w:type="spellEnd"/>
+      <w:r>
+        <w:t xml:space="preserve"> </w:t>
+      </w:r>
+      <w:proofErr w:type="spellStart"/>
+      <w:r>
+        <w:t>dokumenta</w:t>
+      </w:r>
+      <w:proofErr w:type="spellEnd"/>
+      <w:r>
+        <w:t xml:space="preserve"> </w:t>
+      </w:r>
+      <w:proofErr w:type="spellStart"/>
+      <w:r>
+        <w:t>i</w:t>
+      </w:r>
+      <w:proofErr w:type="spellEnd"/>
+      <w:r>
+        <w:t xml:space="preserve"> </w:t>
+      </w:r>
+      <w:proofErr w:type="spellStart"/>
+      <w:r>
+        <w:t>ciljne</w:t>
+      </w:r>
+      <w:proofErr w:type="spellEnd"/>
+      <w:r>
+        <w:t xml:space="preserve"> </w:t>
+      </w:r>
+      <w:proofErr w:type="spellStart"/>
+      <w:r>
+        <w:t>grupe</w:t>
       </w:r>
       <w:bookmarkEnd w:id="2"/>
+      <w:proofErr w:type="spellEnd"/>
       <w:r>
         <w:t xml:space="preserve"> </w:t>
       </w:r>
@@ -2294,20 +2773,303 @@
         <w:ind w:left="705"/>
       </w:pPr>
       <w:bookmarkStart w:id="3" w:name="_Toc205762426"/>
+      <w:proofErr w:type="spellStart"/>
       <w:r>
         <w:rPr>
           <w:rFonts w:ascii="Times New Roman" w:eastAsia="Times New Roman" w:hAnsi="Times New Roman" w:cs="Times New Roman"/>
           <w:b w:val="0"/>
         </w:rPr>
-        <w:t xml:space="preserve">Dokument će koristiti svi članovi projektnog tima u razvoju i testiranju funkcionalnosti prijave, a može se koristiti i pri pisanju uputstva za </w:t>
-      </w:r>
+        <w:t>Dokument</w:t>
+      </w:r>
+      <w:proofErr w:type="spellEnd"/>
       <w:r>
         <w:rPr>
           <w:rFonts w:ascii="Times New Roman" w:eastAsia="Times New Roman" w:hAnsi="Times New Roman" w:cs="Times New Roman"/>
           <w:b w:val="0"/>
         </w:rPr>
+        <w:t xml:space="preserve"> </w:t>
+      </w:r>
+      <w:proofErr w:type="spellStart"/>
+      <w:r>
+        <w:rPr>
+          <w:rFonts w:ascii="Times New Roman" w:eastAsia="Times New Roman" w:hAnsi="Times New Roman" w:cs="Times New Roman"/>
+          <w:b w:val="0"/>
+        </w:rPr>
+        <w:t>će</w:t>
+      </w:r>
+      <w:proofErr w:type="spellEnd"/>
+      <w:r>
+        <w:rPr>
+          <w:rFonts w:ascii="Times New Roman" w:eastAsia="Times New Roman" w:hAnsi="Times New Roman" w:cs="Times New Roman"/>
+          <w:b w:val="0"/>
+        </w:rPr>
+        <w:t xml:space="preserve"> </w:t>
+      </w:r>
+      <w:proofErr w:type="spellStart"/>
+      <w:r>
+        <w:rPr>
+          <w:rFonts w:ascii="Times New Roman" w:eastAsia="Times New Roman" w:hAnsi="Times New Roman" w:cs="Times New Roman"/>
+          <w:b w:val="0"/>
+        </w:rPr>
+        <w:t>koristiti</w:t>
+      </w:r>
+      <w:proofErr w:type="spellEnd"/>
+      <w:r>
+        <w:rPr>
+          <w:rFonts w:ascii="Times New Roman" w:eastAsia="Times New Roman" w:hAnsi="Times New Roman" w:cs="Times New Roman"/>
+          <w:b w:val="0"/>
+        </w:rPr>
+        <w:t xml:space="preserve"> </w:t>
+      </w:r>
+      <w:proofErr w:type="spellStart"/>
+      <w:r>
+        <w:rPr>
+          <w:rFonts w:ascii="Times New Roman" w:eastAsia="Times New Roman" w:hAnsi="Times New Roman" w:cs="Times New Roman"/>
+          <w:b w:val="0"/>
+        </w:rPr>
+        <w:t>svi</w:t>
+      </w:r>
+      <w:proofErr w:type="spellEnd"/>
+      <w:r>
+        <w:rPr>
+          <w:rFonts w:ascii="Times New Roman" w:eastAsia="Times New Roman" w:hAnsi="Times New Roman" w:cs="Times New Roman"/>
+          <w:b w:val="0"/>
+        </w:rPr>
+        <w:t xml:space="preserve"> </w:t>
+      </w:r>
+      <w:proofErr w:type="spellStart"/>
+      <w:r>
+        <w:rPr>
+          <w:rFonts w:ascii="Times New Roman" w:eastAsia="Times New Roman" w:hAnsi="Times New Roman" w:cs="Times New Roman"/>
+          <w:b w:val="0"/>
+        </w:rPr>
+        <w:t>članovi</w:t>
+      </w:r>
+      <w:proofErr w:type="spellEnd"/>
+      <w:r>
+        <w:rPr>
+          <w:rFonts w:ascii="Times New Roman" w:eastAsia="Times New Roman" w:hAnsi="Times New Roman" w:cs="Times New Roman"/>
+          <w:b w:val="0"/>
+        </w:rPr>
+        <w:t xml:space="preserve"> </w:t>
+      </w:r>
+      <w:proofErr w:type="spellStart"/>
+      <w:r>
+        <w:rPr>
+          <w:rFonts w:ascii="Times New Roman" w:eastAsia="Times New Roman" w:hAnsi="Times New Roman" w:cs="Times New Roman"/>
+          <w:b w:val="0"/>
+        </w:rPr>
+        <w:t>projektnog</w:t>
+      </w:r>
+      <w:proofErr w:type="spellEnd"/>
+      <w:r>
+        <w:rPr>
+          <w:rFonts w:ascii="Times New Roman" w:eastAsia="Times New Roman" w:hAnsi="Times New Roman" w:cs="Times New Roman"/>
+          <w:b w:val="0"/>
+        </w:rPr>
+        <w:t xml:space="preserve"> </w:t>
+      </w:r>
+      <w:proofErr w:type="spellStart"/>
+      <w:r>
+        <w:rPr>
+          <w:rFonts w:ascii="Times New Roman" w:eastAsia="Times New Roman" w:hAnsi="Times New Roman" w:cs="Times New Roman"/>
+          <w:b w:val="0"/>
+        </w:rPr>
+        <w:t>tima</w:t>
+      </w:r>
+      <w:proofErr w:type="spellEnd"/>
+      <w:r>
+        <w:rPr>
+          <w:rFonts w:ascii="Times New Roman" w:eastAsia="Times New Roman" w:hAnsi="Times New Roman" w:cs="Times New Roman"/>
+          <w:b w:val="0"/>
+        </w:rPr>
+        <w:t xml:space="preserve"> u </w:t>
+      </w:r>
+      <w:proofErr w:type="spellStart"/>
+      <w:r>
+        <w:rPr>
+          <w:rFonts w:ascii="Times New Roman" w:eastAsia="Times New Roman" w:hAnsi="Times New Roman" w:cs="Times New Roman"/>
+          <w:b w:val="0"/>
+        </w:rPr>
+        <w:t>razvoju</w:t>
+      </w:r>
+      <w:proofErr w:type="spellEnd"/>
+      <w:r>
+        <w:rPr>
+          <w:rFonts w:ascii="Times New Roman" w:eastAsia="Times New Roman" w:hAnsi="Times New Roman" w:cs="Times New Roman"/>
+          <w:b w:val="0"/>
+        </w:rPr>
+        <w:t xml:space="preserve"> </w:t>
+      </w:r>
+      <w:proofErr w:type="spellStart"/>
+      <w:r>
+        <w:rPr>
+          <w:rFonts w:ascii="Times New Roman" w:eastAsia="Times New Roman" w:hAnsi="Times New Roman" w:cs="Times New Roman"/>
+          <w:b w:val="0"/>
+        </w:rPr>
+        <w:t>i</w:t>
+      </w:r>
+      <w:proofErr w:type="spellEnd"/>
+      <w:r>
+        <w:rPr>
+          <w:rFonts w:ascii="Times New Roman" w:eastAsia="Times New Roman" w:hAnsi="Times New Roman" w:cs="Times New Roman"/>
+          <w:b w:val="0"/>
+        </w:rPr>
+        <w:t xml:space="preserve"> </w:t>
+      </w:r>
+      <w:proofErr w:type="spellStart"/>
+      <w:r>
+        <w:rPr>
+          <w:rFonts w:ascii="Times New Roman" w:eastAsia="Times New Roman" w:hAnsi="Times New Roman" w:cs="Times New Roman"/>
+          <w:b w:val="0"/>
+        </w:rPr>
+        <w:t>testiranju</w:t>
+      </w:r>
+      <w:proofErr w:type="spellEnd"/>
+      <w:r>
+        <w:rPr>
+          <w:rFonts w:ascii="Times New Roman" w:eastAsia="Times New Roman" w:hAnsi="Times New Roman" w:cs="Times New Roman"/>
+          <w:b w:val="0"/>
+        </w:rPr>
+        <w:t xml:space="preserve"> </w:t>
+      </w:r>
+      <w:proofErr w:type="spellStart"/>
+      <w:r>
+        <w:rPr>
+          <w:rFonts w:ascii="Times New Roman" w:eastAsia="Times New Roman" w:hAnsi="Times New Roman" w:cs="Times New Roman"/>
+          <w:b w:val="0"/>
+        </w:rPr>
+        <w:t>funkcionalnosti</w:t>
+      </w:r>
+      <w:proofErr w:type="spellEnd"/>
+      <w:r>
+        <w:rPr>
+          <w:rFonts w:ascii="Times New Roman" w:eastAsia="Times New Roman" w:hAnsi="Times New Roman" w:cs="Times New Roman"/>
+          <w:b w:val="0"/>
+        </w:rPr>
+        <w:t xml:space="preserve"> </w:t>
+      </w:r>
+      <w:proofErr w:type="spellStart"/>
+      <w:r>
+        <w:rPr>
+          <w:rFonts w:ascii="Times New Roman" w:eastAsia="Times New Roman" w:hAnsi="Times New Roman" w:cs="Times New Roman"/>
+          <w:b w:val="0"/>
+        </w:rPr>
+        <w:t>prijave</w:t>
+      </w:r>
+      <w:proofErr w:type="spellEnd"/>
+      <w:r>
+        <w:rPr>
+          <w:rFonts w:ascii="Times New Roman" w:eastAsia="Times New Roman" w:hAnsi="Times New Roman" w:cs="Times New Roman"/>
+          <w:b w:val="0"/>
+        </w:rPr>
+        <w:t xml:space="preserve">, a </w:t>
+      </w:r>
+      <w:proofErr w:type="spellStart"/>
+      <w:r>
+        <w:rPr>
+          <w:rFonts w:ascii="Times New Roman" w:eastAsia="Times New Roman" w:hAnsi="Times New Roman" w:cs="Times New Roman"/>
+          <w:b w:val="0"/>
+        </w:rPr>
+        <w:t>može</w:t>
+      </w:r>
+      <w:proofErr w:type="spellEnd"/>
+      <w:r>
+        <w:rPr>
+          <w:rFonts w:ascii="Times New Roman" w:eastAsia="Times New Roman" w:hAnsi="Times New Roman" w:cs="Times New Roman"/>
+          <w:b w:val="0"/>
+        </w:rPr>
+        <w:t xml:space="preserve"> se </w:t>
+      </w:r>
+      <w:proofErr w:type="spellStart"/>
+      <w:r>
+        <w:rPr>
+          <w:rFonts w:ascii="Times New Roman" w:eastAsia="Times New Roman" w:hAnsi="Times New Roman" w:cs="Times New Roman"/>
+          <w:b w:val="0"/>
+        </w:rPr>
+        <w:t>koristiti</w:t>
+      </w:r>
+      <w:proofErr w:type="spellEnd"/>
+      <w:r>
+        <w:rPr>
+          <w:rFonts w:ascii="Times New Roman" w:eastAsia="Times New Roman" w:hAnsi="Times New Roman" w:cs="Times New Roman"/>
+          <w:b w:val="0"/>
+        </w:rPr>
+        <w:t xml:space="preserve"> </w:t>
+      </w:r>
+      <w:proofErr w:type="spellStart"/>
+      <w:r>
+        <w:rPr>
+          <w:rFonts w:ascii="Times New Roman" w:eastAsia="Times New Roman" w:hAnsi="Times New Roman" w:cs="Times New Roman"/>
+          <w:b w:val="0"/>
+        </w:rPr>
+        <w:t>i</w:t>
+      </w:r>
+      <w:proofErr w:type="spellEnd"/>
+      <w:r>
+        <w:rPr>
+          <w:rFonts w:ascii="Times New Roman" w:eastAsia="Times New Roman" w:hAnsi="Times New Roman" w:cs="Times New Roman"/>
+          <w:b w:val="0"/>
+        </w:rPr>
+        <w:t xml:space="preserve"> </w:t>
+      </w:r>
+      <w:proofErr w:type="spellStart"/>
+      <w:r>
+        <w:rPr>
+          <w:rFonts w:ascii="Times New Roman" w:eastAsia="Times New Roman" w:hAnsi="Times New Roman" w:cs="Times New Roman"/>
+          <w:b w:val="0"/>
+        </w:rPr>
+        <w:t>pri</w:t>
+      </w:r>
+      <w:proofErr w:type="spellEnd"/>
+      <w:r>
+        <w:rPr>
+          <w:rFonts w:ascii="Times New Roman" w:eastAsia="Times New Roman" w:hAnsi="Times New Roman" w:cs="Times New Roman"/>
+          <w:b w:val="0"/>
+        </w:rPr>
+        <w:t xml:space="preserve"> </w:t>
+      </w:r>
+      <w:proofErr w:type="spellStart"/>
+      <w:r>
+        <w:rPr>
+          <w:rFonts w:ascii="Times New Roman" w:eastAsia="Times New Roman" w:hAnsi="Times New Roman" w:cs="Times New Roman"/>
+          <w:b w:val="0"/>
+        </w:rPr>
+        <w:t>pisanju</w:t>
+      </w:r>
+      <w:proofErr w:type="spellEnd"/>
+      <w:r>
+        <w:rPr>
+          <w:rFonts w:ascii="Times New Roman" w:eastAsia="Times New Roman" w:hAnsi="Times New Roman" w:cs="Times New Roman"/>
+          <w:b w:val="0"/>
+        </w:rPr>
+        <w:t xml:space="preserve"> </w:t>
+      </w:r>
+      <w:proofErr w:type="spellStart"/>
+      <w:r>
+        <w:rPr>
+          <w:rFonts w:ascii="Times New Roman" w:eastAsia="Times New Roman" w:hAnsi="Times New Roman" w:cs="Times New Roman"/>
+          <w:b w:val="0"/>
+        </w:rPr>
+        <w:t>uputstva</w:t>
+      </w:r>
+      <w:proofErr w:type="spellEnd"/>
+      <w:r>
+        <w:rPr>
+          <w:rFonts w:ascii="Times New Roman" w:eastAsia="Times New Roman" w:hAnsi="Times New Roman" w:cs="Times New Roman"/>
+          <w:b w:val="0"/>
+        </w:rPr>
+        <w:t xml:space="preserve"> za </w:t>
+      </w:r>
+      <w:proofErr w:type="spellStart"/>
+      <w:r>
+        <w:rPr>
+          <w:rFonts w:ascii="Times New Roman" w:eastAsia="Times New Roman" w:hAnsi="Times New Roman" w:cs="Times New Roman"/>
+          <w:b w:val="0"/>
+        </w:rPr>
         <w:t>administartore</w:t>
       </w:r>
+      <w:proofErr w:type="spellEnd"/>
       <w:r>
         <w:rPr>
           <w:rFonts w:ascii="Times New Roman" w:eastAsia="Times New Roman" w:hAnsi="Times New Roman" w:cs="Times New Roman"/>
@@ -2340,12 +3102,37 @@
         <w:spacing w:after="3" w:line="252" w:lineRule="auto"/>
         <w:ind w:hanging="360"/>
       </w:pPr>
-      <w:r>
-        <w:rPr>
-          <w:rFonts w:ascii="Times New Roman" w:eastAsia="Times New Roman" w:hAnsi="Times New Roman" w:cs="Times New Roman"/>
-          <w:sz w:val="20"/>
-        </w:rPr>
-        <w:t xml:space="preserve">Projektni zadatak </w:t>
+      <w:proofErr w:type="spellStart"/>
+      <w:r>
+        <w:rPr>
+          <w:rFonts w:ascii="Times New Roman" w:eastAsia="Times New Roman" w:hAnsi="Times New Roman" w:cs="Times New Roman"/>
+          <w:sz w:val="20"/>
+        </w:rPr>
+        <w:t>Projektni</w:t>
+      </w:r>
+      <w:proofErr w:type="spellEnd"/>
+      <w:r>
+        <w:rPr>
+          <w:rFonts w:ascii="Times New Roman" w:eastAsia="Times New Roman" w:hAnsi="Times New Roman" w:cs="Times New Roman"/>
+          <w:sz w:val="20"/>
+        </w:rPr>
+        <w:t xml:space="preserve"> </w:t>
+      </w:r>
+      <w:proofErr w:type="spellStart"/>
+      <w:r>
+        <w:rPr>
+          <w:rFonts w:ascii="Times New Roman" w:eastAsia="Times New Roman" w:hAnsi="Times New Roman" w:cs="Times New Roman"/>
+          <w:sz w:val="20"/>
+        </w:rPr>
+        <w:t>zadatak</w:t>
+      </w:r>
+      <w:proofErr w:type="spellEnd"/>
+      <w:r>
+        <w:rPr>
+          <w:rFonts w:ascii="Times New Roman" w:eastAsia="Times New Roman" w:hAnsi="Times New Roman" w:cs="Times New Roman"/>
+          <w:sz w:val="20"/>
+        </w:rPr>
+        <w:t xml:space="preserve"> </w:t>
       </w:r>
     </w:p>
     <w:p>
@@ -2357,12 +3144,101 @@
         <w:spacing w:after="3" w:line="252" w:lineRule="auto"/>
         <w:ind w:hanging="360"/>
       </w:pPr>
-      <w:r>
-        <w:rPr>
-          <w:rFonts w:ascii="Times New Roman" w:eastAsia="Times New Roman" w:hAnsi="Times New Roman" w:cs="Times New Roman"/>
-          <w:sz w:val="20"/>
-        </w:rPr>
-        <w:t xml:space="preserve">Uputstvo za pisanje specifikacije scenarija upotrebe funkcionalnosti  </w:t>
+      <w:proofErr w:type="spellStart"/>
+      <w:r>
+        <w:rPr>
+          <w:rFonts w:ascii="Times New Roman" w:eastAsia="Times New Roman" w:hAnsi="Times New Roman" w:cs="Times New Roman"/>
+          <w:sz w:val="20"/>
+        </w:rPr>
+        <w:t>Uputstvo</w:t>
+      </w:r>
+      <w:proofErr w:type="spellEnd"/>
+      <w:r>
+        <w:rPr>
+          <w:rFonts w:ascii="Times New Roman" w:eastAsia="Times New Roman" w:hAnsi="Times New Roman" w:cs="Times New Roman"/>
+          <w:sz w:val="20"/>
+        </w:rPr>
+        <w:t xml:space="preserve"> za </w:t>
+      </w:r>
+      <w:proofErr w:type="spellStart"/>
+      <w:r>
+        <w:rPr>
+          <w:rFonts w:ascii="Times New Roman" w:eastAsia="Times New Roman" w:hAnsi="Times New Roman" w:cs="Times New Roman"/>
+          <w:sz w:val="20"/>
+        </w:rPr>
+        <w:t>pisanje</w:t>
+      </w:r>
+      <w:proofErr w:type="spellEnd"/>
+      <w:r>
+        <w:rPr>
+          <w:rFonts w:ascii="Times New Roman" w:eastAsia="Times New Roman" w:hAnsi="Times New Roman" w:cs="Times New Roman"/>
+          <w:sz w:val="20"/>
+        </w:rPr>
+        <w:t xml:space="preserve"> </w:t>
+      </w:r>
+      <w:proofErr w:type="spellStart"/>
+      <w:r>
+        <w:rPr>
+          <w:rFonts w:ascii="Times New Roman" w:eastAsia="Times New Roman" w:hAnsi="Times New Roman" w:cs="Times New Roman"/>
+          <w:sz w:val="20"/>
+        </w:rPr>
+        <w:t>specifikacije</w:t>
+      </w:r>
+      <w:proofErr w:type="spellEnd"/>
+      <w:r>
+        <w:rPr>
+          <w:rFonts w:ascii="Times New Roman" w:eastAsia="Times New Roman" w:hAnsi="Times New Roman" w:cs="Times New Roman"/>
+          <w:sz w:val="20"/>
+        </w:rPr>
+        <w:t xml:space="preserve"> </w:t>
+      </w:r>
+      <w:proofErr w:type="spellStart"/>
+      <w:r>
+        <w:rPr>
+          <w:rFonts w:ascii="Times New Roman" w:eastAsia="Times New Roman" w:hAnsi="Times New Roman" w:cs="Times New Roman"/>
+          <w:sz w:val="20"/>
+        </w:rPr>
+        <w:t>scenarija</w:t>
+      </w:r>
+      <w:proofErr w:type="spellEnd"/>
+      <w:r>
+        <w:rPr>
+          <w:rFonts w:ascii="Times New Roman" w:eastAsia="Times New Roman" w:hAnsi="Times New Roman" w:cs="Times New Roman"/>
+          <w:sz w:val="20"/>
+        </w:rPr>
+        <w:t xml:space="preserve"> </w:t>
+      </w:r>
+      <w:proofErr w:type="spellStart"/>
+      <w:r>
+        <w:rPr>
+          <w:rFonts w:ascii="Times New Roman" w:eastAsia="Times New Roman" w:hAnsi="Times New Roman" w:cs="Times New Roman"/>
+          <w:sz w:val="20"/>
+        </w:rPr>
+        <w:t>upotrebe</w:t>
+      </w:r>
+      <w:proofErr w:type="spellEnd"/>
+      <w:r>
+        <w:rPr>
+          <w:rFonts w:ascii="Times New Roman" w:eastAsia="Times New Roman" w:hAnsi="Times New Roman" w:cs="Times New Roman"/>
+          <w:sz w:val="20"/>
+        </w:rPr>
+        <w:t xml:space="preserve"> </w:t>
+      </w:r>
+      <w:proofErr w:type="spellStart"/>
+      <w:r>
+        <w:rPr>
+          <w:rFonts w:ascii="Times New Roman" w:eastAsia="Times New Roman" w:hAnsi="Times New Roman" w:cs="Times New Roman"/>
+          <w:sz w:val="20"/>
+        </w:rPr>
+        <w:t>funkcionalnosti</w:t>
+      </w:r>
+      <w:proofErr w:type="spellEnd"/>
+      <w:r>
+        <w:rPr>
+          <w:rFonts w:ascii="Times New Roman" w:eastAsia="Times New Roman" w:hAnsi="Times New Roman" w:cs="Times New Roman"/>
+          <w:sz w:val="20"/>
+        </w:rPr>
+        <w:t xml:space="preserve">  </w:t>
       </w:r>
     </w:p>
     <w:p>
@@ -2407,9 +3283,14 @@
       </w:pPr>
       <w:bookmarkStart w:id="5" w:name="_Toc205762428"/>
       <w:r>
-        <w:t>Otvorena pitanja</w:t>
+        <w:t xml:space="preserve">Otvorena </w:t>
+      </w:r>
+      <w:proofErr w:type="spellStart"/>
+      <w:r>
+        <w:t>pitanja</w:t>
       </w:r>
       <w:bookmarkEnd w:id="5"/>
+      <w:proofErr w:type="spellEnd"/>
       <w:r>
         <w:t xml:space="preserve"> </w:t>
       </w:r>
@@ -2446,12 +3327,37 @@
             </w:tcBorders>
           </w:tcPr>
           <w:p>
+            <w:proofErr w:type="spellStart"/>
             <w:r>
               <w:rPr>
                 <w:rFonts w:ascii="Times New Roman" w:eastAsia="Times New Roman" w:hAnsi="Times New Roman" w:cs="Times New Roman"/>
                 <w:sz w:val="20"/>
               </w:rPr>
-              <w:t xml:space="preserve">Redni broj </w:t>
+              <w:t>Redni</w:t>
+            </w:r>
+            <w:proofErr w:type="spellEnd"/>
+            <w:r>
+              <w:rPr>
+                <w:rFonts w:ascii="Times New Roman" w:eastAsia="Times New Roman" w:hAnsi="Times New Roman" w:cs="Times New Roman"/>
+                <w:sz w:val="20"/>
+              </w:rPr>
+              <w:t xml:space="preserve"> </w:t>
+            </w:r>
+            <w:proofErr w:type="spellStart"/>
+            <w:r>
+              <w:rPr>
+                <w:rFonts w:ascii="Times New Roman" w:eastAsia="Times New Roman" w:hAnsi="Times New Roman" w:cs="Times New Roman"/>
+                <w:sz w:val="20"/>
+              </w:rPr>
+              <w:t>broj</w:t>
+            </w:r>
+            <w:proofErr w:type="spellEnd"/>
+            <w:r>
+              <w:rPr>
+                <w:rFonts w:ascii="Times New Roman" w:eastAsia="Times New Roman" w:hAnsi="Times New Roman" w:cs="Times New Roman"/>
+                <w:sz w:val="20"/>
+              </w:rPr>
+              <w:t xml:space="preserve"> </w:t>
             </w:r>
           </w:p>
         </w:tc>
@@ -2466,12 +3372,21 @@
             </w:tcBorders>
           </w:tcPr>
           <w:p>
+            <w:proofErr w:type="spellStart"/>
             <w:r>
               <w:rPr>
                 <w:rFonts w:ascii="Times New Roman" w:eastAsia="Times New Roman" w:hAnsi="Times New Roman" w:cs="Times New Roman"/>
                 <w:sz w:val="20"/>
               </w:rPr>
-              <w:t xml:space="preserve">Opis </w:t>
+              <w:t>Opis</w:t>
+            </w:r>
+            <w:proofErr w:type="spellEnd"/>
+            <w:r>
+              <w:rPr>
+                <w:rFonts w:ascii="Times New Roman" w:eastAsia="Times New Roman" w:hAnsi="Times New Roman" w:cs="Times New Roman"/>
+                <w:sz w:val="20"/>
+              </w:rPr>
+              <w:t xml:space="preserve"> </w:t>
             </w:r>
           </w:p>
         </w:tc>
@@ -2486,12 +3401,21 @@
             </w:tcBorders>
           </w:tcPr>
           <w:p>
+            <w:proofErr w:type="spellStart"/>
             <w:r>
               <w:rPr>
                 <w:rFonts w:ascii="Times New Roman" w:eastAsia="Times New Roman" w:hAnsi="Times New Roman" w:cs="Times New Roman"/>
                 <w:sz w:val="20"/>
               </w:rPr>
-              <w:t xml:space="preserve">Rešenje </w:t>
+              <w:t>Rešenje</w:t>
+            </w:r>
+            <w:proofErr w:type="spellEnd"/>
+            <w:r>
+              <w:rPr>
+                <w:rFonts w:ascii="Times New Roman" w:eastAsia="Times New Roman" w:hAnsi="Times New Roman" w:cs="Times New Roman"/>
+                <w:sz w:val="20"/>
+              </w:rPr>
+              <w:t xml:space="preserve"> </w:t>
             </w:r>
           </w:p>
         </w:tc>
@@ -2542,12 +3466,85 @@
               </w:rPr>
               <w:t xml:space="preserve">Da li </w:t>
             </w:r>
+            <w:proofErr w:type="spellStart"/>
             <w:r>
               <w:rPr>
                 <w:rFonts w:ascii="Times New Roman" w:eastAsia="Times New Roman" w:hAnsi="Times New Roman" w:cs="Times New Roman"/>
                 <w:sz w:val="20"/>
               </w:rPr>
-              <w:t>kroisnik dobija obaveštenje o uklanjanju slike?</w:t>
+              <w:t>kroisnik</w:t>
+            </w:r>
+            <w:proofErr w:type="spellEnd"/>
+            <w:r>
+              <w:rPr>
+                <w:rFonts w:ascii="Times New Roman" w:eastAsia="Times New Roman" w:hAnsi="Times New Roman" w:cs="Times New Roman"/>
+                <w:sz w:val="20"/>
+              </w:rPr>
+              <w:t xml:space="preserve"> </w:t>
+            </w:r>
+            <w:proofErr w:type="spellStart"/>
+            <w:r>
+              <w:rPr>
+                <w:rFonts w:ascii="Times New Roman" w:eastAsia="Times New Roman" w:hAnsi="Times New Roman" w:cs="Times New Roman"/>
+                <w:sz w:val="20"/>
+              </w:rPr>
+              <w:t>dobija</w:t>
+            </w:r>
+            <w:proofErr w:type="spellEnd"/>
+            <w:r>
+              <w:rPr>
+                <w:rFonts w:ascii="Times New Roman" w:eastAsia="Times New Roman" w:hAnsi="Times New Roman" w:cs="Times New Roman"/>
+                <w:sz w:val="20"/>
+              </w:rPr>
+              <w:t xml:space="preserve"> </w:t>
+            </w:r>
+            <w:proofErr w:type="spellStart"/>
+            <w:r>
+              <w:rPr>
+                <w:rFonts w:ascii="Times New Roman" w:eastAsia="Times New Roman" w:hAnsi="Times New Roman" w:cs="Times New Roman"/>
+                <w:sz w:val="20"/>
+              </w:rPr>
+              <w:t>obaveštenje</w:t>
+            </w:r>
+            <w:proofErr w:type="spellEnd"/>
+            <w:r>
+              <w:rPr>
+                <w:rFonts w:ascii="Times New Roman" w:eastAsia="Times New Roman" w:hAnsi="Times New Roman" w:cs="Times New Roman"/>
+                <w:sz w:val="20"/>
+              </w:rPr>
+              <w:t xml:space="preserve"> o </w:t>
+            </w:r>
+            <w:proofErr w:type="spellStart"/>
+            <w:r>
+              <w:rPr>
+                <w:rFonts w:ascii="Times New Roman" w:eastAsia="Times New Roman" w:hAnsi="Times New Roman" w:cs="Times New Roman"/>
+                <w:sz w:val="20"/>
+              </w:rPr>
+              <w:t>uklanjanju</w:t>
+            </w:r>
+            <w:proofErr w:type="spellEnd"/>
+            <w:r>
+              <w:rPr>
+                <w:rFonts w:ascii="Times New Roman" w:eastAsia="Times New Roman" w:hAnsi="Times New Roman" w:cs="Times New Roman"/>
+                <w:sz w:val="20"/>
+              </w:rPr>
+              <w:t xml:space="preserve"> </w:t>
+            </w:r>
+            <w:proofErr w:type="spellStart"/>
+            <w:r>
+              <w:rPr>
+                <w:rFonts w:ascii="Times New Roman" w:eastAsia="Times New Roman" w:hAnsi="Times New Roman" w:cs="Times New Roman"/>
+                <w:sz w:val="20"/>
+              </w:rPr>
+              <w:t>slike</w:t>
+            </w:r>
+            <w:proofErr w:type="spellEnd"/>
+            <w:r>
+              <w:rPr>
+                <w:rFonts w:ascii="Times New Roman" w:eastAsia="Times New Roman" w:hAnsi="Times New Roman" w:cs="Times New Roman"/>
+                <w:sz w:val="20"/>
+              </w:rPr>
+              <w:t>?</w:t>
             </w:r>
           </w:p>
         </w:tc>
@@ -2696,7 +3693,103 @@
                       <w:rFonts w:ascii="Times New Roman" w:eastAsia="Times New Roman" w:hAnsi="Times New Roman" w:cs="Times New Roman"/>
                       <w:sz w:val="20"/>
                     </w:rPr>
-                    <w:t>Da li se uklanjaju I komentari I ocene vezane za tu sliku?</w:t>
+                    <w:t xml:space="preserve">Da li se </w:t>
+                  </w:r>
+                  <w:proofErr w:type="spellStart"/>
+                  <w:r>
+                    <w:rPr>
+                      <w:rFonts w:ascii="Times New Roman" w:eastAsia="Times New Roman" w:hAnsi="Times New Roman" w:cs="Times New Roman"/>
+                      <w:sz w:val="20"/>
+                    </w:rPr>
+                    <w:t>uklanjaju</w:t>
+                  </w:r>
+                  <w:proofErr w:type="spellEnd"/>
+                  <w:r>
+                    <w:rPr>
+                      <w:rFonts w:ascii="Times New Roman" w:eastAsia="Times New Roman" w:hAnsi="Times New Roman" w:cs="Times New Roman"/>
+                      <w:sz w:val="20"/>
+                    </w:rPr>
+                    <w:t xml:space="preserve"> I </w:t>
+                  </w:r>
+                  <w:proofErr w:type="spellStart"/>
+                  <w:r>
+                    <w:rPr>
+                      <w:rFonts w:ascii="Times New Roman" w:eastAsia="Times New Roman" w:hAnsi="Times New Roman" w:cs="Times New Roman"/>
+                      <w:sz w:val="20"/>
+                    </w:rPr>
+                    <w:t>komentari</w:t>
+                  </w:r>
+                  <w:proofErr w:type="spellEnd"/>
+                  <w:r>
+                    <w:rPr>
+                      <w:rFonts w:ascii="Times New Roman" w:eastAsia="Times New Roman" w:hAnsi="Times New Roman" w:cs="Times New Roman"/>
+                      <w:sz w:val="20"/>
+                    </w:rPr>
+                    <w:t xml:space="preserve"> I </w:t>
+                  </w:r>
+                  <w:proofErr w:type="spellStart"/>
+                  <w:r>
+                    <w:rPr>
+                      <w:rFonts w:ascii="Times New Roman" w:eastAsia="Times New Roman" w:hAnsi="Times New Roman" w:cs="Times New Roman"/>
+                      <w:sz w:val="20"/>
+                    </w:rPr>
+                    <w:t>ocene</w:t>
+                  </w:r>
+                  <w:proofErr w:type="spellEnd"/>
+                  <w:r>
+                    <w:rPr>
+                      <w:rFonts w:ascii="Times New Roman" w:eastAsia="Times New Roman" w:hAnsi="Times New Roman" w:cs="Times New Roman"/>
+                      <w:sz w:val="20"/>
+                    </w:rPr>
+                    <w:t xml:space="preserve"> </w:t>
+                  </w:r>
+                  <w:proofErr w:type="spellStart"/>
+                  <w:r>
+                    <w:rPr>
+                      <w:rFonts w:ascii="Times New Roman" w:eastAsia="Times New Roman" w:hAnsi="Times New Roman" w:cs="Times New Roman"/>
+                      <w:sz w:val="20"/>
+                    </w:rPr>
+                    <w:t>vezane</w:t>
+                  </w:r>
+                  <w:proofErr w:type="spellEnd"/>
+                  <w:r>
+                    <w:rPr>
+                      <w:rFonts w:ascii="Times New Roman" w:eastAsia="Times New Roman" w:hAnsi="Times New Roman" w:cs="Times New Roman"/>
+                      <w:sz w:val="20"/>
+                    </w:rPr>
+                    <w:t xml:space="preserve"> za </w:t>
+                  </w:r>
+                  <w:proofErr w:type="spellStart"/>
+                  <w:r>
+                    <w:rPr>
+                      <w:rFonts w:ascii="Times New Roman" w:eastAsia="Times New Roman" w:hAnsi="Times New Roman" w:cs="Times New Roman"/>
+                      <w:sz w:val="20"/>
+                    </w:rPr>
+                    <w:t>tu</w:t>
+                  </w:r>
+                  <w:proofErr w:type="spellEnd"/>
+                  <w:r>
+                    <w:rPr>
+                      <w:rFonts w:ascii="Times New Roman" w:eastAsia="Times New Roman" w:hAnsi="Times New Roman" w:cs="Times New Roman"/>
+                      <w:sz w:val="20"/>
+                    </w:rPr>
+                    <w:t xml:space="preserve"> </w:t>
+                  </w:r>
+                  <w:proofErr w:type="spellStart"/>
+                  <w:r>
+                    <w:rPr>
+                      <w:rFonts w:ascii="Times New Roman" w:eastAsia="Times New Roman" w:hAnsi="Times New Roman" w:cs="Times New Roman"/>
+                      <w:sz w:val="20"/>
+                    </w:rPr>
+                    <w:t>sliku</w:t>
+                  </w:r>
+                  <w:proofErr w:type="spellEnd"/>
+                  <w:r>
+                    <w:rPr>
+                      <w:rFonts w:ascii="Times New Roman" w:eastAsia="Times New Roman" w:hAnsi="Times New Roman" w:cs="Times New Roman"/>
+                      <w:sz w:val="20"/>
+                    </w:rPr>
+                    <w:t>?</w:t>
                   </w:r>
                 </w:p>
               </w:tc>
@@ -2896,9 +3989,19 @@
         <w:t xml:space="preserve">Scenario </w:t>
       </w:r>
       <w:bookmarkEnd w:id="6"/>
-      <w:r>
-        <w:t>uklanjanja slike</w:t>
-      </w:r>
+      <w:proofErr w:type="spellStart"/>
+      <w:r>
+        <w:t>uklanjanja</w:t>
+      </w:r>
+      <w:proofErr w:type="spellEnd"/>
+      <w:r>
+        <w:t xml:space="preserve"> </w:t>
+      </w:r>
+      <w:proofErr w:type="spellStart"/>
+      <w:r>
+        <w:t>slike</w:t>
+      </w:r>
+      <w:proofErr w:type="spellEnd"/>
     </w:p>
     <w:p>
       <w:pPr>
@@ -2919,13 +4022,29 @@
         <w:ind w:left="705" w:hanging="720"/>
       </w:pPr>
       <w:bookmarkStart w:id="7" w:name="_Toc205762430"/>
+      <w:proofErr w:type="spellStart"/>
       <w:r>
         <w:rPr>
           <w:u w:val="single" w:color="000000"/>
         </w:rPr>
-        <w:t>Kratak opis</w:t>
+        <w:t>Kratak</w:t>
+      </w:r>
+      <w:proofErr w:type="spellEnd"/>
+      <w:r>
+        <w:rPr>
+          <w:u w:val="single" w:color="000000"/>
+        </w:rPr>
+        <w:t xml:space="preserve"> </w:t>
+      </w:r>
+      <w:proofErr w:type="spellStart"/>
+      <w:r>
+        <w:rPr>
+          <w:u w:val="single" w:color="000000"/>
+        </w:rPr>
+        <w:t>opis</w:t>
       </w:r>
       <w:bookmarkEnd w:id="7"/>
+      <w:proofErr w:type="spellEnd"/>
       <w:r>
         <w:t xml:space="preserve"> </w:t>
       </w:r>
@@ -2940,21 +4059,414 @@
           <w:rFonts w:ascii="Times New Roman" w:eastAsia="Times New Roman" w:hAnsi="Times New Roman" w:cs="Times New Roman"/>
           <w:sz w:val="20"/>
         </w:rPr>
-        <w:t>Administrator sistema ima mogućnost da ukloni bilo koju sliku sa platforme, ukoliko ona krši pravila korišćenja</w:t>
-      </w:r>
-      <w:r>
-        <w:rPr>
-          <w:rFonts w:ascii="Times New Roman" w:eastAsia="Times New Roman" w:hAnsi="Times New Roman" w:cs="Times New Roman"/>
-          <w:sz w:val="20"/>
-        </w:rPr>
-        <w:t>, pre svega ukoliko se okači AI slika.</w:t>
-      </w:r>
-      <w:r>
-        <w:rPr>
-          <w:rFonts w:ascii="Times New Roman" w:eastAsia="Times New Roman" w:hAnsi="Times New Roman" w:cs="Times New Roman"/>
-          <w:sz w:val="20"/>
-        </w:rPr>
-        <w:t xml:space="preserve"> Ova funkcionalnost je deo administratorskog panela i dostupna je isključivo ovlašćenim korisnicima.</w:t>
+        <w:t xml:space="preserve">Administrator </w:t>
+      </w:r>
+      <w:proofErr w:type="spellStart"/>
+      <w:r>
+        <w:rPr>
+          <w:rFonts w:ascii="Times New Roman" w:eastAsia="Times New Roman" w:hAnsi="Times New Roman" w:cs="Times New Roman"/>
+          <w:sz w:val="20"/>
+        </w:rPr>
+        <w:t>sistema</w:t>
+      </w:r>
+      <w:proofErr w:type="spellEnd"/>
+      <w:r>
+        <w:rPr>
+          <w:rFonts w:ascii="Times New Roman" w:eastAsia="Times New Roman" w:hAnsi="Times New Roman" w:cs="Times New Roman"/>
+          <w:sz w:val="20"/>
+        </w:rPr>
+        <w:t xml:space="preserve"> </w:t>
+      </w:r>
+      <w:proofErr w:type="spellStart"/>
+      <w:r>
+        <w:rPr>
+          <w:rFonts w:ascii="Times New Roman" w:eastAsia="Times New Roman" w:hAnsi="Times New Roman" w:cs="Times New Roman"/>
+          <w:sz w:val="20"/>
+        </w:rPr>
+        <w:t>ima</w:t>
+      </w:r>
+      <w:proofErr w:type="spellEnd"/>
+      <w:r>
+        <w:rPr>
+          <w:rFonts w:ascii="Times New Roman" w:eastAsia="Times New Roman" w:hAnsi="Times New Roman" w:cs="Times New Roman"/>
+          <w:sz w:val="20"/>
+        </w:rPr>
+        <w:t xml:space="preserve"> </w:t>
+      </w:r>
+      <w:proofErr w:type="spellStart"/>
+      <w:r>
+        <w:rPr>
+          <w:rFonts w:ascii="Times New Roman" w:eastAsia="Times New Roman" w:hAnsi="Times New Roman" w:cs="Times New Roman"/>
+          <w:sz w:val="20"/>
+        </w:rPr>
+        <w:t>mogućnost</w:t>
+      </w:r>
+      <w:proofErr w:type="spellEnd"/>
+      <w:r>
+        <w:rPr>
+          <w:rFonts w:ascii="Times New Roman" w:eastAsia="Times New Roman" w:hAnsi="Times New Roman" w:cs="Times New Roman"/>
+          <w:sz w:val="20"/>
+        </w:rPr>
+        <w:t xml:space="preserve"> da </w:t>
+      </w:r>
+      <w:proofErr w:type="spellStart"/>
+      <w:r>
+        <w:rPr>
+          <w:rFonts w:ascii="Times New Roman" w:eastAsia="Times New Roman" w:hAnsi="Times New Roman" w:cs="Times New Roman"/>
+          <w:sz w:val="20"/>
+        </w:rPr>
+        <w:t>ukloni</w:t>
+      </w:r>
+      <w:proofErr w:type="spellEnd"/>
+      <w:r>
+        <w:rPr>
+          <w:rFonts w:ascii="Times New Roman" w:eastAsia="Times New Roman" w:hAnsi="Times New Roman" w:cs="Times New Roman"/>
+          <w:sz w:val="20"/>
+        </w:rPr>
+        <w:t xml:space="preserve"> </w:t>
+      </w:r>
+      <w:proofErr w:type="spellStart"/>
+      <w:r>
+        <w:rPr>
+          <w:rFonts w:ascii="Times New Roman" w:eastAsia="Times New Roman" w:hAnsi="Times New Roman" w:cs="Times New Roman"/>
+          <w:sz w:val="20"/>
+        </w:rPr>
+        <w:t>bilo</w:t>
+      </w:r>
+      <w:proofErr w:type="spellEnd"/>
+      <w:r>
+        <w:rPr>
+          <w:rFonts w:ascii="Times New Roman" w:eastAsia="Times New Roman" w:hAnsi="Times New Roman" w:cs="Times New Roman"/>
+          <w:sz w:val="20"/>
+        </w:rPr>
+        <w:t xml:space="preserve"> </w:t>
+      </w:r>
+      <w:proofErr w:type="spellStart"/>
+      <w:r>
+        <w:rPr>
+          <w:rFonts w:ascii="Times New Roman" w:eastAsia="Times New Roman" w:hAnsi="Times New Roman" w:cs="Times New Roman"/>
+          <w:sz w:val="20"/>
+        </w:rPr>
+        <w:t>koju</w:t>
+      </w:r>
+      <w:proofErr w:type="spellEnd"/>
+      <w:r>
+        <w:rPr>
+          <w:rFonts w:ascii="Times New Roman" w:eastAsia="Times New Roman" w:hAnsi="Times New Roman" w:cs="Times New Roman"/>
+          <w:sz w:val="20"/>
+        </w:rPr>
+        <w:t xml:space="preserve"> </w:t>
+      </w:r>
+      <w:proofErr w:type="spellStart"/>
+      <w:r>
+        <w:rPr>
+          <w:rFonts w:ascii="Times New Roman" w:eastAsia="Times New Roman" w:hAnsi="Times New Roman" w:cs="Times New Roman"/>
+          <w:sz w:val="20"/>
+        </w:rPr>
+        <w:t>sliku</w:t>
+      </w:r>
+      <w:proofErr w:type="spellEnd"/>
+      <w:r>
+        <w:rPr>
+          <w:rFonts w:ascii="Times New Roman" w:eastAsia="Times New Roman" w:hAnsi="Times New Roman" w:cs="Times New Roman"/>
+          <w:sz w:val="20"/>
+        </w:rPr>
+        <w:t xml:space="preserve"> </w:t>
+      </w:r>
+      <w:proofErr w:type="spellStart"/>
+      <w:r>
+        <w:rPr>
+          <w:rFonts w:ascii="Times New Roman" w:eastAsia="Times New Roman" w:hAnsi="Times New Roman" w:cs="Times New Roman"/>
+          <w:sz w:val="20"/>
+        </w:rPr>
+        <w:t>sa</w:t>
+      </w:r>
+      <w:proofErr w:type="spellEnd"/>
+      <w:r>
+        <w:rPr>
+          <w:rFonts w:ascii="Times New Roman" w:eastAsia="Times New Roman" w:hAnsi="Times New Roman" w:cs="Times New Roman"/>
+          <w:sz w:val="20"/>
+        </w:rPr>
+        <w:t xml:space="preserve"> </w:t>
+      </w:r>
+      <w:proofErr w:type="spellStart"/>
+      <w:r>
+        <w:rPr>
+          <w:rFonts w:ascii="Times New Roman" w:eastAsia="Times New Roman" w:hAnsi="Times New Roman" w:cs="Times New Roman"/>
+          <w:sz w:val="20"/>
+        </w:rPr>
+        <w:t>platforme</w:t>
+      </w:r>
+      <w:proofErr w:type="spellEnd"/>
+      <w:r>
+        <w:rPr>
+          <w:rFonts w:ascii="Times New Roman" w:eastAsia="Times New Roman" w:hAnsi="Times New Roman" w:cs="Times New Roman"/>
+          <w:sz w:val="20"/>
+        </w:rPr>
+        <w:t xml:space="preserve">, </w:t>
+      </w:r>
+      <w:proofErr w:type="spellStart"/>
+      <w:r>
+        <w:rPr>
+          <w:rFonts w:ascii="Times New Roman" w:eastAsia="Times New Roman" w:hAnsi="Times New Roman" w:cs="Times New Roman"/>
+          <w:sz w:val="20"/>
+        </w:rPr>
+        <w:t>ukoliko</w:t>
+      </w:r>
+      <w:proofErr w:type="spellEnd"/>
+      <w:r>
+        <w:rPr>
+          <w:rFonts w:ascii="Times New Roman" w:eastAsia="Times New Roman" w:hAnsi="Times New Roman" w:cs="Times New Roman"/>
+          <w:sz w:val="20"/>
+        </w:rPr>
+        <w:t xml:space="preserve"> </w:t>
+      </w:r>
+      <w:proofErr w:type="spellStart"/>
+      <w:r>
+        <w:rPr>
+          <w:rFonts w:ascii="Times New Roman" w:eastAsia="Times New Roman" w:hAnsi="Times New Roman" w:cs="Times New Roman"/>
+          <w:sz w:val="20"/>
+        </w:rPr>
+        <w:t>ona</w:t>
+      </w:r>
+      <w:proofErr w:type="spellEnd"/>
+      <w:r>
+        <w:rPr>
+          <w:rFonts w:ascii="Times New Roman" w:eastAsia="Times New Roman" w:hAnsi="Times New Roman" w:cs="Times New Roman"/>
+          <w:sz w:val="20"/>
+        </w:rPr>
+        <w:t xml:space="preserve"> </w:t>
+      </w:r>
+      <w:proofErr w:type="spellStart"/>
+      <w:r>
+        <w:rPr>
+          <w:rFonts w:ascii="Times New Roman" w:eastAsia="Times New Roman" w:hAnsi="Times New Roman" w:cs="Times New Roman"/>
+          <w:sz w:val="20"/>
+        </w:rPr>
+        <w:t>krši</w:t>
+      </w:r>
+      <w:proofErr w:type="spellEnd"/>
+      <w:r>
+        <w:rPr>
+          <w:rFonts w:ascii="Times New Roman" w:eastAsia="Times New Roman" w:hAnsi="Times New Roman" w:cs="Times New Roman"/>
+          <w:sz w:val="20"/>
+        </w:rPr>
+        <w:t xml:space="preserve"> </w:t>
+      </w:r>
+      <w:proofErr w:type="spellStart"/>
+      <w:r>
+        <w:rPr>
+          <w:rFonts w:ascii="Times New Roman" w:eastAsia="Times New Roman" w:hAnsi="Times New Roman" w:cs="Times New Roman"/>
+          <w:sz w:val="20"/>
+        </w:rPr>
+        <w:t>pravila</w:t>
+      </w:r>
+      <w:proofErr w:type="spellEnd"/>
+      <w:r>
+        <w:rPr>
+          <w:rFonts w:ascii="Times New Roman" w:eastAsia="Times New Roman" w:hAnsi="Times New Roman" w:cs="Times New Roman"/>
+          <w:sz w:val="20"/>
+        </w:rPr>
+        <w:t xml:space="preserve"> </w:t>
+      </w:r>
+      <w:proofErr w:type="spellStart"/>
+      <w:r>
+        <w:rPr>
+          <w:rFonts w:ascii="Times New Roman" w:eastAsia="Times New Roman" w:hAnsi="Times New Roman" w:cs="Times New Roman"/>
+          <w:sz w:val="20"/>
+        </w:rPr>
+        <w:t>korišćenja</w:t>
+      </w:r>
+      <w:proofErr w:type="spellEnd"/>
+      <w:r>
+        <w:rPr>
+          <w:rFonts w:ascii="Times New Roman" w:eastAsia="Times New Roman" w:hAnsi="Times New Roman" w:cs="Times New Roman"/>
+          <w:sz w:val="20"/>
+        </w:rPr>
+        <w:t xml:space="preserve">, pre </w:t>
+      </w:r>
+      <w:proofErr w:type="spellStart"/>
+      <w:r>
+        <w:rPr>
+          <w:rFonts w:ascii="Times New Roman" w:eastAsia="Times New Roman" w:hAnsi="Times New Roman" w:cs="Times New Roman"/>
+          <w:sz w:val="20"/>
+        </w:rPr>
+        <w:t>svega</w:t>
+      </w:r>
+      <w:proofErr w:type="spellEnd"/>
+      <w:r>
+        <w:rPr>
+          <w:rFonts w:ascii="Times New Roman" w:eastAsia="Times New Roman" w:hAnsi="Times New Roman" w:cs="Times New Roman"/>
+          <w:sz w:val="20"/>
+        </w:rPr>
+        <w:t xml:space="preserve"> </w:t>
+      </w:r>
+      <w:proofErr w:type="spellStart"/>
+      <w:r>
+        <w:rPr>
+          <w:rFonts w:ascii="Times New Roman" w:eastAsia="Times New Roman" w:hAnsi="Times New Roman" w:cs="Times New Roman"/>
+          <w:sz w:val="20"/>
+        </w:rPr>
+        <w:t>ukoliko</w:t>
+      </w:r>
+      <w:proofErr w:type="spellEnd"/>
+      <w:r>
+        <w:rPr>
+          <w:rFonts w:ascii="Times New Roman" w:eastAsia="Times New Roman" w:hAnsi="Times New Roman" w:cs="Times New Roman"/>
+          <w:sz w:val="20"/>
+        </w:rPr>
+        <w:t xml:space="preserve"> se </w:t>
+      </w:r>
+      <w:proofErr w:type="spellStart"/>
+      <w:r>
+        <w:rPr>
+          <w:rFonts w:ascii="Times New Roman" w:eastAsia="Times New Roman" w:hAnsi="Times New Roman" w:cs="Times New Roman"/>
+          <w:sz w:val="20"/>
+        </w:rPr>
+        <w:t>okači</w:t>
+      </w:r>
+      <w:proofErr w:type="spellEnd"/>
+      <w:r>
+        <w:rPr>
+          <w:rFonts w:ascii="Times New Roman" w:eastAsia="Times New Roman" w:hAnsi="Times New Roman" w:cs="Times New Roman"/>
+          <w:sz w:val="20"/>
+        </w:rPr>
+        <w:t xml:space="preserve"> AI </w:t>
+      </w:r>
+      <w:proofErr w:type="spellStart"/>
+      <w:r>
+        <w:rPr>
+          <w:rFonts w:ascii="Times New Roman" w:eastAsia="Times New Roman" w:hAnsi="Times New Roman" w:cs="Times New Roman"/>
+          <w:sz w:val="20"/>
+        </w:rPr>
+        <w:t>slika</w:t>
+      </w:r>
+      <w:proofErr w:type="spellEnd"/>
+      <w:r>
+        <w:rPr>
+          <w:rFonts w:ascii="Times New Roman" w:eastAsia="Times New Roman" w:hAnsi="Times New Roman" w:cs="Times New Roman"/>
+          <w:sz w:val="20"/>
+        </w:rPr>
+        <w:t>.</w:t>
+      </w:r>
+      <w:r>
+        <w:rPr>
+          <w:rFonts w:ascii="Times New Roman" w:eastAsia="Times New Roman" w:hAnsi="Times New Roman" w:cs="Times New Roman"/>
+          <w:sz w:val="20"/>
+        </w:rPr>
+        <w:t xml:space="preserve"> Ova </w:t>
+      </w:r>
+      <w:proofErr w:type="spellStart"/>
+      <w:r>
+        <w:rPr>
+          <w:rFonts w:ascii="Times New Roman" w:eastAsia="Times New Roman" w:hAnsi="Times New Roman" w:cs="Times New Roman"/>
+          <w:sz w:val="20"/>
+        </w:rPr>
+        <w:t>funkcionalnost</w:t>
+      </w:r>
+      <w:proofErr w:type="spellEnd"/>
+      <w:r>
+        <w:rPr>
+          <w:rFonts w:ascii="Times New Roman" w:eastAsia="Times New Roman" w:hAnsi="Times New Roman" w:cs="Times New Roman"/>
+          <w:sz w:val="20"/>
+        </w:rPr>
+        <w:t xml:space="preserve"> je deo </w:t>
+      </w:r>
+      <w:proofErr w:type="spellStart"/>
+      <w:r>
+        <w:rPr>
+          <w:rFonts w:ascii="Times New Roman" w:eastAsia="Times New Roman" w:hAnsi="Times New Roman" w:cs="Times New Roman"/>
+          <w:sz w:val="20"/>
+        </w:rPr>
+        <w:t>administratorskog</w:t>
+      </w:r>
+      <w:proofErr w:type="spellEnd"/>
+      <w:r>
+        <w:rPr>
+          <w:rFonts w:ascii="Times New Roman" w:eastAsia="Times New Roman" w:hAnsi="Times New Roman" w:cs="Times New Roman"/>
+          <w:sz w:val="20"/>
+        </w:rPr>
+        <w:t xml:space="preserve"> panela </w:t>
+      </w:r>
+      <w:proofErr w:type="spellStart"/>
+      <w:r>
+        <w:rPr>
+          <w:rFonts w:ascii="Times New Roman" w:eastAsia="Times New Roman" w:hAnsi="Times New Roman" w:cs="Times New Roman"/>
+          <w:sz w:val="20"/>
+        </w:rPr>
+        <w:t>i</w:t>
+      </w:r>
+      <w:proofErr w:type="spellEnd"/>
+      <w:r>
+        <w:rPr>
+          <w:rFonts w:ascii="Times New Roman" w:eastAsia="Times New Roman" w:hAnsi="Times New Roman" w:cs="Times New Roman"/>
+          <w:sz w:val="20"/>
+        </w:rPr>
+        <w:t xml:space="preserve"> </w:t>
+      </w:r>
+      <w:proofErr w:type="spellStart"/>
+      <w:r>
+        <w:rPr>
+          <w:rFonts w:ascii="Times New Roman" w:eastAsia="Times New Roman" w:hAnsi="Times New Roman" w:cs="Times New Roman"/>
+          <w:sz w:val="20"/>
+        </w:rPr>
+        <w:t>dostupna</w:t>
+      </w:r>
+      <w:proofErr w:type="spellEnd"/>
+      <w:r>
+        <w:rPr>
+          <w:rFonts w:ascii="Times New Roman" w:eastAsia="Times New Roman" w:hAnsi="Times New Roman" w:cs="Times New Roman"/>
+          <w:sz w:val="20"/>
+        </w:rPr>
+        <w:t xml:space="preserve"> je </w:t>
+      </w:r>
+      <w:proofErr w:type="spellStart"/>
+      <w:r>
+        <w:rPr>
+          <w:rFonts w:ascii="Times New Roman" w:eastAsia="Times New Roman" w:hAnsi="Times New Roman" w:cs="Times New Roman"/>
+          <w:sz w:val="20"/>
+        </w:rPr>
+        <w:t>isključivo</w:t>
+      </w:r>
+      <w:proofErr w:type="spellEnd"/>
+      <w:r>
+        <w:rPr>
+          <w:rFonts w:ascii="Times New Roman" w:eastAsia="Times New Roman" w:hAnsi="Times New Roman" w:cs="Times New Roman"/>
+          <w:sz w:val="20"/>
+        </w:rPr>
+        <w:t xml:space="preserve"> </w:t>
+      </w:r>
+      <w:proofErr w:type="spellStart"/>
+      <w:r>
+        <w:rPr>
+          <w:rFonts w:ascii="Times New Roman" w:eastAsia="Times New Roman" w:hAnsi="Times New Roman" w:cs="Times New Roman"/>
+          <w:sz w:val="20"/>
+        </w:rPr>
+        <w:t>ovlašćenim</w:t>
+      </w:r>
+      <w:proofErr w:type="spellEnd"/>
+      <w:r>
+        <w:rPr>
+          <w:rFonts w:ascii="Times New Roman" w:eastAsia="Times New Roman" w:hAnsi="Times New Roman" w:cs="Times New Roman"/>
+          <w:sz w:val="20"/>
+        </w:rPr>
+        <w:t xml:space="preserve"> </w:t>
+      </w:r>
+      <w:proofErr w:type="spellStart"/>
+      <w:r>
+        <w:rPr>
+          <w:rFonts w:ascii="Times New Roman" w:eastAsia="Times New Roman" w:hAnsi="Times New Roman" w:cs="Times New Roman"/>
+          <w:sz w:val="20"/>
+        </w:rPr>
+        <w:t>korisnicima</w:t>
+      </w:r>
+      <w:proofErr w:type="spellEnd"/>
+      <w:r>
+        <w:rPr>
+          <w:rFonts w:ascii="Times New Roman" w:eastAsia="Times New Roman" w:hAnsi="Times New Roman" w:cs="Times New Roman"/>
+          <w:sz w:val="20"/>
+        </w:rPr>
+        <w:t>.</w:t>
       </w:r>
     </w:p>
     <w:p>
@@ -2968,9 +4480,17 @@
         <w:rPr>
           <w:u w:val="single" w:color="000000"/>
         </w:rPr>
-        <w:t>Tok dogadjaja</w:t>
+        <w:t xml:space="preserve">Tok </w:t>
+      </w:r>
+      <w:proofErr w:type="spellStart"/>
+      <w:r>
+        <w:rPr>
+          <w:u w:val="single" w:color="000000"/>
+        </w:rPr>
+        <w:t>dogadjaja</w:t>
       </w:r>
       <w:bookmarkEnd w:id="8"/>
+      <w:proofErr w:type="spellEnd"/>
       <w:r>
         <w:t xml:space="preserve"> </w:t>
       </w:r>
@@ -2985,8 +4505,30 @@
         <w:rPr>
           <w:i/>
         </w:rPr>
-        <w:t>Administrator uklanja sliku</w:t>
-      </w:r>
+        <w:t xml:space="preserve">Administrator </w:t>
+      </w:r>
+      <w:proofErr w:type="spellStart"/>
+      <w:r>
+        <w:rPr>
+          <w:i/>
+        </w:rPr>
+        <w:t>uklanja</w:t>
+      </w:r>
+      <w:proofErr w:type="spellEnd"/>
+      <w:r>
+        <w:rPr>
+          <w:i/>
+        </w:rPr>
+        <w:t xml:space="preserve"> </w:t>
+      </w:r>
+      <w:proofErr w:type="spellStart"/>
+      <w:r>
+        <w:rPr>
+          <w:i/>
+        </w:rPr>
+        <w:t>sliku</w:t>
+      </w:r>
+      <w:proofErr w:type="spellEnd"/>
     </w:p>
     <w:p>
       <w:pPr>
@@ -3007,7 +4549,55 @@
           <w:rFonts w:ascii="Times New Roman" w:eastAsia="Times New Roman" w:hAnsi="Times New Roman" w:cs="Times New Roman"/>
           <w:sz w:val="20"/>
         </w:rPr>
-        <w:t>Administrator pristupa administratorskom panelu.</w:t>
+        <w:t xml:space="preserve">Administrator </w:t>
+      </w:r>
+      <w:proofErr w:type="spellStart"/>
+      <w:r>
+        <w:rPr>
+          <w:rFonts w:ascii="Times New Roman" w:eastAsia="Times New Roman" w:hAnsi="Times New Roman" w:cs="Times New Roman"/>
+          <w:sz w:val="20"/>
+        </w:rPr>
+        <w:t>pristupa</w:t>
+      </w:r>
+      <w:proofErr w:type="spellEnd"/>
+      <w:r>
+        <w:rPr>
+          <w:rFonts w:ascii="Times New Roman" w:eastAsia="Times New Roman" w:hAnsi="Times New Roman" w:cs="Times New Roman"/>
+          <w:sz w:val="20"/>
+        </w:rPr>
+        <w:t xml:space="preserve"> </w:t>
+      </w:r>
+      <w:proofErr w:type="spellStart"/>
+      <w:r>
+        <w:rPr>
+          <w:rFonts w:ascii="Times New Roman" w:eastAsia="Times New Roman" w:hAnsi="Times New Roman" w:cs="Times New Roman"/>
+          <w:sz w:val="20"/>
+        </w:rPr>
+        <w:t>administratorskom</w:t>
+      </w:r>
+      <w:proofErr w:type="spellEnd"/>
+      <w:r>
+        <w:rPr>
+          <w:rFonts w:ascii="Times New Roman" w:eastAsia="Times New Roman" w:hAnsi="Times New Roman" w:cs="Times New Roman"/>
+          <w:sz w:val="20"/>
+        </w:rPr>
+        <w:t xml:space="preserve"> </w:t>
+      </w:r>
+      <w:proofErr w:type="spellStart"/>
+      <w:r>
+        <w:rPr>
+          <w:rFonts w:ascii="Times New Roman" w:eastAsia="Times New Roman" w:hAnsi="Times New Roman" w:cs="Times New Roman"/>
+          <w:sz w:val="20"/>
+        </w:rPr>
+        <w:t>panelu</w:t>
+      </w:r>
+      <w:proofErr w:type="spellEnd"/>
+      <w:r>
+        <w:rPr>
+          <w:rFonts w:ascii="Times New Roman" w:eastAsia="Times New Roman" w:hAnsi="Times New Roman" w:cs="Times New Roman"/>
+          <w:sz w:val="20"/>
+        </w:rPr>
+        <w:t>.</w:t>
       </w:r>
     </w:p>
     <w:p>
@@ -3029,7 +4619,103 @@
           <w:rFonts w:ascii="Times New Roman" w:eastAsia="Times New Roman" w:hAnsi="Times New Roman" w:cs="Times New Roman"/>
           <w:sz w:val="20"/>
         </w:rPr>
-        <w:t>Administrator navigira do liste svih slika na platformi.</w:t>
+        <w:t xml:space="preserve">Administrator </w:t>
+      </w:r>
+      <w:proofErr w:type="spellStart"/>
+      <w:r>
+        <w:rPr>
+          <w:rFonts w:ascii="Times New Roman" w:eastAsia="Times New Roman" w:hAnsi="Times New Roman" w:cs="Times New Roman"/>
+          <w:sz w:val="20"/>
+        </w:rPr>
+        <w:t>navigira</w:t>
+      </w:r>
+      <w:proofErr w:type="spellEnd"/>
+      <w:r>
+        <w:rPr>
+          <w:rFonts w:ascii="Times New Roman" w:eastAsia="Times New Roman" w:hAnsi="Times New Roman" w:cs="Times New Roman"/>
+          <w:sz w:val="20"/>
+        </w:rPr>
+        <w:t xml:space="preserve"> do </w:t>
+      </w:r>
+      <w:proofErr w:type="spellStart"/>
+      <w:r>
+        <w:rPr>
+          <w:rFonts w:ascii="Times New Roman" w:eastAsia="Times New Roman" w:hAnsi="Times New Roman" w:cs="Times New Roman"/>
+          <w:sz w:val="20"/>
+        </w:rPr>
+        <w:t>liste</w:t>
+      </w:r>
+      <w:proofErr w:type="spellEnd"/>
+      <w:r>
+        <w:rPr>
+          <w:rFonts w:ascii="Times New Roman" w:eastAsia="Times New Roman" w:hAnsi="Times New Roman" w:cs="Times New Roman"/>
+          <w:sz w:val="20"/>
+        </w:rPr>
+        <w:t xml:space="preserve"> </w:t>
+      </w:r>
+      <w:proofErr w:type="spellStart"/>
+      <w:r>
+        <w:rPr>
+          <w:rFonts w:ascii="Times New Roman" w:eastAsia="Times New Roman" w:hAnsi="Times New Roman" w:cs="Times New Roman"/>
+          <w:sz w:val="20"/>
+        </w:rPr>
+        <w:t>svih</w:t>
+      </w:r>
+      <w:proofErr w:type="spellEnd"/>
+      <w:r>
+        <w:rPr>
+          <w:rFonts w:ascii="Times New Roman" w:eastAsia="Times New Roman" w:hAnsi="Times New Roman" w:cs="Times New Roman"/>
+          <w:sz w:val="20"/>
+        </w:rPr>
+        <w:t xml:space="preserve"> </w:t>
+      </w:r>
+      <w:proofErr w:type="spellStart"/>
+      <w:r>
+        <w:rPr>
+          <w:rFonts w:ascii="Times New Roman" w:eastAsia="Times New Roman" w:hAnsi="Times New Roman" w:cs="Times New Roman"/>
+          <w:sz w:val="20"/>
+        </w:rPr>
+        <w:t>slika</w:t>
+      </w:r>
+      <w:proofErr w:type="spellEnd"/>
+      <w:r>
+        <w:rPr>
+          <w:rFonts w:ascii="Times New Roman" w:eastAsia="Times New Roman" w:hAnsi="Times New Roman" w:cs="Times New Roman"/>
+          <w:sz w:val="20"/>
+        </w:rPr>
+        <w:t xml:space="preserve"> </w:t>
+      </w:r>
+      <w:proofErr w:type="spellStart"/>
+      <w:r>
+        <w:rPr>
+          <w:rFonts w:ascii="Times New Roman" w:eastAsia="Times New Roman" w:hAnsi="Times New Roman" w:cs="Times New Roman"/>
+          <w:sz w:val="20"/>
+        </w:rPr>
+        <w:t>na</w:t>
+      </w:r>
+      <w:proofErr w:type="spellEnd"/>
+      <w:r>
+        <w:rPr>
+          <w:rFonts w:ascii="Times New Roman" w:eastAsia="Times New Roman" w:hAnsi="Times New Roman" w:cs="Times New Roman"/>
+          <w:sz w:val="20"/>
+        </w:rPr>
+        <w:t xml:space="preserve"> </w:t>
+      </w:r>
+      <w:proofErr w:type="spellStart"/>
+      <w:r>
+        <w:rPr>
+          <w:rFonts w:ascii="Times New Roman" w:eastAsia="Times New Roman" w:hAnsi="Times New Roman" w:cs="Times New Roman"/>
+          <w:sz w:val="20"/>
+        </w:rPr>
+        <w:t>platformi</w:t>
+      </w:r>
+      <w:proofErr w:type="spellEnd"/>
+      <w:r>
+        <w:rPr>
+          <w:rFonts w:ascii="Times New Roman" w:eastAsia="Times New Roman" w:hAnsi="Times New Roman" w:cs="Times New Roman"/>
+          <w:sz w:val="20"/>
+        </w:rPr>
+        <w:t>.</w:t>
       </w:r>
     </w:p>
     <w:p>
@@ -3051,7 +4737,103 @@
           <w:rFonts w:ascii="Times New Roman" w:eastAsia="Times New Roman" w:hAnsi="Times New Roman" w:cs="Times New Roman"/>
           <w:sz w:val="20"/>
         </w:rPr>
-        <w:t>Administrator pronalazi sliku koja treba biti uklonjena.</w:t>
+        <w:t xml:space="preserve">Administrator </w:t>
+      </w:r>
+      <w:proofErr w:type="spellStart"/>
+      <w:r>
+        <w:rPr>
+          <w:rFonts w:ascii="Times New Roman" w:eastAsia="Times New Roman" w:hAnsi="Times New Roman" w:cs="Times New Roman"/>
+          <w:sz w:val="20"/>
+        </w:rPr>
+        <w:t>pronalazi</w:t>
+      </w:r>
+      <w:proofErr w:type="spellEnd"/>
+      <w:r>
+        <w:rPr>
+          <w:rFonts w:ascii="Times New Roman" w:eastAsia="Times New Roman" w:hAnsi="Times New Roman" w:cs="Times New Roman"/>
+          <w:sz w:val="20"/>
+        </w:rPr>
+        <w:t xml:space="preserve"> </w:t>
+      </w:r>
+      <w:proofErr w:type="spellStart"/>
+      <w:r>
+        <w:rPr>
+          <w:rFonts w:ascii="Times New Roman" w:eastAsia="Times New Roman" w:hAnsi="Times New Roman" w:cs="Times New Roman"/>
+          <w:sz w:val="20"/>
+        </w:rPr>
+        <w:t>sliku</w:t>
+      </w:r>
+      <w:proofErr w:type="spellEnd"/>
+      <w:r>
+        <w:rPr>
+          <w:rFonts w:ascii="Times New Roman" w:eastAsia="Times New Roman" w:hAnsi="Times New Roman" w:cs="Times New Roman"/>
+          <w:sz w:val="20"/>
+        </w:rPr>
+        <w:t xml:space="preserve"> </w:t>
+      </w:r>
+      <w:proofErr w:type="spellStart"/>
+      <w:r>
+        <w:rPr>
+          <w:rFonts w:ascii="Times New Roman" w:eastAsia="Times New Roman" w:hAnsi="Times New Roman" w:cs="Times New Roman"/>
+          <w:sz w:val="20"/>
+        </w:rPr>
+        <w:t>koja</w:t>
+      </w:r>
+      <w:proofErr w:type="spellEnd"/>
+      <w:r>
+        <w:rPr>
+          <w:rFonts w:ascii="Times New Roman" w:eastAsia="Times New Roman" w:hAnsi="Times New Roman" w:cs="Times New Roman"/>
+          <w:sz w:val="20"/>
+        </w:rPr>
+        <w:t xml:space="preserve"> </w:t>
+      </w:r>
+      <w:proofErr w:type="spellStart"/>
+      <w:r>
+        <w:rPr>
+          <w:rFonts w:ascii="Times New Roman" w:eastAsia="Times New Roman" w:hAnsi="Times New Roman" w:cs="Times New Roman"/>
+          <w:sz w:val="20"/>
+        </w:rPr>
+        <w:t>treba</w:t>
+      </w:r>
+      <w:proofErr w:type="spellEnd"/>
+      <w:r>
+        <w:rPr>
+          <w:rFonts w:ascii="Times New Roman" w:eastAsia="Times New Roman" w:hAnsi="Times New Roman" w:cs="Times New Roman"/>
+          <w:sz w:val="20"/>
+        </w:rPr>
+        <w:t xml:space="preserve"> </w:t>
+      </w:r>
+      <w:proofErr w:type="spellStart"/>
+      <w:r>
+        <w:rPr>
+          <w:rFonts w:ascii="Times New Roman" w:eastAsia="Times New Roman" w:hAnsi="Times New Roman" w:cs="Times New Roman"/>
+          <w:sz w:val="20"/>
+        </w:rPr>
+        <w:t>biti</w:t>
+      </w:r>
+      <w:proofErr w:type="spellEnd"/>
+      <w:r>
+        <w:rPr>
+          <w:rFonts w:ascii="Times New Roman" w:eastAsia="Times New Roman" w:hAnsi="Times New Roman" w:cs="Times New Roman"/>
+          <w:sz w:val="20"/>
+        </w:rPr>
+        <w:t xml:space="preserve"> </w:t>
+      </w:r>
+      <w:proofErr w:type="spellStart"/>
+      <w:r>
+        <w:rPr>
+          <w:rFonts w:ascii="Times New Roman" w:eastAsia="Times New Roman" w:hAnsi="Times New Roman" w:cs="Times New Roman"/>
+          <w:sz w:val="20"/>
+        </w:rPr>
+        <w:t>uklonjena</w:t>
+      </w:r>
+      <w:proofErr w:type="spellEnd"/>
+      <w:r>
+        <w:rPr>
+          <w:rFonts w:ascii="Times New Roman" w:eastAsia="Times New Roman" w:hAnsi="Times New Roman" w:cs="Times New Roman"/>
+          <w:sz w:val="20"/>
+        </w:rPr>
+        <w:t>.</w:t>
       </w:r>
     </w:p>
     <w:p>
@@ -3073,7 +4855,135 @@
           <w:rFonts w:ascii="Times New Roman" w:eastAsia="Times New Roman" w:hAnsi="Times New Roman" w:cs="Times New Roman"/>
           <w:sz w:val="20"/>
         </w:rPr>
-        <w:t>Pored slike se nalazi opcija "Ukloni" (ili ikonica kante za smeće).</w:t>
+        <w:t xml:space="preserve">Pored </w:t>
+      </w:r>
+      <w:proofErr w:type="spellStart"/>
+      <w:r>
+        <w:rPr>
+          <w:rFonts w:ascii="Times New Roman" w:eastAsia="Times New Roman" w:hAnsi="Times New Roman" w:cs="Times New Roman"/>
+          <w:sz w:val="20"/>
+        </w:rPr>
+        <w:t>slike</w:t>
+      </w:r>
+      <w:proofErr w:type="spellEnd"/>
+      <w:r>
+        <w:rPr>
+          <w:rFonts w:ascii="Times New Roman" w:eastAsia="Times New Roman" w:hAnsi="Times New Roman" w:cs="Times New Roman"/>
+          <w:sz w:val="20"/>
+        </w:rPr>
+        <w:t xml:space="preserve"> se </w:t>
+      </w:r>
+      <w:proofErr w:type="spellStart"/>
+      <w:r>
+        <w:rPr>
+          <w:rFonts w:ascii="Times New Roman" w:eastAsia="Times New Roman" w:hAnsi="Times New Roman" w:cs="Times New Roman"/>
+          <w:sz w:val="20"/>
+        </w:rPr>
+        <w:t>nalazi</w:t>
+      </w:r>
+      <w:proofErr w:type="spellEnd"/>
+      <w:r>
+        <w:rPr>
+          <w:rFonts w:ascii="Times New Roman" w:eastAsia="Times New Roman" w:hAnsi="Times New Roman" w:cs="Times New Roman"/>
+          <w:sz w:val="20"/>
+        </w:rPr>
+        <w:t xml:space="preserve"> </w:t>
+      </w:r>
+      <w:proofErr w:type="spellStart"/>
+      <w:r>
+        <w:rPr>
+          <w:rFonts w:ascii="Times New Roman" w:eastAsia="Times New Roman" w:hAnsi="Times New Roman" w:cs="Times New Roman"/>
+          <w:sz w:val="20"/>
+        </w:rPr>
+        <w:t>opcija</w:t>
+      </w:r>
+      <w:proofErr w:type="spellEnd"/>
+      <w:r>
+        <w:rPr>
+          <w:rFonts w:ascii="Times New Roman" w:eastAsia="Times New Roman" w:hAnsi="Times New Roman" w:cs="Times New Roman"/>
+          <w:sz w:val="20"/>
+        </w:rPr>
+        <w:t xml:space="preserve"> "</w:t>
+      </w:r>
+      <w:proofErr w:type="spellStart"/>
+      <w:r>
+        <w:rPr>
+          <w:rFonts w:ascii="Times New Roman" w:eastAsia="Times New Roman" w:hAnsi="Times New Roman" w:cs="Times New Roman"/>
+          <w:sz w:val="20"/>
+        </w:rPr>
+        <w:t>Ukloni</w:t>
+      </w:r>
+      <w:proofErr w:type="spellEnd"/>
+      <w:r>
+        <w:rPr>
+          <w:rFonts w:ascii="Times New Roman" w:eastAsia="Times New Roman" w:hAnsi="Times New Roman" w:cs="Times New Roman"/>
+          <w:sz w:val="20"/>
+        </w:rPr>
+        <w:t>" (</w:t>
+      </w:r>
+      <w:proofErr w:type="spellStart"/>
+      <w:r>
+        <w:rPr>
+          <w:rFonts w:ascii="Times New Roman" w:eastAsia="Times New Roman" w:hAnsi="Times New Roman" w:cs="Times New Roman"/>
+          <w:sz w:val="20"/>
+        </w:rPr>
+        <w:t>ili</w:t>
+      </w:r>
+      <w:proofErr w:type="spellEnd"/>
+      <w:r>
+        <w:rPr>
+          <w:rFonts w:ascii="Times New Roman" w:eastAsia="Times New Roman" w:hAnsi="Times New Roman" w:cs="Times New Roman"/>
+          <w:sz w:val="20"/>
+        </w:rPr>
+        <w:t xml:space="preserve"> </w:t>
+      </w:r>
+      <w:proofErr w:type="spellStart"/>
+      <w:r>
+        <w:rPr>
+          <w:rFonts w:ascii="Times New Roman" w:eastAsia="Times New Roman" w:hAnsi="Times New Roman" w:cs="Times New Roman"/>
+          <w:sz w:val="20"/>
+        </w:rPr>
+        <w:t>ikonica</w:t>
+      </w:r>
+      <w:proofErr w:type="spellEnd"/>
+      <w:r>
+        <w:rPr>
+          <w:rFonts w:ascii="Times New Roman" w:eastAsia="Times New Roman" w:hAnsi="Times New Roman" w:cs="Times New Roman"/>
+          <w:sz w:val="20"/>
+        </w:rPr>
+        <w:t xml:space="preserve"> </w:t>
+      </w:r>
+      <w:proofErr w:type="spellStart"/>
+      <w:r>
+        <w:rPr>
+          <w:rFonts w:ascii="Times New Roman" w:eastAsia="Times New Roman" w:hAnsi="Times New Roman" w:cs="Times New Roman"/>
+          <w:sz w:val="20"/>
+        </w:rPr>
+        <w:t>kante</w:t>
+      </w:r>
+      <w:proofErr w:type="spellEnd"/>
+      <w:r>
+        <w:rPr>
+          <w:rFonts w:ascii="Times New Roman" w:eastAsia="Times New Roman" w:hAnsi="Times New Roman" w:cs="Times New Roman"/>
+          <w:sz w:val="20"/>
+        </w:rPr>
+        <w:t xml:space="preserve"> za </w:t>
+      </w:r>
+      <w:proofErr w:type="spellStart"/>
+      <w:r>
+        <w:rPr>
+          <w:rFonts w:ascii="Times New Roman" w:eastAsia="Times New Roman" w:hAnsi="Times New Roman" w:cs="Times New Roman"/>
+          <w:sz w:val="20"/>
+        </w:rPr>
+        <w:t>smeće</w:t>
+      </w:r>
+      <w:proofErr w:type="spellEnd"/>
+      <w:r>
+        <w:rPr>
+          <w:rFonts w:ascii="Times New Roman" w:eastAsia="Times New Roman" w:hAnsi="Times New Roman" w:cs="Times New Roman"/>
+          <w:sz w:val="20"/>
+        </w:rPr>
+        <w:t>).</w:t>
       </w:r>
     </w:p>
     <w:p>
@@ -3091,21 +5001,263 @@
           <w:rFonts w:ascii="Times New Roman" w:eastAsia="Times New Roman" w:hAnsi="Times New Roman" w:cs="Times New Roman"/>
           <w:sz w:val="20"/>
         </w:rPr>
-        <w:t>Administrator klikne na opciju "Ukloni"</w:t>
-      </w:r>
-      <w:r>
-        <w:rPr>
-          <w:rFonts w:ascii="Times New Roman" w:eastAsia="Times New Roman" w:hAnsi="Times New Roman" w:cs="Times New Roman"/>
-          <w:sz w:val="20"/>
-        </w:rPr>
-        <w:t xml:space="preserve"> I p</w:t>
-      </w:r>
-      <w:r>
-        <w:rPr>
-          <w:rFonts w:ascii="Times New Roman" w:eastAsia="Times New Roman" w:hAnsi="Times New Roman" w:cs="Times New Roman"/>
-          <w:sz w:val="20"/>
-        </w:rPr>
-        <w:t>rikazuje se dijaloški prozor za potvrdu sa pitanjem "Da li ste sigurni da želite da uklonite ovu sliku?".</w:t>
+        <w:t xml:space="preserve">Administrator </w:t>
+      </w:r>
+      <w:proofErr w:type="spellStart"/>
+      <w:r>
+        <w:rPr>
+          <w:rFonts w:ascii="Times New Roman" w:eastAsia="Times New Roman" w:hAnsi="Times New Roman" w:cs="Times New Roman"/>
+          <w:sz w:val="20"/>
+        </w:rPr>
+        <w:t>klikne</w:t>
+      </w:r>
+      <w:proofErr w:type="spellEnd"/>
+      <w:r>
+        <w:rPr>
+          <w:rFonts w:ascii="Times New Roman" w:eastAsia="Times New Roman" w:hAnsi="Times New Roman" w:cs="Times New Roman"/>
+          <w:sz w:val="20"/>
+        </w:rPr>
+        <w:t xml:space="preserve"> </w:t>
+      </w:r>
+      <w:proofErr w:type="spellStart"/>
+      <w:r>
+        <w:rPr>
+          <w:rFonts w:ascii="Times New Roman" w:eastAsia="Times New Roman" w:hAnsi="Times New Roman" w:cs="Times New Roman"/>
+          <w:sz w:val="20"/>
+        </w:rPr>
+        <w:t>na</w:t>
+      </w:r>
+      <w:proofErr w:type="spellEnd"/>
+      <w:r>
+        <w:rPr>
+          <w:rFonts w:ascii="Times New Roman" w:eastAsia="Times New Roman" w:hAnsi="Times New Roman" w:cs="Times New Roman"/>
+          <w:sz w:val="20"/>
+        </w:rPr>
+        <w:t xml:space="preserve"> </w:t>
+      </w:r>
+      <w:proofErr w:type="spellStart"/>
+      <w:r>
+        <w:rPr>
+          <w:rFonts w:ascii="Times New Roman" w:eastAsia="Times New Roman" w:hAnsi="Times New Roman" w:cs="Times New Roman"/>
+          <w:sz w:val="20"/>
+        </w:rPr>
+        <w:t>opciju</w:t>
+      </w:r>
+      <w:proofErr w:type="spellEnd"/>
+      <w:r>
+        <w:rPr>
+          <w:rFonts w:ascii="Times New Roman" w:eastAsia="Times New Roman" w:hAnsi="Times New Roman" w:cs="Times New Roman"/>
+          <w:sz w:val="20"/>
+        </w:rPr>
+        <w:t xml:space="preserve"> "</w:t>
+      </w:r>
+      <w:proofErr w:type="spellStart"/>
+      <w:r>
+        <w:rPr>
+          <w:rFonts w:ascii="Times New Roman" w:eastAsia="Times New Roman" w:hAnsi="Times New Roman" w:cs="Times New Roman"/>
+          <w:sz w:val="20"/>
+        </w:rPr>
+        <w:t>Ukloni</w:t>
+      </w:r>
+      <w:proofErr w:type="spellEnd"/>
+      <w:r>
+        <w:rPr>
+          <w:rFonts w:ascii="Times New Roman" w:eastAsia="Times New Roman" w:hAnsi="Times New Roman" w:cs="Times New Roman"/>
+          <w:sz w:val="20"/>
+        </w:rPr>
+        <w:t xml:space="preserve">" I </w:t>
+      </w:r>
+      <w:proofErr w:type="spellStart"/>
+      <w:r>
+        <w:rPr>
+          <w:rFonts w:ascii="Times New Roman" w:eastAsia="Times New Roman" w:hAnsi="Times New Roman" w:cs="Times New Roman"/>
+          <w:sz w:val="20"/>
+        </w:rPr>
+        <w:t>prikazuje</w:t>
+      </w:r>
+      <w:proofErr w:type="spellEnd"/>
+      <w:r>
+        <w:rPr>
+          <w:rFonts w:ascii="Times New Roman" w:eastAsia="Times New Roman" w:hAnsi="Times New Roman" w:cs="Times New Roman"/>
+          <w:sz w:val="20"/>
+        </w:rPr>
+        <w:t xml:space="preserve"> se </w:t>
+      </w:r>
+      <w:proofErr w:type="spellStart"/>
+      <w:r>
+        <w:rPr>
+          <w:rFonts w:ascii="Times New Roman" w:eastAsia="Times New Roman" w:hAnsi="Times New Roman" w:cs="Times New Roman"/>
+          <w:sz w:val="20"/>
+        </w:rPr>
+        <w:t>dijaloški</w:t>
+      </w:r>
+      <w:proofErr w:type="spellEnd"/>
+      <w:r>
+        <w:rPr>
+          <w:rFonts w:ascii="Times New Roman" w:eastAsia="Times New Roman" w:hAnsi="Times New Roman" w:cs="Times New Roman"/>
+          <w:sz w:val="20"/>
+        </w:rPr>
+        <w:t xml:space="preserve"> </w:t>
+      </w:r>
+      <w:proofErr w:type="spellStart"/>
+      <w:r>
+        <w:rPr>
+          <w:rFonts w:ascii="Times New Roman" w:eastAsia="Times New Roman" w:hAnsi="Times New Roman" w:cs="Times New Roman"/>
+          <w:sz w:val="20"/>
+        </w:rPr>
+        <w:t>prozor</w:t>
+      </w:r>
+      <w:proofErr w:type="spellEnd"/>
+      <w:r>
+        <w:rPr>
+          <w:rFonts w:ascii="Times New Roman" w:eastAsia="Times New Roman" w:hAnsi="Times New Roman" w:cs="Times New Roman"/>
+          <w:sz w:val="20"/>
+        </w:rPr>
+        <w:t xml:space="preserve"> za </w:t>
+      </w:r>
+      <w:proofErr w:type="spellStart"/>
+      <w:r>
+        <w:rPr>
+          <w:rFonts w:ascii="Times New Roman" w:eastAsia="Times New Roman" w:hAnsi="Times New Roman" w:cs="Times New Roman"/>
+          <w:sz w:val="20"/>
+        </w:rPr>
+        <w:t>potvrdu</w:t>
+      </w:r>
+      <w:proofErr w:type="spellEnd"/>
+      <w:r>
+        <w:rPr>
+          <w:rFonts w:ascii="Times New Roman" w:eastAsia="Times New Roman" w:hAnsi="Times New Roman" w:cs="Times New Roman"/>
+          <w:sz w:val="20"/>
+        </w:rPr>
+        <w:t xml:space="preserve"> </w:t>
+      </w:r>
+      <w:proofErr w:type="spellStart"/>
+      <w:r>
+        <w:rPr>
+          <w:rFonts w:ascii="Times New Roman" w:eastAsia="Times New Roman" w:hAnsi="Times New Roman" w:cs="Times New Roman"/>
+          <w:sz w:val="20"/>
+        </w:rPr>
+        <w:t>sa</w:t>
+      </w:r>
+      <w:proofErr w:type="spellEnd"/>
+      <w:r>
+        <w:rPr>
+          <w:rFonts w:ascii="Times New Roman" w:eastAsia="Times New Roman" w:hAnsi="Times New Roman" w:cs="Times New Roman"/>
+          <w:sz w:val="20"/>
+        </w:rPr>
+        <w:t xml:space="preserve"> </w:t>
+      </w:r>
+      <w:proofErr w:type="spellStart"/>
+      <w:r>
+        <w:rPr>
+          <w:rFonts w:ascii="Times New Roman" w:eastAsia="Times New Roman" w:hAnsi="Times New Roman" w:cs="Times New Roman"/>
+          <w:sz w:val="20"/>
+        </w:rPr>
+        <w:t>pitanjem</w:t>
+      </w:r>
+      <w:proofErr w:type="spellEnd"/>
+      <w:r>
+        <w:rPr>
+          <w:rFonts w:ascii="Times New Roman" w:eastAsia="Times New Roman" w:hAnsi="Times New Roman" w:cs="Times New Roman"/>
+          <w:sz w:val="20"/>
+        </w:rPr>
+        <w:t xml:space="preserve"> "Da li </w:t>
+      </w:r>
+      <w:proofErr w:type="spellStart"/>
+      <w:r>
+        <w:rPr>
+          <w:rFonts w:ascii="Times New Roman" w:eastAsia="Times New Roman" w:hAnsi="Times New Roman" w:cs="Times New Roman"/>
+          <w:sz w:val="20"/>
+        </w:rPr>
+        <w:t>ste</w:t>
+      </w:r>
+      <w:proofErr w:type="spellEnd"/>
+      <w:r>
+        <w:rPr>
+          <w:rFonts w:ascii="Times New Roman" w:eastAsia="Times New Roman" w:hAnsi="Times New Roman" w:cs="Times New Roman"/>
+          <w:sz w:val="20"/>
+        </w:rPr>
+        <w:t xml:space="preserve"> </w:t>
+      </w:r>
+      <w:proofErr w:type="spellStart"/>
+      <w:r>
+        <w:rPr>
+          <w:rFonts w:ascii="Times New Roman" w:eastAsia="Times New Roman" w:hAnsi="Times New Roman" w:cs="Times New Roman"/>
+          <w:sz w:val="20"/>
+        </w:rPr>
+        <w:t>sigurni</w:t>
+      </w:r>
+      <w:proofErr w:type="spellEnd"/>
+      <w:r>
+        <w:rPr>
+          <w:rFonts w:ascii="Times New Roman" w:eastAsia="Times New Roman" w:hAnsi="Times New Roman" w:cs="Times New Roman"/>
+          <w:sz w:val="20"/>
+        </w:rPr>
+        <w:t xml:space="preserve"> da </w:t>
+      </w:r>
+      <w:proofErr w:type="spellStart"/>
+      <w:r>
+        <w:rPr>
+          <w:rFonts w:ascii="Times New Roman" w:eastAsia="Times New Roman" w:hAnsi="Times New Roman" w:cs="Times New Roman"/>
+          <w:sz w:val="20"/>
+        </w:rPr>
+        <w:t>želite</w:t>
+      </w:r>
+      <w:proofErr w:type="spellEnd"/>
+      <w:r>
+        <w:rPr>
+          <w:rFonts w:ascii="Times New Roman" w:eastAsia="Times New Roman" w:hAnsi="Times New Roman" w:cs="Times New Roman"/>
+          <w:sz w:val="20"/>
+        </w:rPr>
+        <w:t xml:space="preserve"> da </w:t>
+      </w:r>
+      <w:proofErr w:type="spellStart"/>
+      <w:r>
+        <w:rPr>
+          <w:rFonts w:ascii="Times New Roman" w:eastAsia="Times New Roman" w:hAnsi="Times New Roman" w:cs="Times New Roman"/>
+          <w:sz w:val="20"/>
+        </w:rPr>
+        <w:t>uklonite</w:t>
+      </w:r>
+      <w:proofErr w:type="spellEnd"/>
+      <w:r>
+        <w:rPr>
+          <w:rFonts w:ascii="Times New Roman" w:eastAsia="Times New Roman" w:hAnsi="Times New Roman" w:cs="Times New Roman"/>
+          <w:sz w:val="20"/>
+        </w:rPr>
+        <w:t xml:space="preserve"> </w:t>
+      </w:r>
+      <w:proofErr w:type="spellStart"/>
+      <w:r>
+        <w:rPr>
+          <w:rFonts w:ascii="Times New Roman" w:eastAsia="Times New Roman" w:hAnsi="Times New Roman" w:cs="Times New Roman"/>
+          <w:sz w:val="20"/>
+        </w:rPr>
+        <w:t>ovu</w:t>
+      </w:r>
+      <w:proofErr w:type="spellEnd"/>
+      <w:r>
+        <w:rPr>
+          <w:rFonts w:ascii="Times New Roman" w:eastAsia="Times New Roman" w:hAnsi="Times New Roman" w:cs="Times New Roman"/>
+          <w:sz w:val="20"/>
+        </w:rPr>
+        <w:t xml:space="preserve"> </w:t>
+      </w:r>
+      <w:proofErr w:type="spellStart"/>
+      <w:r>
+        <w:rPr>
+          <w:rFonts w:ascii="Times New Roman" w:eastAsia="Times New Roman" w:hAnsi="Times New Roman" w:cs="Times New Roman"/>
+          <w:sz w:val="20"/>
+        </w:rPr>
+        <w:t>sliku</w:t>
+      </w:r>
+      <w:proofErr w:type="spellEnd"/>
+      <w:r>
+        <w:rPr>
+          <w:rFonts w:ascii="Times New Roman" w:eastAsia="Times New Roman" w:hAnsi="Times New Roman" w:cs="Times New Roman"/>
+          <w:sz w:val="20"/>
+        </w:rPr>
+        <w:t>?".</w:t>
       </w:r>
     </w:p>
     <w:p>
@@ -3123,42 +5275,309 @@
           <w:rFonts w:ascii="Times New Roman" w:eastAsia="Times New Roman" w:hAnsi="Times New Roman" w:cs="Times New Roman"/>
           <w:sz w:val="20"/>
         </w:rPr>
-        <w:t>Administrator potvrđuje akciju</w:t>
-      </w:r>
-      <w:r>
-        <w:rPr>
-          <w:rFonts w:ascii="Times New Roman" w:eastAsia="Times New Roman" w:hAnsi="Times New Roman" w:cs="Times New Roman"/>
-          <w:sz w:val="20"/>
-        </w:rPr>
-        <w:t xml:space="preserve"> I time s</w:t>
-      </w:r>
-      <w:r>
-        <w:rPr>
-          <w:rFonts w:ascii="Times New Roman" w:eastAsia="Times New Roman" w:hAnsi="Times New Roman" w:cs="Times New Roman"/>
-          <w:sz w:val="20"/>
-        </w:rPr>
-        <w:t>istem trajno uklanja sliku iz baze podataka i sa servera za skladištenje.</w:t>
-      </w:r>
-      <w:r>
-        <w:rPr>
-          <w:rFonts w:ascii="Times New Roman" w:eastAsia="Times New Roman" w:hAnsi="Times New Roman" w:cs="Times New Roman"/>
-          <w:sz w:val="20"/>
-        </w:rPr>
-        <w:t xml:space="preserve"> </w:t>
-      </w:r>
-      <w:r>
-        <w:rPr>
-          <w:rFonts w:ascii="Times New Roman" w:eastAsia="Times New Roman" w:hAnsi="Times New Roman" w:cs="Times New Roman"/>
-          <w:sz w:val="20"/>
-        </w:rPr>
-        <w:t xml:space="preserve"> </w:t>
-      </w:r>
-      <w:r>
-        <w:rPr>
-          <w:rFonts w:ascii="Times New Roman" w:eastAsia="Times New Roman" w:hAnsi="Times New Roman" w:cs="Times New Roman"/>
-          <w:sz w:val="20"/>
-        </w:rPr>
-        <w:t>Prikazuje se poruka o uspešnom uklanjanju slike.</w:t>
+        <w:t xml:space="preserve">Administrator </w:t>
+      </w:r>
+      <w:proofErr w:type="spellStart"/>
+      <w:r>
+        <w:rPr>
+          <w:rFonts w:ascii="Times New Roman" w:eastAsia="Times New Roman" w:hAnsi="Times New Roman" w:cs="Times New Roman"/>
+          <w:sz w:val="20"/>
+        </w:rPr>
+        <w:t>potvrđuje</w:t>
+      </w:r>
+      <w:proofErr w:type="spellEnd"/>
+      <w:r>
+        <w:rPr>
+          <w:rFonts w:ascii="Times New Roman" w:eastAsia="Times New Roman" w:hAnsi="Times New Roman" w:cs="Times New Roman"/>
+          <w:sz w:val="20"/>
+        </w:rPr>
+        <w:t xml:space="preserve"> </w:t>
+      </w:r>
+      <w:proofErr w:type="spellStart"/>
+      <w:r>
+        <w:rPr>
+          <w:rFonts w:ascii="Times New Roman" w:eastAsia="Times New Roman" w:hAnsi="Times New Roman" w:cs="Times New Roman"/>
+          <w:sz w:val="20"/>
+        </w:rPr>
+        <w:t>akciju</w:t>
+      </w:r>
+      <w:proofErr w:type="spellEnd"/>
+      <w:r>
+        <w:rPr>
+          <w:rFonts w:ascii="Times New Roman" w:eastAsia="Times New Roman" w:hAnsi="Times New Roman" w:cs="Times New Roman"/>
+          <w:sz w:val="20"/>
+        </w:rPr>
+        <w:t xml:space="preserve"> I time </w:t>
+      </w:r>
+      <w:proofErr w:type="spellStart"/>
+      <w:r>
+        <w:rPr>
+          <w:rFonts w:ascii="Times New Roman" w:eastAsia="Times New Roman" w:hAnsi="Times New Roman" w:cs="Times New Roman"/>
+          <w:sz w:val="20"/>
+        </w:rPr>
+        <w:t>s</w:t>
+      </w:r>
+      <w:r>
+        <w:rPr>
+          <w:rFonts w:ascii="Times New Roman" w:eastAsia="Times New Roman" w:hAnsi="Times New Roman" w:cs="Times New Roman"/>
+          <w:sz w:val="20"/>
+        </w:rPr>
+        <w:t>istem</w:t>
+      </w:r>
+      <w:proofErr w:type="spellEnd"/>
+      <w:r>
+        <w:rPr>
+          <w:rFonts w:ascii="Times New Roman" w:eastAsia="Times New Roman" w:hAnsi="Times New Roman" w:cs="Times New Roman"/>
+          <w:sz w:val="20"/>
+        </w:rPr>
+        <w:t xml:space="preserve"> </w:t>
+      </w:r>
+      <w:proofErr w:type="spellStart"/>
+      <w:r>
+        <w:rPr>
+          <w:rFonts w:ascii="Times New Roman" w:eastAsia="Times New Roman" w:hAnsi="Times New Roman" w:cs="Times New Roman"/>
+          <w:sz w:val="20"/>
+        </w:rPr>
+        <w:t>trajno</w:t>
+      </w:r>
+      <w:proofErr w:type="spellEnd"/>
+      <w:r>
+        <w:rPr>
+          <w:rFonts w:ascii="Times New Roman" w:eastAsia="Times New Roman" w:hAnsi="Times New Roman" w:cs="Times New Roman"/>
+          <w:sz w:val="20"/>
+        </w:rPr>
+        <w:t xml:space="preserve"> </w:t>
+      </w:r>
+      <w:proofErr w:type="spellStart"/>
+      <w:r>
+        <w:rPr>
+          <w:rFonts w:ascii="Times New Roman" w:eastAsia="Times New Roman" w:hAnsi="Times New Roman" w:cs="Times New Roman"/>
+          <w:sz w:val="20"/>
+        </w:rPr>
+        <w:t>uklanja</w:t>
+      </w:r>
+      <w:proofErr w:type="spellEnd"/>
+      <w:r>
+        <w:rPr>
+          <w:rFonts w:ascii="Times New Roman" w:eastAsia="Times New Roman" w:hAnsi="Times New Roman" w:cs="Times New Roman"/>
+          <w:sz w:val="20"/>
+        </w:rPr>
+        <w:t xml:space="preserve"> </w:t>
+      </w:r>
+      <w:proofErr w:type="spellStart"/>
+      <w:r>
+        <w:rPr>
+          <w:rFonts w:ascii="Times New Roman" w:eastAsia="Times New Roman" w:hAnsi="Times New Roman" w:cs="Times New Roman"/>
+          <w:sz w:val="20"/>
+        </w:rPr>
+        <w:t>sliku</w:t>
+      </w:r>
+      <w:proofErr w:type="spellEnd"/>
+      <w:r>
+        <w:rPr>
+          <w:rFonts w:ascii="Times New Roman" w:eastAsia="Times New Roman" w:hAnsi="Times New Roman" w:cs="Times New Roman"/>
+          <w:sz w:val="20"/>
+        </w:rPr>
+        <w:t xml:space="preserve"> </w:t>
+      </w:r>
+      <w:proofErr w:type="spellStart"/>
+      <w:r>
+        <w:rPr>
+          <w:rFonts w:ascii="Times New Roman" w:eastAsia="Times New Roman" w:hAnsi="Times New Roman" w:cs="Times New Roman"/>
+          <w:sz w:val="20"/>
+        </w:rPr>
+        <w:t>iz</w:t>
+      </w:r>
+      <w:proofErr w:type="spellEnd"/>
+      <w:r>
+        <w:rPr>
+          <w:rFonts w:ascii="Times New Roman" w:eastAsia="Times New Roman" w:hAnsi="Times New Roman" w:cs="Times New Roman"/>
+          <w:sz w:val="20"/>
+        </w:rPr>
+        <w:t xml:space="preserve"> </w:t>
+      </w:r>
+      <w:proofErr w:type="spellStart"/>
+      <w:r>
+        <w:rPr>
+          <w:rFonts w:ascii="Times New Roman" w:eastAsia="Times New Roman" w:hAnsi="Times New Roman" w:cs="Times New Roman"/>
+          <w:sz w:val="20"/>
+        </w:rPr>
+        <w:t>baze</w:t>
+      </w:r>
+      <w:proofErr w:type="spellEnd"/>
+      <w:r>
+        <w:rPr>
+          <w:rFonts w:ascii="Times New Roman" w:eastAsia="Times New Roman" w:hAnsi="Times New Roman" w:cs="Times New Roman"/>
+          <w:sz w:val="20"/>
+        </w:rPr>
+        <w:t xml:space="preserve"> </w:t>
+      </w:r>
+      <w:proofErr w:type="spellStart"/>
+      <w:r>
+        <w:rPr>
+          <w:rFonts w:ascii="Times New Roman" w:eastAsia="Times New Roman" w:hAnsi="Times New Roman" w:cs="Times New Roman"/>
+          <w:sz w:val="20"/>
+        </w:rPr>
+        <w:t>podataka</w:t>
+      </w:r>
+      <w:proofErr w:type="spellEnd"/>
+      <w:r>
+        <w:rPr>
+          <w:rFonts w:ascii="Times New Roman" w:eastAsia="Times New Roman" w:hAnsi="Times New Roman" w:cs="Times New Roman"/>
+          <w:sz w:val="20"/>
+        </w:rPr>
+        <w:t xml:space="preserve"> </w:t>
+      </w:r>
+      <w:proofErr w:type="spellStart"/>
+      <w:r>
+        <w:rPr>
+          <w:rFonts w:ascii="Times New Roman" w:eastAsia="Times New Roman" w:hAnsi="Times New Roman" w:cs="Times New Roman"/>
+          <w:sz w:val="20"/>
+        </w:rPr>
+        <w:t>i</w:t>
+      </w:r>
+      <w:proofErr w:type="spellEnd"/>
+      <w:r>
+        <w:rPr>
+          <w:rFonts w:ascii="Times New Roman" w:eastAsia="Times New Roman" w:hAnsi="Times New Roman" w:cs="Times New Roman"/>
+          <w:sz w:val="20"/>
+        </w:rPr>
+        <w:t xml:space="preserve"> </w:t>
+      </w:r>
+      <w:proofErr w:type="spellStart"/>
+      <w:r>
+        <w:rPr>
+          <w:rFonts w:ascii="Times New Roman" w:eastAsia="Times New Roman" w:hAnsi="Times New Roman" w:cs="Times New Roman"/>
+          <w:sz w:val="20"/>
+        </w:rPr>
+        <w:t>sa</w:t>
+      </w:r>
+      <w:proofErr w:type="spellEnd"/>
+      <w:r>
+        <w:rPr>
+          <w:rFonts w:ascii="Times New Roman" w:eastAsia="Times New Roman" w:hAnsi="Times New Roman" w:cs="Times New Roman"/>
+          <w:sz w:val="20"/>
+        </w:rPr>
+        <w:t xml:space="preserve"> </w:t>
+      </w:r>
+      <w:proofErr w:type="spellStart"/>
+      <w:r>
+        <w:rPr>
+          <w:rFonts w:ascii="Times New Roman" w:eastAsia="Times New Roman" w:hAnsi="Times New Roman" w:cs="Times New Roman"/>
+          <w:sz w:val="20"/>
+        </w:rPr>
+        <w:t>servera</w:t>
+      </w:r>
+      <w:proofErr w:type="spellEnd"/>
+      <w:r>
+        <w:rPr>
+          <w:rFonts w:ascii="Times New Roman" w:eastAsia="Times New Roman" w:hAnsi="Times New Roman" w:cs="Times New Roman"/>
+          <w:sz w:val="20"/>
+        </w:rPr>
+        <w:t xml:space="preserve"> za </w:t>
+      </w:r>
+      <w:proofErr w:type="spellStart"/>
+      <w:r>
+        <w:rPr>
+          <w:rFonts w:ascii="Times New Roman" w:eastAsia="Times New Roman" w:hAnsi="Times New Roman" w:cs="Times New Roman"/>
+          <w:sz w:val="20"/>
+        </w:rPr>
+        <w:t>skladištenje</w:t>
+      </w:r>
+      <w:proofErr w:type="spellEnd"/>
+      <w:r>
+        <w:rPr>
+          <w:rFonts w:ascii="Times New Roman" w:eastAsia="Times New Roman" w:hAnsi="Times New Roman" w:cs="Times New Roman"/>
+          <w:sz w:val="20"/>
+        </w:rPr>
+        <w:t xml:space="preserve">. </w:t>
+      </w:r>
+      <w:r>
+        <w:rPr>
+          <w:rFonts w:ascii="Times New Roman" w:eastAsia="Times New Roman" w:hAnsi="Times New Roman" w:cs="Times New Roman"/>
+          <w:sz w:val="20"/>
+        </w:rPr>
+        <w:t xml:space="preserve"> </w:t>
+      </w:r>
+      <w:proofErr w:type="spellStart"/>
+      <w:r>
+        <w:rPr>
+          <w:rFonts w:ascii="Times New Roman" w:eastAsia="Times New Roman" w:hAnsi="Times New Roman" w:cs="Times New Roman"/>
+          <w:sz w:val="20"/>
+        </w:rPr>
+        <w:t>Prikazuje</w:t>
+      </w:r>
+      <w:proofErr w:type="spellEnd"/>
+      <w:r>
+        <w:rPr>
+          <w:rFonts w:ascii="Times New Roman" w:eastAsia="Times New Roman" w:hAnsi="Times New Roman" w:cs="Times New Roman"/>
+          <w:sz w:val="20"/>
+        </w:rPr>
+        <w:t xml:space="preserve"> se </w:t>
+      </w:r>
+      <w:proofErr w:type="spellStart"/>
+      <w:r>
+        <w:rPr>
+          <w:rFonts w:ascii="Times New Roman" w:eastAsia="Times New Roman" w:hAnsi="Times New Roman" w:cs="Times New Roman"/>
+          <w:sz w:val="20"/>
+        </w:rPr>
+        <w:t>poruka</w:t>
+      </w:r>
+      <w:proofErr w:type="spellEnd"/>
+      <w:r>
+        <w:rPr>
+          <w:rFonts w:ascii="Times New Roman" w:eastAsia="Times New Roman" w:hAnsi="Times New Roman" w:cs="Times New Roman"/>
+          <w:sz w:val="20"/>
+        </w:rPr>
+        <w:t xml:space="preserve"> o </w:t>
+      </w:r>
+      <w:proofErr w:type="spellStart"/>
+      <w:r>
+        <w:rPr>
+          <w:rFonts w:ascii="Times New Roman" w:eastAsia="Times New Roman" w:hAnsi="Times New Roman" w:cs="Times New Roman"/>
+          <w:sz w:val="20"/>
+        </w:rPr>
+        <w:t>uspešnom</w:t>
+      </w:r>
+      <w:proofErr w:type="spellEnd"/>
+      <w:r>
+        <w:rPr>
+          <w:rFonts w:ascii="Times New Roman" w:eastAsia="Times New Roman" w:hAnsi="Times New Roman" w:cs="Times New Roman"/>
+          <w:sz w:val="20"/>
+        </w:rPr>
+        <w:t xml:space="preserve"> </w:t>
+      </w:r>
+      <w:proofErr w:type="spellStart"/>
+      <w:r>
+        <w:rPr>
+          <w:rFonts w:ascii="Times New Roman" w:eastAsia="Times New Roman" w:hAnsi="Times New Roman" w:cs="Times New Roman"/>
+          <w:sz w:val="20"/>
+        </w:rPr>
+        <w:t>uklanjanju</w:t>
+      </w:r>
+      <w:proofErr w:type="spellEnd"/>
+      <w:r>
+        <w:rPr>
+          <w:rFonts w:ascii="Times New Roman" w:eastAsia="Times New Roman" w:hAnsi="Times New Roman" w:cs="Times New Roman"/>
+          <w:sz w:val="20"/>
+        </w:rPr>
+        <w:t xml:space="preserve"> </w:t>
+      </w:r>
+      <w:proofErr w:type="spellStart"/>
+      <w:r>
+        <w:rPr>
+          <w:rFonts w:ascii="Times New Roman" w:eastAsia="Times New Roman" w:hAnsi="Times New Roman" w:cs="Times New Roman"/>
+          <w:sz w:val="20"/>
+        </w:rPr>
+        <w:t>slike</w:t>
+      </w:r>
+      <w:proofErr w:type="spellEnd"/>
+      <w:r>
+        <w:rPr>
+          <w:rFonts w:ascii="Times New Roman" w:eastAsia="Times New Roman" w:hAnsi="Times New Roman" w:cs="Times New Roman"/>
+          <w:sz w:val="20"/>
+        </w:rPr>
+        <w:t>.</w:t>
       </w:r>
     </w:p>
     <w:p>
@@ -3171,15 +5590,81 @@
         </w:rPr>
       </w:pPr>
       <w:bookmarkStart w:id="9" w:name="_Toc205762434"/>
+      <w:proofErr w:type="spellStart"/>
       <w:r>
         <w:rPr>
           <w:i/>
           <w:iCs/>
         </w:rPr>
         <w:lastRenderedPageBreak/>
-        <w:t>Korisnik unosi nepostojeće korisničko ime</w:t>
+        <w:t>Korisnik</w:t>
+      </w:r>
+      <w:proofErr w:type="spellEnd"/>
+      <w:r>
+        <w:rPr>
+          <w:i/>
+          <w:iCs/>
+        </w:rPr>
+        <w:t xml:space="preserve"> </w:t>
+      </w:r>
+      <w:proofErr w:type="spellStart"/>
+      <w:r>
+        <w:rPr>
+          <w:i/>
+          <w:iCs/>
+        </w:rPr>
+        <w:t>unosi</w:t>
+      </w:r>
+      <w:proofErr w:type="spellEnd"/>
+      <w:r>
+        <w:rPr>
+          <w:i/>
+          <w:iCs/>
+        </w:rPr>
+        <w:t xml:space="preserve"> </w:t>
+      </w:r>
+      <w:proofErr w:type="spellStart"/>
+      <w:r>
+        <w:rPr>
+          <w:i/>
+          <w:iCs/>
+        </w:rPr>
+        <w:t>nepostojeće</w:t>
+      </w:r>
+      <w:proofErr w:type="spellEnd"/>
+      <w:r>
+        <w:rPr>
+          <w:i/>
+          <w:iCs/>
+        </w:rPr>
+        <w:t xml:space="preserve"> </w:t>
+      </w:r>
+      <w:proofErr w:type="spellStart"/>
+      <w:r>
+        <w:rPr>
+          <w:i/>
+          <w:iCs/>
+        </w:rPr>
+        <w:t>korisničko</w:t>
+      </w:r>
+      <w:proofErr w:type="spellEnd"/>
+      <w:r>
+        <w:rPr>
+          <w:i/>
+          <w:iCs/>
+        </w:rPr>
+        <w:t xml:space="preserve"> </w:t>
+      </w:r>
+      <w:proofErr w:type="spellStart"/>
+      <w:r>
+        <w:rPr>
+          <w:i/>
+          <w:iCs/>
+        </w:rPr>
+        <w:t>ime</w:t>
       </w:r>
       <w:bookmarkEnd w:id="9"/>
+      <w:proofErr w:type="spellEnd"/>
       <w:r>
         <w:rPr>
           <w:i/>
@@ -3203,12 +5688,53 @@
           <w:sz w:val="20"/>
         </w:rPr>
       </w:pPr>
-      <w:r>
-        <w:rPr>
-          <w:rFonts w:ascii="Times New Roman" w:eastAsia="Times New Roman" w:hAnsi="Times New Roman" w:cs="Times New Roman"/>
-          <w:sz w:val="20"/>
-        </w:rPr>
-        <w:t>Akcija 1, 2, 3 iz scenarija 2.2.1.</w:t>
+      <w:proofErr w:type="spellStart"/>
+      <w:r>
+        <w:rPr>
+          <w:rFonts w:ascii="Times New Roman" w:eastAsia="Times New Roman" w:hAnsi="Times New Roman" w:cs="Times New Roman"/>
+          <w:sz w:val="20"/>
+        </w:rPr>
+        <w:t>Akcija</w:t>
+      </w:r>
+      <w:proofErr w:type="spellEnd"/>
+      <w:r>
+        <w:rPr>
+          <w:rFonts w:ascii="Times New Roman" w:eastAsia="Times New Roman" w:hAnsi="Times New Roman" w:cs="Times New Roman"/>
+          <w:sz w:val="20"/>
+        </w:rPr>
+        <w:t xml:space="preserve"> 1, 2, 3 </w:t>
+      </w:r>
+      <w:proofErr w:type="spellStart"/>
+      <w:r>
+        <w:rPr>
+          <w:rFonts w:ascii="Times New Roman" w:eastAsia="Times New Roman" w:hAnsi="Times New Roman" w:cs="Times New Roman"/>
+          <w:sz w:val="20"/>
+        </w:rPr>
+        <w:t>iz</w:t>
+      </w:r>
+      <w:proofErr w:type="spellEnd"/>
+      <w:r>
+        <w:rPr>
+          <w:rFonts w:ascii="Times New Roman" w:eastAsia="Times New Roman" w:hAnsi="Times New Roman" w:cs="Times New Roman"/>
+          <w:sz w:val="20"/>
+        </w:rPr>
+        <w:t xml:space="preserve"> </w:t>
+      </w:r>
+      <w:proofErr w:type="spellStart"/>
+      <w:r>
+        <w:rPr>
+          <w:rFonts w:ascii="Times New Roman" w:eastAsia="Times New Roman" w:hAnsi="Times New Roman" w:cs="Times New Roman"/>
+          <w:sz w:val="20"/>
+        </w:rPr>
+        <w:t>scenarija</w:t>
+      </w:r>
+      <w:proofErr w:type="spellEnd"/>
+      <w:r>
+        <w:rPr>
+          <w:rFonts w:ascii="Times New Roman" w:eastAsia="Times New Roman" w:hAnsi="Times New Roman" w:cs="Times New Roman"/>
+          <w:sz w:val="20"/>
+        </w:rPr>
+        <w:t xml:space="preserve"> 2.2.1.</w:t>
       </w:r>
     </w:p>
     <w:p>
@@ -3225,12 +5751,325 @@
           <w:sz w:val="20"/>
         </w:rPr>
       </w:pPr>
-      <w:r>
-        <w:rPr>
-          <w:rFonts w:ascii="Times New Roman" w:eastAsia="Times New Roman" w:hAnsi="Times New Roman" w:cs="Times New Roman"/>
-          <w:sz w:val="20"/>
-        </w:rPr>
-        <w:t>Ukoliko iz nekog razloga (npr. greška u bazi podataka, privilegije) sistem ne može da izvrši akciju, administrator dobija obaveštenje: "Došlo je do greške prilikom uklanjanja slike."</w:t>
+      <w:proofErr w:type="spellStart"/>
+      <w:r>
+        <w:rPr>
+          <w:rFonts w:ascii="Times New Roman" w:eastAsia="Times New Roman" w:hAnsi="Times New Roman" w:cs="Times New Roman"/>
+          <w:sz w:val="20"/>
+        </w:rPr>
+        <w:t>Ukoliko</w:t>
+      </w:r>
+      <w:proofErr w:type="spellEnd"/>
+      <w:r>
+        <w:rPr>
+          <w:rFonts w:ascii="Times New Roman" w:eastAsia="Times New Roman" w:hAnsi="Times New Roman" w:cs="Times New Roman"/>
+          <w:sz w:val="20"/>
+        </w:rPr>
+        <w:t xml:space="preserve"> </w:t>
+      </w:r>
+      <w:proofErr w:type="spellStart"/>
+      <w:r>
+        <w:rPr>
+          <w:rFonts w:ascii="Times New Roman" w:eastAsia="Times New Roman" w:hAnsi="Times New Roman" w:cs="Times New Roman"/>
+          <w:sz w:val="20"/>
+        </w:rPr>
+        <w:t>iz</w:t>
+      </w:r>
+      <w:proofErr w:type="spellEnd"/>
+      <w:r>
+        <w:rPr>
+          <w:rFonts w:ascii="Times New Roman" w:eastAsia="Times New Roman" w:hAnsi="Times New Roman" w:cs="Times New Roman"/>
+          <w:sz w:val="20"/>
+        </w:rPr>
+        <w:t xml:space="preserve"> </w:t>
+      </w:r>
+      <w:proofErr w:type="spellStart"/>
+      <w:r>
+        <w:rPr>
+          <w:rFonts w:ascii="Times New Roman" w:eastAsia="Times New Roman" w:hAnsi="Times New Roman" w:cs="Times New Roman"/>
+          <w:sz w:val="20"/>
+        </w:rPr>
+        <w:t>nekog</w:t>
+      </w:r>
+      <w:proofErr w:type="spellEnd"/>
+      <w:r>
+        <w:rPr>
+          <w:rFonts w:ascii="Times New Roman" w:eastAsia="Times New Roman" w:hAnsi="Times New Roman" w:cs="Times New Roman"/>
+          <w:sz w:val="20"/>
+        </w:rPr>
+        <w:t xml:space="preserve"> </w:t>
+      </w:r>
+      <w:proofErr w:type="spellStart"/>
+      <w:r>
+        <w:rPr>
+          <w:rFonts w:ascii="Times New Roman" w:eastAsia="Times New Roman" w:hAnsi="Times New Roman" w:cs="Times New Roman"/>
+          <w:sz w:val="20"/>
+        </w:rPr>
+        <w:t>razloga</w:t>
+      </w:r>
+      <w:proofErr w:type="spellEnd"/>
+      <w:r>
+        <w:rPr>
+          <w:rFonts w:ascii="Times New Roman" w:eastAsia="Times New Roman" w:hAnsi="Times New Roman" w:cs="Times New Roman"/>
+          <w:sz w:val="20"/>
+        </w:rPr>
+        <w:t xml:space="preserve"> (</w:t>
+      </w:r>
+      <w:proofErr w:type="spellStart"/>
+      <w:r>
+        <w:rPr>
+          <w:rFonts w:ascii="Times New Roman" w:eastAsia="Times New Roman" w:hAnsi="Times New Roman" w:cs="Times New Roman"/>
+          <w:sz w:val="20"/>
+        </w:rPr>
+        <w:t>npr</w:t>
+      </w:r>
+      <w:proofErr w:type="spellEnd"/>
+      <w:r>
+        <w:rPr>
+          <w:rFonts w:ascii="Times New Roman" w:eastAsia="Times New Roman" w:hAnsi="Times New Roman" w:cs="Times New Roman"/>
+          <w:sz w:val="20"/>
+        </w:rPr>
+        <w:t xml:space="preserve">. </w:t>
+      </w:r>
+      <w:proofErr w:type="spellStart"/>
+      <w:r>
+        <w:rPr>
+          <w:rFonts w:ascii="Times New Roman" w:eastAsia="Times New Roman" w:hAnsi="Times New Roman" w:cs="Times New Roman"/>
+          <w:sz w:val="20"/>
+        </w:rPr>
+        <w:t>greška</w:t>
+      </w:r>
+      <w:proofErr w:type="spellEnd"/>
+      <w:r>
+        <w:rPr>
+          <w:rFonts w:ascii="Times New Roman" w:eastAsia="Times New Roman" w:hAnsi="Times New Roman" w:cs="Times New Roman"/>
+          <w:sz w:val="20"/>
+        </w:rPr>
+        <w:t xml:space="preserve"> u </w:t>
+      </w:r>
+      <w:proofErr w:type="spellStart"/>
+      <w:r>
+        <w:rPr>
+          <w:rFonts w:ascii="Times New Roman" w:eastAsia="Times New Roman" w:hAnsi="Times New Roman" w:cs="Times New Roman"/>
+          <w:sz w:val="20"/>
+        </w:rPr>
+        <w:t>bazi</w:t>
+      </w:r>
+      <w:proofErr w:type="spellEnd"/>
+      <w:r>
+        <w:rPr>
+          <w:rFonts w:ascii="Times New Roman" w:eastAsia="Times New Roman" w:hAnsi="Times New Roman" w:cs="Times New Roman"/>
+          <w:sz w:val="20"/>
+        </w:rPr>
+        <w:t xml:space="preserve"> </w:t>
+      </w:r>
+      <w:proofErr w:type="spellStart"/>
+      <w:r>
+        <w:rPr>
+          <w:rFonts w:ascii="Times New Roman" w:eastAsia="Times New Roman" w:hAnsi="Times New Roman" w:cs="Times New Roman"/>
+          <w:sz w:val="20"/>
+        </w:rPr>
+        <w:t>podataka</w:t>
+      </w:r>
+      <w:proofErr w:type="spellEnd"/>
+      <w:r>
+        <w:rPr>
+          <w:rFonts w:ascii="Times New Roman" w:eastAsia="Times New Roman" w:hAnsi="Times New Roman" w:cs="Times New Roman"/>
+          <w:sz w:val="20"/>
+        </w:rPr>
+        <w:t xml:space="preserve">, </w:t>
+      </w:r>
+      <w:proofErr w:type="spellStart"/>
+      <w:r>
+        <w:rPr>
+          <w:rFonts w:ascii="Times New Roman" w:eastAsia="Times New Roman" w:hAnsi="Times New Roman" w:cs="Times New Roman"/>
+          <w:sz w:val="20"/>
+        </w:rPr>
+        <w:t>privilegije</w:t>
+      </w:r>
+      <w:proofErr w:type="spellEnd"/>
+      <w:r>
+        <w:rPr>
+          <w:rFonts w:ascii="Times New Roman" w:eastAsia="Times New Roman" w:hAnsi="Times New Roman" w:cs="Times New Roman"/>
+          <w:sz w:val="20"/>
+        </w:rPr>
+        <w:t xml:space="preserve">) </w:t>
+      </w:r>
+      <w:proofErr w:type="spellStart"/>
+      <w:r>
+        <w:rPr>
+          <w:rFonts w:ascii="Times New Roman" w:eastAsia="Times New Roman" w:hAnsi="Times New Roman" w:cs="Times New Roman"/>
+          <w:sz w:val="20"/>
+        </w:rPr>
+        <w:t>sistem</w:t>
+      </w:r>
+      <w:proofErr w:type="spellEnd"/>
+      <w:r>
+        <w:rPr>
+          <w:rFonts w:ascii="Times New Roman" w:eastAsia="Times New Roman" w:hAnsi="Times New Roman" w:cs="Times New Roman"/>
+          <w:sz w:val="20"/>
+        </w:rPr>
+        <w:t xml:space="preserve"> ne </w:t>
+      </w:r>
+      <w:proofErr w:type="spellStart"/>
+      <w:r>
+        <w:rPr>
+          <w:rFonts w:ascii="Times New Roman" w:eastAsia="Times New Roman" w:hAnsi="Times New Roman" w:cs="Times New Roman"/>
+          <w:sz w:val="20"/>
+        </w:rPr>
+        <w:t>može</w:t>
+      </w:r>
+      <w:proofErr w:type="spellEnd"/>
+      <w:r>
+        <w:rPr>
+          <w:rFonts w:ascii="Times New Roman" w:eastAsia="Times New Roman" w:hAnsi="Times New Roman" w:cs="Times New Roman"/>
+          <w:sz w:val="20"/>
+        </w:rPr>
+        <w:t xml:space="preserve"> da </w:t>
+      </w:r>
+      <w:proofErr w:type="spellStart"/>
+      <w:r>
+        <w:rPr>
+          <w:rFonts w:ascii="Times New Roman" w:eastAsia="Times New Roman" w:hAnsi="Times New Roman" w:cs="Times New Roman"/>
+          <w:sz w:val="20"/>
+        </w:rPr>
+        <w:t>izvrši</w:t>
+      </w:r>
+      <w:proofErr w:type="spellEnd"/>
+      <w:r>
+        <w:rPr>
+          <w:rFonts w:ascii="Times New Roman" w:eastAsia="Times New Roman" w:hAnsi="Times New Roman" w:cs="Times New Roman"/>
+          <w:sz w:val="20"/>
+        </w:rPr>
+        <w:t xml:space="preserve"> </w:t>
+      </w:r>
+      <w:proofErr w:type="spellStart"/>
+      <w:r>
+        <w:rPr>
+          <w:rFonts w:ascii="Times New Roman" w:eastAsia="Times New Roman" w:hAnsi="Times New Roman" w:cs="Times New Roman"/>
+          <w:sz w:val="20"/>
+        </w:rPr>
+        <w:t>akciju</w:t>
+      </w:r>
+      <w:proofErr w:type="spellEnd"/>
+      <w:r>
+        <w:rPr>
+          <w:rFonts w:ascii="Times New Roman" w:eastAsia="Times New Roman" w:hAnsi="Times New Roman" w:cs="Times New Roman"/>
+          <w:sz w:val="20"/>
+        </w:rPr>
+        <w:t xml:space="preserve">, administrator </w:t>
+      </w:r>
+      <w:proofErr w:type="spellStart"/>
+      <w:r>
+        <w:rPr>
+          <w:rFonts w:ascii="Times New Roman" w:eastAsia="Times New Roman" w:hAnsi="Times New Roman" w:cs="Times New Roman"/>
+          <w:sz w:val="20"/>
+        </w:rPr>
+        <w:t>dobija</w:t>
+      </w:r>
+      <w:proofErr w:type="spellEnd"/>
+      <w:r>
+        <w:rPr>
+          <w:rFonts w:ascii="Times New Roman" w:eastAsia="Times New Roman" w:hAnsi="Times New Roman" w:cs="Times New Roman"/>
+          <w:sz w:val="20"/>
+        </w:rPr>
+        <w:t xml:space="preserve"> </w:t>
+      </w:r>
+      <w:proofErr w:type="spellStart"/>
+      <w:r>
+        <w:rPr>
+          <w:rFonts w:ascii="Times New Roman" w:eastAsia="Times New Roman" w:hAnsi="Times New Roman" w:cs="Times New Roman"/>
+          <w:sz w:val="20"/>
+        </w:rPr>
+        <w:t>obaveštenje</w:t>
+      </w:r>
+      <w:proofErr w:type="spellEnd"/>
+      <w:r>
+        <w:rPr>
+          <w:rFonts w:ascii="Times New Roman" w:eastAsia="Times New Roman" w:hAnsi="Times New Roman" w:cs="Times New Roman"/>
+          <w:sz w:val="20"/>
+        </w:rPr>
+        <w:t>: "</w:t>
+      </w:r>
+      <w:proofErr w:type="spellStart"/>
+      <w:r>
+        <w:rPr>
+          <w:rFonts w:ascii="Times New Roman" w:eastAsia="Times New Roman" w:hAnsi="Times New Roman" w:cs="Times New Roman"/>
+          <w:sz w:val="20"/>
+        </w:rPr>
+        <w:t>Došlo</w:t>
+      </w:r>
+      <w:proofErr w:type="spellEnd"/>
+      <w:r>
+        <w:rPr>
+          <w:rFonts w:ascii="Times New Roman" w:eastAsia="Times New Roman" w:hAnsi="Times New Roman" w:cs="Times New Roman"/>
+          <w:sz w:val="20"/>
+        </w:rPr>
+        <w:t xml:space="preserve"> je do </w:t>
+      </w:r>
+      <w:proofErr w:type="spellStart"/>
+      <w:r>
+        <w:rPr>
+          <w:rFonts w:ascii="Times New Roman" w:eastAsia="Times New Roman" w:hAnsi="Times New Roman" w:cs="Times New Roman"/>
+          <w:sz w:val="20"/>
+        </w:rPr>
+        <w:t>greške</w:t>
+      </w:r>
+      <w:proofErr w:type="spellEnd"/>
+      <w:r>
+        <w:rPr>
+          <w:rFonts w:ascii="Times New Roman" w:eastAsia="Times New Roman" w:hAnsi="Times New Roman" w:cs="Times New Roman"/>
+          <w:sz w:val="20"/>
+        </w:rPr>
+        <w:t xml:space="preserve"> </w:t>
+      </w:r>
+      <w:proofErr w:type="spellStart"/>
+      <w:r>
+        <w:rPr>
+          <w:rFonts w:ascii="Times New Roman" w:eastAsia="Times New Roman" w:hAnsi="Times New Roman" w:cs="Times New Roman"/>
+          <w:sz w:val="20"/>
+        </w:rPr>
+        <w:t>prilikom</w:t>
+      </w:r>
+      <w:proofErr w:type="spellEnd"/>
+      <w:r>
+        <w:rPr>
+          <w:rFonts w:ascii="Times New Roman" w:eastAsia="Times New Roman" w:hAnsi="Times New Roman" w:cs="Times New Roman"/>
+          <w:sz w:val="20"/>
+        </w:rPr>
+        <w:t xml:space="preserve"> </w:t>
+      </w:r>
+      <w:proofErr w:type="spellStart"/>
+      <w:r>
+        <w:rPr>
+          <w:rFonts w:ascii="Times New Roman" w:eastAsia="Times New Roman" w:hAnsi="Times New Roman" w:cs="Times New Roman"/>
+          <w:sz w:val="20"/>
+        </w:rPr>
+        <w:t>uklanjanja</w:t>
+      </w:r>
+      <w:proofErr w:type="spellEnd"/>
+      <w:r>
+        <w:rPr>
+          <w:rFonts w:ascii="Times New Roman" w:eastAsia="Times New Roman" w:hAnsi="Times New Roman" w:cs="Times New Roman"/>
+          <w:sz w:val="20"/>
+        </w:rPr>
+        <w:t xml:space="preserve"> </w:t>
+      </w:r>
+      <w:proofErr w:type="spellStart"/>
+      <w:r>
+        <w:rPr>
+          <w:rFonts w:ascii="Times New Roman" w:eastAsia="Times New Roman" w:hAnsi="Times New Roman" w:cs="Times New Roman"/>
+          <w:sz w:val="20"/>
+        </w:rPr>
+        <w:t>slike</w:t>
+      </w:r>
+      <w:proofErr w:type="spellEnd"/>
+      <w:r>
+        <w:rPr>
+          <w:rFonts w:ascii="Times New Roman" w:eastAsia="Times New Roman" w:hAnsi="Times New Roman" w:cs="Times New Roman"/>
+          <w:sz w:val="20"/>
+        </w:rPr>
+        <w:t>."</w:t>
       </w:r>
     </w:p>
     <w:p>
@@ -3264,10 +6103,20 @@
         <w:ind w:left="705" w:hanging="720"/>
       </w:pPr>
       <w:bookmarkStart w:id="10" w:name="_Toc205762436"/>
-      <w:r>
-        <w:t>Posebni zahtevi</w:t>
+      <w:proofErr w:type="spellStart"/>
+      <w:r>
+        <w:t>Posebni</w:t>
+      </w:r>
+      <w:proofErr w:type="spellEnd"/>
+      <w:r>
+        <w:t xml:space="preserve"> </w:t>
+      </w:r>
+      <w:proofErr w:type="spellStart"/>
+      <w:r>
+        <w:t>zahtevi</w:t>
       </w:r>
       <w:bookmarkEnd w:id="10"/>
+      <w:proofErr w:type="spellEnd"/>
       <w:r>
         <w:t xml:space="preserve"> </w:t>
       </w:r>
@@ -3286,12 +6135,101 @@
           <w:sz w:val="20"/>
         </w:rPr>
       </w:pPr>
-      <w:r>
-        <w:rPr>
-          <w:rFonts w:ascii="Times New Roman" w:eastAsia="Times New Roman" w:hAnsi="Times New Roman" w:cs="Times New Roman"/>
-          <w:sz w:val="20"/>
-        </w:rPr>
-        <w:t>Uklanjanje slike mora biti trajno i neopozivo.</w:t>
+      <w:proofErr w:type="spellStart"/>
+      <w:r>
+        <w:rPr>
+          <w:rFonts w:ascii="Times New Roman" w:eastAsia="Times New Roman" w:hAnsi="Times New Roman" w:cs="Times New Roman"/>
+          <w:sz w:val="20"/>
+        </w:rPr>
+        <w:t>Uklanjanje</w:t>
+      </w:r>
+      <w:proofErr w:type="spellEnd"/>
+      <w:r>
+        <w:rPr>
+          <w:rFonts w:ascii="Times New Roman" w:eastAsia="Times New Roman" w:hAnsi="Times New Roman" w:cs="Times New Roman"/>
+          <w:sz w:val="20"/>
+        </w:rPr>
+        <w:t xml:space="preserve"> </w:t>
+      </w:r>
+      <w:proofErr w:type="spellStart"/>
+      <w:r>
+        <w:rPr>
+          <w:rFonts w:ascii="Times New Roman" w:eastAsia="Times New Roman" w:hAnsi="Times New Roman" w:cs="Times New Roman"/>
+          <w:sz w:val="20"/>
+        </w:rPr>
+        <w:t>slike</w:t>
+      </w:r>
+      <w:proofErr w:type="spellEnd"/>
+      <w:r>
+        <w:rPr>
+          <w:rFonts w:ascii="Times New Roman" w:eastAsia="Times New Roman" w:hAnsi="Times New Roman" w:cs="Times New Roman"/>
+          <w:sz w:val="20"/>
+        </w:rPr>
+        <w:t xml:space="preserve"> mora </w:t>
+      </w:r>
+      <w:proofErr w:type="spellStart"/>
+      <w:r>
+        <w:rPr>
+          <w:rFonts w:ascii="Times New Roman" w:eastAsia="Times New Roman" w:hAnsi="Times New Roman" w:cs="Times New Roman"/>
+          <w:sz w:val="20"/>
+        </w:rPr>
+        <w:t>biti</w:t>
+      </w:r>
+      <w:proofErr w:type="spellEnd"/>
+      <w:r>
+        <w:rPr>
+          <w:rFonts w:ascii="Times New Roman" w:eastAsia="Times New Roman" w:hAnsi="Times New Roman" w:cs="Times New Roman"/>
+          <w:sz w:val="20"/>
+        </w:rPr>
+        <w:t xml:space="preserve"> </w:t>
+      </w:r>
+      <w:proofErr w:type="spellStart"/>
+      <w:r>
+        <w:rPr>
+          <w:rFonts w:ascii="Times New Roman" w:eastAsia="Times New Roman" w:hAnsi="Times New Roman" w:cs="Times New Roman"/>
+          <w:sz w:val="20"/>
+        </w:rPr>
+        <w:t>trajno</w:t>
+      </w:r>
+      <w:proofErr w:type="spellEnd"/>
+      <w:r>
+        <w:rPr>
+          <w:rFonts w:ascii="Times New Roman" w:eastAsia="Times New Roman" w:hAnsi="Times New Roman" w:cs="Times New Roman"/>
+          <w:sz w:val="20"/>
+        </w:rPr>
+        <w:t xml:space="preserve"> </w:t>
+      </w:r>
+      <w:proofErr w:type="spellStart"/>
+      <w:r>
+        <w:rPr>
+          <w:rFonts w:ascii="Times New Roman" w:eastAsia="Times New Roman" w:hAnsi="Times New Roman" w:cs="Times New Roman"/>
+          <w:sz w:val="20"/>
+        </w:rPr>
+        <w:t>i</w:t>
+      </w:r>
+      <w:proofErr w:type="spellEnd"/>
+      <w:r>
+        <w:rPr>
+          <w:rFonts w:ascii="Times New Roman" w:eastAsia="Times New Roman" w:hAnsi="Times New Roman" w:cs="Times New Roman"/>
+          <w:sz w:val="20"/>
+        </w:rPr>
+        <w:t xml:space="preserve"> </w:t>
+      </w:r>
+      <w:proofErr w:type="spellStart"/>
+      <w:r>
+        <w:rPr>
+          <w:rFonts w:ascii="Times New Roman" w:eastAsia="Times New Roman" w:hAnsi="Times New Roman" w:cs="Times New Roman"/>
+          <w:sz w:val="20"/>
+        </w:rPr>
+        <w:t>neopozivo</w:t>
+      </w:r>
+      <w:proofErr w:type="spellEnd"/>
+      <w:r>
+        <w:rPr>
+          <w:rFonts w:ascii="Times New Roman" w:eastAsia="Times New Roman" w:hAnsi="Times New Roman" w:cs="Times New Roman"/>
+          <w:sz w:val="20"/>
+        </w:rPr>
+        <w:t>.</w:t>
       </w:r>
     </w:p>
     <w:p>
@@ -3313,7 +6251,183 @@
           <w:rFonts w:ascii="Times New Roman" w:eastAsia="Times New Roman" w:hAnsi="Times New Roman" w:cs="Times New Roman"/>
           <w:sz w:val="20"/>
         </w:rPr>
-        <w:t>Mora postojati log (dnevnik) administratorskih akcija, gde se beleži koji administrator je uklonio koju sliku i kada.</w:t>
+        <w:t xml:space="preserve">Mora </w:t>
+      </w:r>
+      <w:proofErr w:type="spellStart"/>
+      <w:r>
+        <w:rPr>
+          <w:rFonts w:ascii="Times New Roman" w:eastAsia="Times New Roman" w:hAnsi="Times New Roman" w:cs="Times New Roman"/>
+          <w:sz w:val="20"/>
+        </w:rPr>
+        <w:t>postojati</w:t>
+      </w:r>
+      <w:proofErr w:type="spellEnd"/>
+      <w:r>
+        <w:rPr>
+          <w:rFonts w:ascii="Times New Roman" w:eastAsia="Times New Roman" w:hAnsi="Times New Roman" w:cs="Times New Roman"/>
+          <w:sz w:val="20"/>
+        </w:rPr>
+        <w:t xml:space="preserve"> log (</w:t>
+      </w:r>
+      <w:proofErr w:type="spellStart"/>
+      <w:r>
+        <w:rPr>
+          <w:rFonts w:ascii="Times New Roman" w:eastAsia="Times New Roman" w:hAnsi="Times New Roman" w:cs="Times New Roman"/>
+          <w:sz w:val="20"/>
+        </w:rPr>
+        <w:t>dnevnik</w:t>
+      </w:r>
+      <w:proofErr w:type="spellEnd"/>
+      <w:r>
+        <w:rPr>
+          <w:rFonts w:ascii="Times New Roman" w:eastAsia="Times New Roman" w:hAnsi="Times New Roman" w:cs="Times New Roman"/>
+          <w:sz w:val="20"/>
+        </w:rPr>
+        <w:t xml:space="preserve">) </w:t>
+      </w:r>
+      <w:proofErr w:type="spellStart"/>
+      <w:r>
+        <w:rPr>
+          <w:rFonts w:ascii="Times New Roman" w:eastAsia="Times New Roman" w:hAnsi="Times New Roman" w:cs="Times New Roman"/>
+          <w:sz w:val="20"/>
+        </w:rPr>
+        <w:t>administratorskih</w:t>
+      </w:r>
+      <w:proofErr w:type="spellEnd"/>
+      <w:r>
+        <w:rPr>
+          <w:rFonts w:ascii="Times New Roman" w:eastAsia="Times New Roman" w:hAnsi="Times New Roman" w:cs="Times New Roman"/>
+          <w:sz w:val="20"/>
+        </w:rPr>
+        <w:t xml:space="preserve"> </w:t>
+      </w:r>
+      <w:proofErr w:type="spellStart"/>
+      <w:r>
+        <w:rPr>
+          <w:rFonts w:ascii="Times New Roman" w:eastAsia="Times New Roman" w:hAnsi="Times New Roman" w:cs="Times New Roman"/>
+          <w:sz w:val="20"/>
+        </w:rPr>
+        <w:t>akcija</w:t>
+      </w:r>
+      <w:proofErr w:type="spellEnd"/>
+      <w:r>
+        <w:rPr>
+          <w:rFonts w:ascii="Times New Roman" w:eastAsia="Times New Roman" w:hAnsi="Times New Roman" w:cs="Times New Roman"/>
+          <w:sz w:val="20"/>
+        </w:rPr>
+        <w:t xml:space="preserve">, </w:t>
+      </w:r>
+      <w:proofErr w:type="spellStart"/>
+      <w:r>
+        <w:rPr>
+          <w:rFonts w:ascii="Times New Roman" w:eastAsia="Times New Roman" w:hAnsi="Times New Roman" w:cs="Times New Roman"/>
+          <w:sz w:val="20"/>
+        </w:rPr>
+        <w:t>gde</w:t>
+      </w:r>
+      <w:proofErr w:type="spellEnd"/>
+      <w:r>
+        <w:rPr>
+          <w:rFonts w:ascii="Times New Roman" w:eastAsia="Times New Roman" w:hAnsi="Times New Roman" w:cs="Times New Roman"/>
+          <w:sz w:val="20"/>
+        </w:rPr>
+        <w:t xml:space="preserve"> se </w:t>
+      </w:r>
+      <w:proofErr w:type="spellStart"/>
+      <w:r>
+        <w:rPr>
+          <w:rFonts w:ascii="Times New Roman" w:eastAsia="Times New Roman" w:hAnsi="Times New Roman" w:cs="Times New Roman"/>
+          <w:sz w:val="20"/>
+        </w:rPr>
+        <w:t>beleži</w:t>
+      </w:r>
+      <w:proofErr w:type="spellEnd"/>
+      <w:r>
+        <w:rPr>
+          <w:rFonts w:ascii="Times New Roman" w:eastAsia="Times New Roman" w:hAnsi="Times New Roman" w:cs="Times New Roman"/>
+          <w:sz w:val="20"/>
+        </w:rPr>
+        <w:t xml:space="preserve"> koji administrator je </w:t>
+      </w:r>
+      <w:proofErr w:type="spellStart"/>
+      <w:r>
+        <w:rPr>
+          <w:rFonts w:ascii="Times New Roman" w:eastAsia="Times New Roman" w:hAnsi="Times New Roman" w:cs="Times New Roman"/>
+          <w:sz w:val="20"/>
+        </w:rPr>
+        <w:t>uklonio</w:t>
+      </w:r>
+      <w:proofErr w:type="spellEnd"/>
+      <w:r>
+        <w:rPr>
+          <w:rFonts w:ascii="Times New Roman" w:eastAsia="Times New Roman" w:hAnsi="Times New Roman" w:cs="Times New Roman"/>
+          <w:sz w:val="20"/>
+        </w:rPr>
+        <w:t xml:space="preserve"> </w:t>
+      </w:r>
+      <w:proofErr w:type="spellStart"/>
+      <w:r>
+        <w:rPr>
+          <w:rFonts w:ascii="Times New Roman" w:eastAsia="Times New Roman" w:hAnsi="Times New Roman" w:cs="Times New Roman"/>
+          <w:sz w:val="20"/>
+        </w:rPr>
+        <w:t>koju</w:t>
+      </w:r>
+      <w:proofErr w:type="spellEnd"/>
+      <w:r>
+        <w:rPr>
+          <w:rFonts w:ascii="Times New Roman" w:eastAsia="Times New Roman" w:hAnsi="Times New Roman" w:cs="Times New Roman"/>
+          <w:sz w:val="20"/>
+        </w:rPr>
+        <w:t xml:space="preserve"> </w:t>
+      </w:r>
+      <w:proofErr w:type="spellStart"/>
+      <w:r>
+        <w:rPr>
+          <w:rFonts w:ascii="Times New Roman" w:eastAsia="Times New Roman" w:hAnsi="Times New Roman" w:cs="Times New Roman"/>
+          <w:sz w:val="20"/>
+        </w:rPr>
+        <w:t>sliku</w:t>
+      </w:r>
+      <w:proofErr w:type="spellEnd"/>
+      <w:r>
+        <w:rPr>
+          <w:rFonts w:ascii="Times New Roman" w:eastAsia="Times New Roman" w:hAnsi="Times New Roman" w:cs="Times New Roman"/>
+          <w:sz w:val="20"/>
+        </w:rPr>
+        <w:t xml:space="preserve"> </w:t>
+      </w:r>
+      <w:proofErr w:type="spellStart"/>
+      <w:r>
+        <w:rPr>
+          <w:rFonts w:ascii="Times New Roman" w:eastAsia="Times New Roman" w:hAnsi="Times New Roman" w:cs="Times New Roman"/>
+          <w:sz w:val="20"/>
+        </w:rPr>
+        <w:t>i</w:t>
+      </w:r>
+      <w:proofErr w:type="spellEnd"/>
+      <w:r>
+        <w:rPr>
+          <w:rFonts w:ascii="Times New Roman" w:eastAsia="Times New Roman" w:hAnsi="Times New Roman" w:cs="Times New Roman"/>
+          <w:sz w:val="20"/>
+        </w:rPr>
+        <w:t xml:space="preserve"> </w:t>
+      </w:r>
+      <w:proofErr w:type="spellStart"/>
+      <w:r>
+        <w:rPr>
+          <w:rFonts w:ascii="Times New Roman" w:eastAsia="Times New Roman" w:hAnsi="Times New Roman" w:cs="Times New Roman"/>
+          <w:sz w:val="20"/>
+        </w:rPr>
+        <w:t>kada</w:t>
+      </w:r>
+      <w:proofErr w:type="spellEnd"/>
+      <w:r>
+        <w:rPr>
+          <w:rFonts w:ascii="Times New Roman" w:eastAsia="Times New Roman" w:hAnsi="Times New Roman" w:cs="Times New Roman"/>
+          <w:sz w:val="20"/>
+        </w:rPr>
+        <w:t>.</w:t>
       </w:r>
     </w:p>
     <w:p>
@@ -3334,10 +6448,12 @@
         <w:ind w:left="705" w:hanging="720"/>
       </w:pPr>
       <w:bookmarkStart w:id="11" w:name="_Toc205762437"/>
+      <w:proofErr w:type="spellStart"/>
       <w:r>
         <w:t>Preduslovi</w:t>
       </w:r>
       <w:bookmarkEnd w:id="11"/>
+      <w:proofErr w:type="spellEnd"/>
       <w:r>
         <w:t xml:space="preserve">  </w:t>
       </w:r>
@@ -3361,7 +6477,103 @@
           <w:rFonts w:ascii="Times New Roman" w:eastAsia="Times New Roman" w:hAnsi="Times New Roman" w:cs="Times New Roman"/>
           <w:sz w:val="20"/>
         </w:rPr>
-        <w:t>Administrator je prijavljen na sistem sa odgovarajućim privilegijama.</w:t>
+        <w:t xml:space="preserve">Administrator je </w:t>
+      </w:r>
+      <w:proofErr w:type="spellStart"/>
+      <w:r>
+        <w:rPr>
+          <w:rFonts w:ascii="Times New Roman" w:eastAsia="Times New Roman" w:hAnsi="Times New Roman" w:cs="Times New Roman"/>
+          <w:sz w:val="20"/>
+        </w:rPr>
+        <w:t>prijavljen</w:t>
+      </w:r>
+      <w:proofErr w:type="spellEnd"/>
+      <w:r>
+        <w:rPr>
+          <w:rFonts w:ascii="Times New Roman" w:eastAsia="Times New Roman" w:hAnsi="Times New Roman" w:cs="Times New Roman"/>
+          <w:sz w:val="20"/>
+        </w:rPr>
+        <w:t xml:space="preserve"> </w:t>
+      </w:r>
+      <w:proofErr w:type="spellStart"/>
+      <w:r>
+        <w:rPr>
+          <w:rFonts w:ascii="Times New Roman" w:eastAsia="Times New Roman" w:hAnsi="Times New Roman" w:cs="Times New Roman"/>
+          <w:sz w:val="20"/>
+        </w:rPr>
+        <w:t>na</w:t>
+      </w:r>
+      <w:proofErr w:type="spellEnd"/>
+      <w:r>
+        <w:rPr>
+          <w:rFonts w:ascii="Times New Roman" w:eastAsia="Times New Roman" w:hAnsi="Times New Roman" w:cs="Times New Roman"/>
+          <w:sz w:val="20"/>
+        </w:rPr>
+        <w:t xml:space="preserve"> </w:t>
+      </w:r>
+      <w:proofErr w:type="spellStart"/>
+      <w:r>
+        <w:rPr>
+          <w:rFonts w:ascii="Times New Roman" w:eastAsia="Times New Roman" w:hAnsi="Times New Roman" w:cs="Times New Roman"/>
+          <w:sz w:val="20"/>
+        </w:rPr>
+        <w:t>sistem</w:t>
+      </w:r>
+      <w:proofErr w:type="spellEnd"/>
+      <w:r>
+        <w:rPr>
+          <w:rFonts w:ascii="Times New Roman" w:eastAsia="Times New Roman" w:hAnsi="Times New Roman" w:cs="Times New Roman"/>
+          <w:sz w:val="20"/>
+        </w:rPr>
+        <w:t xml:space="preserve"> </w:t>
+      </w:r>
+      <w:proofErr w:type="spellStart"/>
+      <w:r>
+        <w:rPr>
+          <w:rFonts w:ascii="Times New Roman" w:eastAsia="Times New Roman" w:hAnsi="Times New Roman" w:cs="Times New Roman"/>
+          <w:sz w:val="20"/>
+        </w:rPr>
+        <w:t>sa</w:t>
+      </w:r>
+      <w:proofErr w:type="spellEnd"/>
+      <w:r>
+        <w:rPr>
+          <w:rFonts w:ascii="Times New Roman" w:eastAsia="Times New Roman" w:hAnsi="Times New Roman" w:cs="Times New Roman"/>
+          <w:sz w:val="20"/>
+        </w:rPr>
+        <w:t xml:space="preserve"> </w:t>
+      </w:r>
+      <w:proofErr w:type="spellStart"/>
+      <w:r>
+        <w:rPr>
+          <w:rFonts w:ascii="Times New Roman" w:eastAsia="Times New Roman" w:hAnsi="Times New Roman" w:cs="Times New Roman"/>
+          <w:sz w:val="20"/>
+        </w:rPr>
+        <w:t>odgovarajućim</w:t>
+      </w:r>
+      <w:proofErr w:type="spellEnd"/>
+      <w:r>
+        <w:rPr>
+          <w:rFonts w:ascii="Times New Roman" w:eastAsia="Times New Roman" w:hAnsi="Times New Roman" w:cs="Times New Roman"/>
+          <w:sz w:val="20"/>
+        </w:rPr>
+        <w:t xml:space="preserve"> </w:t>
+      </w:r>
+      <w:proofErr w:type="spellStart"/>
+      <w:r>
+        <w:rPr>
+          <w:rFonts w:ascii="Times New Roman" w:eastAsia="Times New Roman" w:hAnsi="Times New Roman" w:cs="Times New Roman"/>
+          <w:sz w:val="20"/>
+        </w:rPr>
+        <w:t>privilegijama</w:t>
+      </w:r>
+      <w:proofErr w:type="spellEnd"/>
+      <w:r>
+        <w:rPr>
+          <w:rFonts w:ascii="Times New Roman" w:eastAsia="Times New Roman" w:hAnsi="Times New Roman" w:cs="Times New Roman"/>
+          <w:sz w:val="20"/>
+        </w:rPr>
+        <w:t>.</w:t>
       </w:r>
     </w:p>
     <w:p>
@@ -3378,12 +6590,101 @@
           <w:sz w:val="20"/>
         </w:rPr>
       </w:pPr>
-      <w:r>
-        <w:rPr>
-          <w:rFonts w:ascii="Times New Roman" w:eastAsia="Times New Roman" w:hAnsi="Times New Roman" w:cs="Times New Roman"/>
-          <w:sz w:val="20"/>
-        </w:rPr>
-        <w:t>Slika koja se uklanja postoji na platformi.</w:t>
+      <w:proofErr w:type="spellStart"/>
+      <w:r>
+        <w:rPr>
+          <w:rFonts w:ascii="Times New Roman" w:eastAsia="Times New Roman" w:hAnsi="Times New Roman" w:cs="Times New Roman"/>
+          <w:sz w:val="20"/>
+        </w:rPr>
+        <w:t>Slika</w:t>
+      </w:r>
+      <w:proofErr w:type="spellEnd"/>
+      <w:r>
+        <w:rPr>
+          <w:rFonts w:ascii="Times New Roman" w:eastAsia="Times New Roman" w:hAnsi="Times New Roman" w:cs="Times New Roman"/>
+          <w:sz w:val="20"/>
+        </w:rPr>
+        <w:t xml:space="preserve"> </w:t>
+      </w:r>
+      <w:proofErr w:type="spellStart"/>
+      <w:r>
+        <w:rPr>
+          <w:rFonts w:ascii="Times New Roman" w:eastAsia="Times New Roman" w:hAnsi="Times New Roman" w:cs="Times New Roman"/>
+          <w:sz w:val="20"/>
+        </w:rPr>
+        <w:t>koja</w:t>
+      </w:r>
+      <w:proofErr w:type="spellEnd"/>
+      <w:r>
+        <w:rPr>
+          <w:rFonts w:ascii="Times New Roman" w:eastAsia="Times New Roman" w:hAnsi="Times New Roman" w:cs="Times New Roman"/>
+          <w:sz w:val="20"/>
+        </w:rPr>
+        <w:t xml:space="preserve"> se </w:t>
+      </w:r>
+      <w:proofErr w:type="spellStart"/>
+      <w:r>
+        <w:rPr>
+          <w:rFonts w:ascii="Times New Roman" w:eastAsia="Times New Roman" w:hAnsi="Times New Roman" w:cs="Times New Roman"/>
+          <w:sz w:val="20"/>
+        </w:rPr>
+        <w:t>uklanja</w:t>
+      </w:r>
+      <w:proofErr w:type="spellEnd"/>
+      <w:r>
+        <w:rPr>
+          <w:rFonts w:ascii="Times New Roman" w:eastAsia="Times New Roman" w:hAnsi="Times New Roman" w:cs="Times New Roman"/>
+          <w:sz w:val="20"/>
+        </w:rPr>
+        <w:t xml:space="preserve"> </w:t>
+      </w:r>
+      <w:proofErr w:type="spellStart"/>
+      <w:r>
+        <w:rPr>
+          <w:rFonts w:ascii="Times New Roman" w:eastAsia="Times New Roman" w:hAnsi="Times New Roman" w:cs="Times New Roman"/>
+          <w:sz w:val="20"/>
+        </w:rPr>
+        <w:t>postoji</w:t>
+      </w:r>
+      <w:proofErr w:type="spellEnd"/>
+      <w:r>
+        <w:rPr>
+          <w:rFonts w:ascii="Times New Roman" w:eastAsia="Times New Roman" w:hAnsi="Times New Roman" w:cs="Times New Roman"/>
+          <w:sz w:val="20"/>
+        </w:rPr>
+        <w:t xml:space="preserve"> </w:t>
+      </w:r>
+      <w:proofErr w:type="spellStart"/>
+      <w:r>
+        <w:rPr>
+          <w:rFonts w:ascii="Times New Roman" w:eastAsia="Times New Roman" w:hAnsi="Times New Roman" w:cs="Times New Roman"/>
+          <w:sz w:val="20"/>
+        </w:rPr>
+        <w:t>na</w:t>
+      </w:r>
+      <w:proofErr w:type="spellEnd"/>
+      <w:r>
+        <w:rPr>
+          <w:rFonts w:ascii="Times New Roman" w:eastAsia="Times New Roman" w:hAnsi="Times New Roman" w:cs="Times New Roman"/>
+          <w:sz w:val="20"/>
+        </w:rPr>
+        <w:t xml:space="preserve"> </w:t>
+      </w:r>
+      <w:proofErr w:type="spellStart"/>
+      <w:r>
+        <w:rPr>
+          <w:rFonts w:ascii="Times New Roman" w:eastAsia="Times New Roman" w:hAnsi="Times New Roman" w:cs="Times New Roman"/>
+          <w:sz w:val="20"/>
+        </w:rPr>
+        <w:t>platformi</w:t>
+      </w:r>
+      <w:proofErr w:type="spellEnd"/>
+      <w:r>
+        <w:rPr>
+          <w:rFonts w:ascii="Times New Roman" w:eastAsia="Times New Roman" w:hAnsi="Times New Roman" w:cs="Times New Roman"/>
+          <w:sz w:val="20"/>
+        </w:rPr>
+        <w:t>.</w:t>
       </w:r>
     </w:p>
     <w:p>
@@ -3404,10 +6705,12 @@
         <w:ind w:left="705" w:hanging="720"/>
       </w:pPr>
       <w:bookmarkStart w:id="12" w:name="_Toc205762438"/>
+      <w:proofErr w:type="spellStart"/>
       <w:r>
         <w:t>Posledice</w:t>
       </w:r>
       <w:bookmarkEnd w:id="12"/>
+      <w:proofErr w:type="spellEnd"/>
       <w:r>
         <w:t xml:space="preserve"> </w:t>
       </w:r>
@@ -3431,8 +6734,130 @@
           <w:rFonts w:ascii="Times New Roman" w:eastAsia="Times New Roman" w:hAnsi="Times New Roman" w:cs="Times New Roman"/>
           <w:sz w:val="20"/>
         </w:rPr>
-        <w:t>U slučaju uspešnog uklanjanja, slika više nije dostupna korisnicima.</w:t>
-      </w:r>
+        <w:t xml:space="preserve">U </w:t>
+      </w:r>
+      <w:proofErr w:type="spellStart"/>
+      <w:r>
+        <w:rPr>
+          <w:rFonts w:ascii="Times New Roman" w:eastAsia="Times New Roman" w:hAnsi="Times New Roman" w:cs="Times New Roman"/>
+          <w:sz w:val="20"/>
+        </w:rPr>
+        <w:t>slučaju</w:t>
+      </w:r>
+      <w:proofErr w:type="spellEnd"/>
+      <w:r>
+        <w:rPr>
+          <w:rFonts w:ascii="Times New Roman" w:eastAsia="Times New Roman" w:hAnsi="Times New Roman" w:cs="Times New Roman"/>
+          <w:sz w:val="20"/>
+        </w:rPr>
+        <w:t xml:space="preserve"> </w:t>
+      </w:r>
+      <w:proofErr w:type="spellStart"/>
+      <w:r>
+        <w:rPr>
+          <w:rFonts w:ascii="Times New Roman" w:eastAsia="Times New Roman" w:hAnsi="Times New Roman" w:cs="Times New Roman"/>
+          <w:sz w:val="20"/>
+        </w:rPr>
+        <w:t>uspešnog</w:t>
+      </w:r>
+      <w:proofErr w:type="spellEnd"/>
+      <w:r>
+        <w:rPr>
+          <w:rFonts w:ascii="Times New Roman" w:eastAsia="Times New Roman" w:hAnsi="Times New Roman" w:cs="Times New Roman"/>
+          <w:sz w:val="20"/>
+        </w:rPr>
+        <w:t xml:space="preserve"> </w:t>
+      </w:r>
+      <w:proofErr w:type="spellStart"/>
+      <w:r>
+        <w:rPr>
+          <w:rFonts w:ascii="Times New Roman" w:eastAsia="Times New Roman" w:hAnsi="Times New Roman" w:cs="Times New Roman"/>
+          <w:sz w:val="20"/>
+        </w:rPr>
+        <w:t>uklanjanja</w:t>
+      </w:r>
+      <w:proofErr w:type="spellEnd"/>
+      <w:r>
+        <w:rPr>
+          <w:rFonts w:ascii="Times New Roman" w:eastAsia="Times New Roman" w:hAnsi="Times New Roman" w:cs="Times New Roman"/>
+          <w:sz w:val="20"/>
+        </w:rPr>
+        <w:t xml:space="preserve">, </w:t>
+      </w:r>
+      <w:proofErr w:type="spellStart"/>
+      <w:r>
+        <w:rPr>
+          <w:rFonts w:ascii="Times New Roman" w:eastAsia="Times New Roman" w:hAnsi="Times New Roman" w:cs="Times New Roman"/>
+          <w:sz w:val="20"/>
+        </w:rPr>
+        <w:t>slika</w:t>
+      </w:r>
+      <w:proofErr w:type="spellEnd"/>
+      <w:r>
+        <w:rPr>
+          <w:rFonts w:ascii="Times New Roman" w:eastAsia="Times New Roman" w:hAnsi="Times New Roman" w:cs="Times New Roman"/>
+          <w:sz w:val="20"/>
+        </w:rPr>
+        <w:t xml:space="preserve"> </w:t>
+      </w:r>
+      <w:proofErr w:type="spellStart"/>
+      <w:r>
+        <w:rPr>
+          <w:rFonts w:ascii="Times New Roman" w:eastAsia="Times New Roman" w:hAnsi="Times New Roman" w:cs="Times New Roman"/>
+          <w:sz w:val="20"/>
+        </w:rPr>
+        <w:t>više</w:t>
+      </w:r>
+      <w:proofErr w:type="spellEnd"/>
+      <w:r>
+        <w:rPr>
+          <w:rFonts w:ascii="Times New Roman" w:eastAsia="Times New Roman" w:hAnsi="Times New Roman" w:cs="Times New Roman"/>
+          <w:sz w:val="20"/>
+        </w:rPr>
+        <w:t xml:space="preserve"> </w:t>
+      </w:r>
+      <w:proofErr w:type="spellStart"/>
+      <w:r>
+        <w:rPr>
+          <w:rFonts w:ascii="Times New Roman" w:eastAsia="Times New Roman" w:hAnsi="Times New Roman" w:cs="Times New Roman"/>
+          <w:sz w:val="20"/>
+        </w:rPr>
+        <w:t>nije</w:t>
+      </w:r>
+      <w:proofErr w:type="spellEnd"/>
+      <w:r>
+        <w:rPr>
+          <w:rFonts w:ascii="Times New Roman" w:eastAsia="Times New Roman" w:hAnsi="Times New Roman" w:cs="Times New Roman"/>
+          <w:sz w:val="20"/>
+        </w:rPr>
+        <w:t xml:space="preserve"> </w:t>
+      </w:r>
+      <w:proofErr w:type="spellStart"/>
+      <w:r>
+        <w:rPr>
+          <w:rFonts w:ascii="Times New Roman" w:eastAsia="Times New Roman" w:hAnsi="Times New Roman" w:cs="Times New Roman"/>
+          <w:sz w:val="20"/>
+        </w:rPr>
+        <w:t>dostupna</w:t>
+      </w:r>
+      <w:proofErr w:type="spellEnd"/>
+      <w:r>
+        <w:rPr>
+          <w:rFonts w:ascii="Times New Roman" w:eastAsia="Times New Roman" w:hAnsi="Times New Roman" w:cs="Times New Roman"/>
+          <w:sz w:val="20"/>
+        </w:rPr>
+        <w:t xml:space="preserve"> </w:t>
+      </w:r>
+      <w:proofErr w:type="spellStart"/>
+      <w:proofErr w:type="gramStart"/>
+      <w:r>
+        <w:rPr>
+          <w:rFonts w:ascii="Times New Roman" w:eastAsia="Times New Roman" w:hAnsi="Times New Roman" w:cs="Times New Roman"/>
+          <w:sz w:val="20"/>
+        </w:rPr>
+        <w:t>korisnicima</w:t>
+      </w:r>
+      <w:proofErr w:type="spellEnd"/>
       <w:r>
         <w:rPr>
           <w:rFonts w:ascii="Times New Roman" w:eastAsia="Times New Roman" w:hAnsi="Times New Roman" w:cs="Times New Roman"/>
@@ -3440,6 +6865,14 @@
         </w:rPr>
         <w:t>.</w:t>
       </w:r>
+      <w:r>
+        <w:rPr>
+          <w:rFonts w:ascii="Times New Roman" w:eastAsia="Times New Roman" w:hAnsi="Times New Roman" w:cs="Times New Roman"/>
+          <w:sz w:val="20"/>
+        </w:rPr>
+        <w:t>.</w:t>
+      </w:r>
+      <w:proofErr w:type="gramEnd"/>
     </w:p>
     <w:p>
       <w:pPr>
@@ -3455,12 +6888,85 @@
           <w:sz w:val="20"/>
         </w:rPr>
       </w:pPr>
-      <w:r>
-        <w:rPr>
-          <w:rFonts w:ascii="Times New Roman" w:eastAsia="Times New Roman" w:hAnsi="Times New Roman" w:cs="Times New Roman"/>
-          <w:sz w:val="20"/>
-        </w:rPr>
-        <w:t>Broj slika na platformi se smanjuje.</w:t>
+      <w:proofErr w:type="spellStart"/>
+      <w:r>
+        <w:rPr>
+          <w:rFonts w:ascii="Times New Roman" w:eastAsia="Times New Roman" w:hAnsi="Times New Roman" w:cs="Times New Roman"/>
+          <w:sz w:val="20"/>
+        </w:rPr>
+        <w:t>Broj</w:t>
+      </w:r>
+      <w:proofErr w:type="spellEnd"/>
+      <w:r>
+        <w:rPr>
+          <w:rFonts w:ascii="Times New Roman" w:eastAsia="Times New Roman" w:hAnsi="Times New Roman" w:cs="Times New Roman"/>
+          <w:sz w:val="20"/>
+        </w:rPr>
+        <w:t xml:space="preserve"> </w:t>
+      </w:r>
+      <w:proofErr w:type="spellStart"/>
+      <w:r>
+        <w:rPr>
+          <w:rFonts w:ascii="Times New Roman" w:eastAsia="Times New Roman" w:hAnsi="Times New Roman" w:cs="Times New Roman"/>
+          <w:sz w:val="20"/>
+        </w:rPr>
+        <w:t>slika</w:t>
+      </w:r>
+      <w:proofErr w:type="spellEnd"/>
+      <w:r>
+        <w:rPr>
+          <w:rFonts w:ascii="Times New Roman" w:eastAsia="Times New Roman" w:hAnsi="Times New Roman" w:cs="Times New Roman"/>
+          <w:sz w:val="20"/>
+        </w:rPr>
+        <w:t xml:space="preserve"> </w:t>
+      </w:r>
+      <w:proofErr w:type="spellStart"/>
+      <w:r>
+        <w:rPr>
+          <w:rFonts w:ascii="Times New Roman" w:eastAsia="Times New Roman" w:hAnsi="Times New Roman" w:cs="Times New Roman"/>
+          <w:sz w:val="20"/>
+        </w:rPr>
+        <w:t>na</w:t>
+      </w:r>
+      <w:proofErr w:type="spellEnd"/>
+      <w:r>
+        <w:rPr>
+          <w:rFonts w:ascii="Times New Roman" w:eastAsia="Times New Roman" w:hAnsi="Times New Roman" w:cs="Times New Roman"/>
+          <w:sz w:val="20"/>
+        </w:rPr>
+        <w:t xml:space="preserve"> </w:t>
+      </w:r>
+      <w:proofErr w:type="spellStart"/>
+      <w:r>
+        <w:rPr>
+          <w:rFonts w:ascii="Times New Roman" w:eastAsia="Times New Roman" w:hAnsi="Times New Roman" w:cs="Times New Roman"/>
+          <w:sz w:val="20"/>
+        </w:rPr>
+        <w:t>platformi</w:t>
+      </w:r>
+      <w:proofErr w:type="spellEnd"/>
+      <w:r>
+        <w:rPr>
+          <w:rFonts w:ascii="Times New Roman" w:eastAsia="Times New Roman" w:hAnsi="Times New Roman" w:cs="Times New Roman"/>
+          <w:sz w:val="20"/>
+        </w:rPr>
+        <w:t xml:space="preserve"> se </w:t>
+      </w:r>
+      <w:proofErr w:type="spellStart"/>
+      <w:r>
+        <w:rPr>
+          <w:rFonts w:ascii="Times New Roman" w:eastAsia="Times New Roman" w:hAnsi="Times New Roman" w:cs="Times New Roman"/>
+          <w:sz w:val="20"/>
+        </w:rPr>
+        <w:t>smanjuje</w:t>
+      </w:r>
+      <w:proofErr w:type="spellEnd"/>
+      <w:r>
+        <w:rPr>
+          <w:rFonts w:ascii="Times New Roman" w:eastAsia="Times New Roman" w:hAnsi="Times New Roman" w:cs="Times New Roman"/>
+          <w:sz w:val="20"/>
+        </w:rPr>
+        <w:t>.</w:t>
       </w:r>
     </w:p>
     <w:p>
@@ -3477,12 +6983,69 @@
           <w:sz w:val="20"/>
         </w:rPr>
       </w:pPr>
-      <w:r>
-        <w:rPr>
-          <w:rFonts w:ascii="Times New Roman" w:eastAsia="Times New Roman" w:hAnsi="Times New Roman" w:cs="Times New Roman"/>
-          <w:sz w:val="20"/>
-        </w:rPr>
-        <w:t>Aktivnost administratora se beleži u log fajlu.</w:t>
+      <w:proofErr w:type="spellStart"/>
+      <w:r>
+        <w:rPr>
+          <w:rFonts w:ascii="Times New Roman" w:eastAsia="Times New Roman" w:hAnsi="Times New Roman" w:cs="Times New Roman"/>
+          <w:sz w:val="20"/>
+        </w:rPr>
+        <w:t>Aktivnost</w:t>
+      </w:r>
+      <w:proofErr w:type="spellEnd"/>
+      <w:r>
+        <w:rPr>
+          <w:rFonts w:ascii="Times New Roman" w:eastAsia="Times New Roman" w:hAnsi="Times New Roman" w:cs="Times New Roman"/>
+          <w:sz w:val="20"/>
+        </w:rPr>
+        <w:t xml:space="preserve"> </w:t>
+      </w:r>
+      <w:proofErr w:type="spellStart"/>
+      <w:r>
+        <w:rPr>
+          <w:rFonts w:ascii="Times New Roman" w:eastAsia="Times New Roman" w:hAnsi="Times New Roman" w:cs="Times New Roman"/>
+          <w:sz w:val="20"/>
+        </w:rPr>
+        <w:t>administratora</w:t>
+      </w:r>
+      <w:proofErr w:type="spellEnd"/>
+      <w:r>
+        <w:rPr>
+          <w:rFonts w:ascii="Times New Roman" w:eastAsia="Times New Roman" w:hAnsi="Times New Roman" w:cs="Times New Roman"/>
+          <w:sz w:val="20"/>
+        </w:rPr>
+        <w:t xml:space="preserve"> se </w:t>
+      </w:r>
+      <w:proofErr w:type="spellStart"/>
+      <w:r>
+        <w:rPr>
+          <w:rFonts w:ascii="Times New Roman" w:eastAsia="Times New Roman" w:hAnsi="Times New Roman" w:cs="Times New Roman"/>
+          <w:sz w:val="20"/>
+        </w:rPr>
+        <w:t>beleži</w:t>
+      </w:r>
+      <w:proofErr w:type="spellEnd"/>
+      <w:r>
+        <w:rPr>
+          <w:rFonts w:ascii="Times New Roman" w:eastAsia="Times New Roman" w:hAnsi="Times New Roman" w:cs="Times New Roman"/>
+          <w:sz w:val="20"/>
+        </w:rPr>
+        <w:t xml:space="preserve"> u log </w:t>
+      </w:r>
+      <w:proofErr w:type="spellStart"/>
+      <w:r>
+        <w:rPr>
+          <w:rFonts w:ascii="Times New Roman" w:eastAsia="Times New Roman" w:hAnsi="Times New Roman" w:cs="Times New Roman"/>
+          <w:sz w:val="20"/>
+        </w:rPr>
+        <w:t>fajlu</w:t>
+      </w:r>
+      <w:proofErr w:type="spellEnd"/>
+      <w:r>
+        <w:rPr>
+          <w:rFonts w:ascii="Times New Roman" w:eastAsia="Times New Roman" w:hAnsi="Times New Roman" w:cs="Times New Roman"/>
+          <w:sz w:val="20"/>
+        </w:rPr>
+        <w:t>.</w:t>
       </w:r>
     </w:p>
     <w:p>
@@ -3792,6 +7355,7 @@
       </w:tabs>
       <w:spacing w:after="0"/>
     </w:pPr>
+    <w:proofErr w:type="spellStart"/>
     <w:r>
       <w:rPr>
         <w:rFonts w:ascii="Times New Roman" w:eastAsia="Times New Roman" w:hAnsi="Times New Roman" w:cs="Times New Roman"/>
@@ -3801,6 +7365,7 @@
       </w:rPr>
       <w:t>RealArt</w:t>
     </w:r>
+    <w:proofErr w:type="spellEnd"/>
     <w:r>
       <w:rPr>
         <w:rFonts w:ascii="Times New Roman" w:eastAsia="Times New Roman" w:hAnsi="Times New Roman" w:cs="Times New Roman"/>
@@ -6431,6 +9996,7 @@
   <w:style w:type="character" w:default="1" w:styleId="DefaultParagraphFont">
     <w:name w:val="Default Paragraph Font"/>
     <w:uiPriority w:val="1"/>
+    <w:semiHidden/>
     <w:unhideWhenUsed/>
   </w:style>
   <w:style w:type="table" w:default="1" w:styleId="TableNormal">

</xml_diff>